<commit_message>
Apply v3 review-driven revisions: batch-policy framing, source-only table, standard contribution language
</commit_message>
<xml_diff>
--- a/outputs/open_phaseA_final_paper.docx
+++ b/outputs/open_phaseA_final_paper.docx
@@ -2,13 +2,13 @@
 <file path=word/document.xml><?xml version="1.0" encoding="utf-8"?>
 <w:document xmlns:w="http://schemas.openxmlformats.org/wordprocessingml/2006/main" xmlns:m="http://schemas.openxmlformats.org/officeDocument/2006/math" xmlns:r="http://schemas.openxmlformats.org/officeDocument/2006/relationships" xmlns:o="urn:schemas-microsoft-com:office:office" xmlns:v="urn:schemas-microsoft-com:vml" xmlns:w10="urn:schemas-microsoft-com:office:word" xmlns:a="http://schemas.openxmlformats.org/drawingml/2006/main" xmlns:pic="http://schemas.openxmlformats.org/drawingml/2006/picture" xmlns:wp="http://schemas.openxmlformats.org/drawingml/2006/wordprocessingDrawing">
   <w:body>
-    <w:bookmarkStart w:id="29" w:name="Xad33856e98304b3e239eca1d406e5be55f52adc"/>
+    <w:bookmarkStart w:id="33" w:name="X24c6b0bd491cf357b476c41ffed5a262a718f96"/>
     <w:p>
       <w:pPr>
         <w:pStyle w:val="Heading1"/>
       </w:pPr>
       <w:r>
-        <w:t xml:space="preserve">Leakage-Safe Cross-Cohort Alzheimer’s Transcriptomic Prediction on Open Data: A Reproducible Phase-A Benchmark</w:t>
+        <w:t xml:space="preserve">Leakage-Safe Cross-Cohort Alzheimer’s Transcriptomic Prediction on Open Data: A Reproducible Transfer-Stress Test</w:t>
       </w:r>
     </w:p>
     <w:p>
@@ -37,11 +37,11 @@
         <w:pStyle w:val="FirstParagraph"/>
       </w:pPr>
       <w:r>
-        <w:t xml:space="preserve">Reliable Alzheimer’s disease (AD) prediction benchmarks are often weakened by leakage-prone evaluation and incomplete reproducibility artifacts. We present a fully open, executable Phase-A benchmark using two public GEO blood transcriptomic cohorts (GSE63060, GSE63061) and open AMP-AD context from the AD Knowledge Portal Agora API. We enforce leakage-safe cohort-direction testing and compare four arms: target-only, source-only, source+target, and label-permutation null. Across ablations (top variable genes: 200 and 1000), target-only models outperform null controls in both directions, with strongest evidence in GSE63061-&gt;GSE63060 (delta AUROC +0.4809 and +0.4120; both BH-adjusted p&lt;0.001). Transfer effects are directional rather than universal: positive in GSE63060-&gt;GSE63061 and near-zero/negative in the reverse direction after correction. The artifact includes deterministic data manifests, executable scripts, bootstrap confidence intervals, paired tests with Benjamini-Hochberg correction, and claim-evidence mapping. Conservative conclusion: leakage-safe signal is robust on open cohorts, while transfer uplift depends on cohort compatibility.</w:t>
+        <w:t xml:space="preserve">Reliable Alzheimer’s disease (AD) prediction benchmarks are often weakened by leakage-prone evaluation and incomplete reproducibility artifacts. We present a fully open, executable transfer-stress test using two public GEO blood transcriptomic cohorts (GSE63060, GSE63061) and open AMP-AD context from the AD Knowledge Portal Agora API. We enforce leakage-safe cohort-direction testing and evaluate target-only, source-only, exploratory source+target pooling, and label-permutation null controls. Across ablations (top variable genes: 200 and 1000), target-only models outperform null controls in both directions, with strongest evidence in GSE63061-&gt;GSE63060 (delta AUROC +0.4809 and +0.4120; both BH-adjusted p&lt;0.001). Source-only transfer is direction-sensitive, and pooled source+target effects are reported as exploratory because this version does not apply explicit cross-study batch harmonization. The artifact includes deterministic data manifests, executable scripts, bootstrap confidence intervals, and Benjamini-Hochberg-corrected paired tests. Conservative conclusion: leakage-safe target-domain signal is robust on open cohorts, while cross-cohort transfer behavior is asymmetric and context dependent.</w:t>
       </w:r>
     </w:p>
     <w:bookmarkEnd w:id="9"/>
-    <w:bookmarkStart w:id="10" w:name="introduction"/>
+    <w:bookmarkStart w:id="11" w:name="introduction"/>
     <w:p>
       <w:pPr>
         <w:pStyle w:val="Heading2"/>
@@ -63,7 +63,7 @@
         <w:pStyle w:val="BodyText"/>
       </w:pPr>
       <w:r>
-        <w:t xml:space="preserve">To address this, we frame an open, conservative Phase-A benchmark focused on evidence quality rather than model complexity. The benchmark is built around leakage-safe cohort-direction testing, explicit null comparisons, bootstrap uncertainty, and multiplicity-aware inference. We prioritize a design that a reviewer can audit end-to-end with public data and executable artifacts.</w:t>
+        <w:t xml:space="preserve">To address this, we frame an open, conservative transfer stress-test focused on evidence quality rather than model complexity. The workflow is built around leakage-safe cohort-direction testing, explicit null comparisons, bootstrap uncertainty, and multiplicity-aware inference. We prioritize a design that a reviewer can audit end-to-end with public data and executable artifacts.</w:t>
       </w:r>
     </w:p>
     <w:p>
@@ -100,8 +100,34 @@
         <w:t xml:space="preserve">3) Can results be reproduced from one command path with frozen manifests?</w:t>
       </w:r>
     </w:p>
+    <w:bookmarkStart w:id="10" w:name="positioning-relative-to-prior-practice"/>
+    <w:p>
+      <w:pPr>
+        <w:pStyle w:val="Heading3"/>
+      </w:pPr>
+      <w:r>
+        <w:t xml:space="preserve">1.1 Positioning relative to prior practice</w:t>
+      </w:r>
+    </w:p>
+    <w:p>
+      <w:pPr>
+        <w:pStyle w:val="FirstParagraph"/>
+      </w:pPr>
+      <w:r>
+        <w:t xml:space="preserve">Prior AD blood transcriptomic studies have commonly reported discrimination metrics on public cohorts, but cross-cohort transfer behavior is often sensitive to cohort shift, preprocessing choices, and leakage pathways. Our contribution is not a new classifier architecture; it is a stress-tested evaluation protocol that (i) reports target-only, source-only, and pooled transfer behavior side-by-side, (ii) anchors significance against a label-permutation null, and (iii) uses bootstrap uncertainty with FDR correction to bound interpretation.</w:t>
+      </w:r>
+    </w:p>
+    <w:p>
+      <w:pPr>
+        <w:pStyle w:val="BodyText"/>
+      </w:pPr>
+      <w:r>
+        <w:t xml:space="preserve">We therefore position this work as an evaluation-and-reproducibility contribution: a conservative baseline that clarifies what is supported now and what requires harmonization-aware follow-up.</w:t>
+      </w:r>
+    </w:p>
     <w:bookmarkEnd w:id="10"/>
-    <w:bookmarkStart w:id="15" w:name="data"/>
+    <w:bookmarkEnd w:id="11"/>
+    <w:bookmarkStart w:id="16" w:name="data"/>
     <w:p>
       <w:pPr>
         <w:pStyle w:val="Heading2"/>
@@ -110,7 +136,7 @@
         <w:t xml:space="preserve">2. Data</w:t>
       </w:r>
     </w:p>
-    <w:bookmarkStart w:id="11" w:name="X71b54dd623694cfd2598548b52b6e0708a0e471"/>
+    <w:bookmarkStart w:id="12" w:name="X71b54dd623694cfd2598548b52b6e0708a0e471"/>
     <w:p>
       <w:pPr>
         <w:pStyle w:val="Heading3"/>
@@ -135,8 +161,8 @@
         <w:t xml:space="preserve">For outcome definition, we retain AD and CTL labels and exclude ambiguous clinical categories (including MCI/transition statuses) to avoid label-noise inflation. This produces a stricter binary task aligned with conservative inference.</w:t>
       </w:r>
     </w:p>
-    <w:bookmarkEnd w:id="11"/>
-    <w:bookmarkStart w:id="12" w:name="X11eb17fb1d4d6b79992aa820afa972758ef79e8"/>
+    <w:bookmarkEnd w:id="12"/>
+    <w:bookmarkStart w:id="13" w:name="X11eb17fb1d4d6b79992aa820afa972758ef79e8"/>
     <w:p>
       <w:pPr>
         <w:pStyle w:val="Heading3"/>
@@ -153,8 +179,8 @@
         <w:t xml:space="preserve">Each cohort is treated both as source and as target (A-&gt;B and B-&gt;A), creating two directional transfer settings. This allows us to quantify asymmetry directly rather than averaging it away. Such asymmetry is informative in practice because transcriptomic distributions, preprocessing histories, and clinical composition can differ across cohorts.</w:t>
       </w:r>
     </w:p>
-    <w:bookmarkEnd w:id="12"/>
-    <w:bookmarkStart w:id="13" w:name="X380b4904292e46dd17fbcad96a147dcf4edb259"/>
+    <w:bookmarkEnd w:id="13"/>
+    <w:bookmarkStart w:id="14" w:name="X380b4904292e46dd17fbcad96a147dcf4edb259"/>
     <w:p>
       <w:pPr>
         <w:pStyle w:val="Heading3"/>
@@ -185,11 +211,11 @@
         <w:pStyle w:val="BodyText"/>
       </w:pPr>
       <w:r>
-        <w:t xml:space="preserve">This layer is not used to claim mechanism in Phase-A; instead, it anchors the benchmark in a broader AD evidence ecosystem while preserving strict predictive/evaluation boundaries.</w:t>
-      </w:r>
-    </w:p>
-    <w:bookmarkEnd w:id="13"/>
-    <w:bookmarkStart w:id="14" w:name="Xb417f2916edc467b68d31131c560f35aa78c537"/>
+        <w:t xml:space="preserve">This layer is not used to claim mechanism in this version; instead, it anchors the benchmark in a broader AD evidence ecosystem while preserving strict predictive/evaluation boundaries.</w:t>
+      </w:r>
+    </w:p>
+    <w:bookmarkEnd w:id="14"/>
+    <w:bookmarkStart w:id="15" w:name="Xb417f2916edc467b68d31131c560f35aa78c537"/>
     <w:p>
       <w:pPr>
         <w:pStyle w:val="Heading3"/>
@@ -206,9 +232,9 @@
         <w:t xml:space="preserve">All primary predictive inputs are public and source-addressable via stable accession/API links. The pipeline records deterministic output artifacts (metrics, predictions, confidence intervals, paired tests, and manifests), enabling independent reruns and audit of claim-to-evidence alignment.</w:t>
       </w:r>
     </w:p>
-    <w:bookmarkEnd w:id="14"/>
     <w:bookmarkEnd w:id="15"/>
-    <w:bookmarkStart w:id="20" w:name="methods"/>
+    <w:bookmarkEnd w:id="16"/>
+    <w:bookmarkStart w:id="22" w:name="methods"/>
     <w:p>
       <w:pPr>
         <w:pStyle w:val="Heading2"/>
@@ -217,7 +243,7 @@
         <w:t xml:space="preserve">3. Methods</w:t>
       </w:r>
     </w:p>
-    <w:bookmarkStart w:id="16" w:name="evaluation-design-and-leakage-control"/>
+    <w:bookmarkStart w:id="17" w:name="evaluation-design-and-leakage-control"/>
     <w:p>
       <w:pPr>
         <w:pStyle w:val="Heading3"/>
@@ -280,8 +306,8 @@
         <w:t xml:space="preserve">- top_n_genes in {200, 1000}</w:t>
       </w:r>
     </w:p>
-    <w:bookmarkEnd w:id="16"/>
-    <w:bookmarkStart w:id="17" w:name="preprocessing-and-feature-selection"/>
+    <w:bookmarkEnd w:id="17"/>
+    <w:bookmarkStart w:id="18" w:name="preprocessing-and-feature-selection"/>
     <w:p>
       <w:pPr>
         <w:pStyle w:val="Heading3"/>
@@ -306,13 +332,31 @@
         <w:t xml:space="preserve">Gene-space ablation uses top variable genes (N in {200, 1000}) computed from training data only. This avoids test-informed feature selection.</w:t>
       </w:r>
     </w:p>
-    <w:bookmarkEnd w:id="17"/>
-    <w:bookmarkStart w:id="18" w:name="predictive-model"/>
+    <w:bookmarkEnd w:id="18"/>
+    <w:bookmarkStart w:id="19" w:name="X779deea6ae302b2de1c1d7b651629eb192c40da"/>
     <w:p>
       <w:pPr>
         <w:pStyle w:val="Heading3"/>
       </w:pPr>
       <w:r>
+        <w:t xml:space="preserve">3.2.1 Batch-effect policy for cross-cohort pooling</w:t>
+      </w:r>
+    </w:p>
+    <w:p>
+      <w:pPr>
+        <w:pStyle w:val="FirstParagraph"/>
+      </w:pPr>
+      <w:r>
+        <w:t xml:space="preserve">Because GSE63060 and GSE63061 are independent studies, pooled source+target training can be confounded by cross-study batch structure. In this manuscript, pooled source+target results are reported as exploratory diagnostics only and are not used as primary evidence for transfer benefit. The primary inferential comparisons remain target_only vs null and source_only transfer behavior. A harmonized pooled analysis (e.g., ComBat-style correction) is planned as the next extension.</w:t>
+      </w:r>
+    </w:p>
+    <w:bookmarkEnd w:id="19"/>
+    <w:bookmarkStart w:id="20" w:name="predictive-model"/>
+    <w:p>
+      <w:pPr>
+        <w:pStyle w:val="Heading3"/>
+      </w:pPr>
+      <w:r>
         <w:t xml:space="preserve">3.3 Predictive model</w:t>
       </w:r>
     </w:p>
@@ -321,151 +365,1243 @@
         <w:pStyle w:val="FirstParagraph"/>
       </w:pPr>
       <w:r>
-        <w:t xml:space="preserve">We use class-balanced logistic regression (liblinear solver, deterministic random state) as the primary baseline. For a sample with feature vector x, the model is:</w:t>
+        <w:t xml:space="preserve">We use class-balanced logistic regression (liblinear solver, deterministic random state) as the primary baseline. For a sample with feature vector</w:t>
+      </w:r>
+      <w:r>
+        <w:t xml:space="preserve"> </w:t>
+      </w:r>
+      <m:oMath>
+        <m:r>
+          <m:t>x</m:t>
+        </m:r>
+      </m:oMath>
+      <w:r>
+        <w:t xml:space="preserve">, the model is:</w:t>
       </w:r>
     </w:p>
     <w:p>
       <w:pPr>
         <w:pStyle w:val="BodyText"/>
       </w:pPr>
-      <w:r>
-        <w:t xml:space="preserve">P(y = 1 | x) = sigma(w^T x + b), where sigma(z) = 1 / (1 + exp(-z)).</w:t>
+      <m:oMathPara>
+        <m:oMathParaPr>
+          <m:jc m:val="center"/>
+        </m:oMathParaPr>
+        <m:oMath>
+          <m:r>
+            <m:t>P</m:t>
+          </m:r>
+          <m:r>
+            <m:rPr>
+              <m:sty m:val="p"/>
+            </m:rPr>
+            <m:t>(</m:t>
+          </m:r>
+          <m:r>
+            <m:t>y</m:t>
+          </m:r>
+          <m:r>
+            <m:rPr>
+              <m:sty m:val="p"/>
+            </m:rPr>
+            <m:t>=</m:t>
+          </m:r>
+          <m:r>
+            <m:t>1</m:t>
+          </m:r>
+          <m:r>
+            <m:rPr>
+              <m:sty m:val="p"/>
+            </m:rPr>
+            <m:t>∣</m:t>
+          </m:r>
+          <m:r>
+            <m:t>x</m:t>
+          </m:r>
+          <m:r>
+            <m:rPr>
+              <m:sty m:val="p"/>
+            </m:rPr>
+            <m:t>)</m:t>
+          </m:r>
+          <m:r>
+            <m:rPr>
+              <m:sty m:val="p"/>
+            </m:rPr>
+            <m:t>=</m:t>
+          </m:r>
+          <m:r>
+            <m:t>σ</m:t>
+          </m:r>
+          <m:r>
+            <m:rPr>
+              <m:sty m:val="p"/>
+            </m:rPr>
+            <m:t>(</m:t>
+          </m:r>
+          <m:sSup>
+            <m:e>
+              <m:r>
+                <m:t>w</m:t>
+              </m:r>
+            </m:e>
+            <m:sup>
+              <m:r>
+                <m:rPr>
+                  <m:sty m:val="p"/>
+                </m:rPr>
+                <m:t>⊤</m:t>
+              </m:r>
+            </m:sup>
+          </m:sSup>
+          <m:r>
+            <m:t>x</m:t>
+          </m:r>
+          <m:r>
+            <m:rPr>
+              <m:sty m:val="p"/>
+            </m:rPr>
+            <m:t>+</m:t>
+          </m:r>
+          <m:r>
+            <m:t>b</m:t>
+          </m:r>
+          <m:r>
+            <m:rPr>
+              <m:sty m:val="p"/>
+            </m:rPr>
+            <m:t>)</m:t>
+          </m:r>
+          <m:r>
+            <m:rPr>
+              <m:sty m:val="p"/>
+            </m:rPr>
+            <m:t>,</m:t>
+          </m:r>
+          <m:r>
+            <m:t>  </m:t>
+          </m:r>
+          <m:r>
+            <m:t>σ</m:t>
+          </m:r>
+          <m:r>
+            <m:rPr>
+              <m:sty m:val="p"/>
+            </m:rPr>
+            <m:t>(</m:t>
+          </m:r>
+          <m:r>
+            <m:t>z</m:t>
+          </m:r>
+          <m:r>
+            <m:rPr>
+              <m:sty m:val="p"/>
+            </m:rPr>
+            <m:t>)</m:t>
+          </m:r>
+          <m:r>
+            <m:rPr>
+              <m:sty m:val="p"/>
+            </m:rPr>
+            <m:t>=</m:t>
+          </m:r>
+          <m:f>
+            <m:fPr>
+              <m:type m:val="bar"/>
+            </m:fPr>
+            <m:num>
+              <m:r>
+                <m:t>1</m:t>
+              </m:r>
+            </m:num>
+            <m:den>
+              <m:r>
+                <m:t>1</m:t>
+              </m:r>
+              <m:r>
+                <m:rPr>
+                  <m:sty m:val="p"/>
+                </m:rPr>
+                <m:t>+</m:t>
+              </m:r>
+              <m:sSup>
+                <m:e>
+                  <m:r>
+                    <m:t>e</m:t>
+                  </m:r>
+                </m:e>
+                <m:sup>
+                  <m:r>
+                    <m:rPr>
+                      <m:sty m:val="p"/>
+                    </m:rPr>
+                    <m:t>−</m:t>
+                  </m:r>
+                  <m:r>
+                    <m:t>z</m:t>
+                  </m:r>
+                </m:sup>
+              </m:sSup>
+            </m:den>
+          </m:f>
+          <m:r>
+            <m:rPr>
+              <m:sty m:val="p"/>
+            </m:rPr>
+            <m:t>.</m:t>
+          </m:r>
+        </m:oMath>
+      </m:oMathPara>
+    </w:p>
+    <w:p>
+      <w:pPr>
+        <w:pStyle w:val="FirstParagraph"/>
+      </w:pPr>
+      <w:r>
+        <w:t xml:space="preserve">Training minimizes regularized logistic loss:</w:t>
       </w:r>
     </w:p>
     <w:p>
       <w:pPr>
         <w:pStyle w:val="BodyText"/>
       </w:pPr>
-      <w:r>
-        <w:t xml:space="preserve">Training minimizes regularized logistic loss:</w:t>
-      </w:r>
+      <m:oMathPara>
+        <m:oMathParaPr>
+          <m:jc m:val="center"/>
+        </m:oMathParaPr>
+        <m:oMath>
+          <m:r>
+            <m:rPr>
+              <m:scr m:val="script"/>
+              <m:sty m:val="p"/>
+            </m:rPr>
+            <m:t>L</m:t>
+          </m:r>
+          <m:r>
+            <m:rPr>
+              <m:sty m:val="p"/>
+            </m:rPr>
+            <m:t>(</m:t>
+          </m:r>
+          <m:r>
+            <m:t>w</m:t>
+          </m:r>
+          <m:r>
+            <m:rPr>
+              <m:sty m:val="p"/>
+            </m:rPr>
+            <m:t>,</m:t>
+          </m:r>
+          <m:r>
+            <m:t>b</m:t>
+          </m:r>
+          <m:r>
+            <m:rPr>
+              <m:sty m:val="p"/>
+            </m:rPr>
+            <m:t>)</m:t>
+          </m:r>
+          <m:r>
+            <m:rPr>
+              <m:sty m:val="p"/>
+            </m:rPr>
+            <m:t>=</m:t>
+          </m:r>
+          <m:r>
+            <m:rPr>
+              <m:sty m:val="p"/>
+            </m:rPr>
+            <m:t>−</m:t>
+          </m:r>
+          <m:nary>
+            <m:naryPr>
+              <m:chr m:val="∑"/>
+              <m:limLoc m:val="undOvr"/>
+              <m:subHide m:val="off"/>
+              <m:supHide m:val="off"/>
+            </m:naryPr>
+            <m:sub>
+              <m:r>
+                <m:t>i</m:t>
+              </m:r>
+              <m:r>
+                <m:rPr>
+                  <m:sty m:val="p"/>
+                </m:rPr>
+                <m:t>=</m:t>
+              </m:r>
+              <m:r>
+                <m:t>1</m:t>
+              </m:r>
+            </m:sub>
+            <m:sup>
+              <m:r>
+                <m:t>n</m:t>
+              </m:r>
+            </m:sup>
+            <m:e>
+              <m:d>
+                <m:dPr>
+                  <m:begChr m:val="["/>
+                  <m:sepChr m:val=""/>
+                  <m:endChr m:val="]"/>
+                  <m:grow/>
+                </m:dPr>
+                <m:e>
+                  <m:sSub>
+                    <m:e>
+                      <m:r>
+                        <m:t>y</m:t>
+                      </m:r>
+                    </m:e>
+                    <m:sub>
+                      <m:r>
+                        <m:t>i</m:t>
+                      </m:r>
+                    </m:sub>
+                  </m:sSub>
+                  <m:r>
+                    <m:rPr>
+                      <m:sty m:val="p"/>
+                    </m:rPr>
+                    <m:t>log</m:t>
+                  </m:r>
+                  <m:sSub>
+                    <m:e>
+                      <m:r>
+                        <m:t>p</m:t>
+                      </m:r>
+                    </m:e>
+                    <m:sub>
+                      <m:r>
+                        <m:t>i</m:t>
+                      </m:r>
+                    </m:sub>
+                  </m:sSub>
+                  <m:r>
+                    <m:rPr>
+                      <m:sty m:val="p"/>
+                    </m:rPr>
+                    <m:t>+</m:t>
+                  </m:r>
+                  <m:r>
+                    <m:rPr>
+                      <m:sty m:val="p"/>
+                    </m:rPr>
+                    <m:t>(</m:t>
+                  </m:r>
+                  <m:r>
+                    <m:t>1</m:t>
+                  </m:r>
+                  <m:r>
+                    <m:rPr>
+                      <m:sty m:val="p"/>
+                    </m:rPr>
+                    <m:t>−</m:t>
+                  </m:r>
+                  <m:sSub>
+                    <m:e>
+                      <m:r>
+                        <m:t>y</m:t>
+                      </m:r>
+                    </m:e>
+                    <m:sub>
+                      <m:r>
+                        <m:t>i</m:t>
+                      </m:r>
+                    </m:sub>
+                  </m:sSub>
+                  <m:r>
+                    <m:rPr>
+                      <m:sty m:val="p"/>
+                    </m:rPr>
+                    <m:t>)</m:t>
+                  </m:r>
+                  <m:r>
+                    <m:rPr>
+                      <m:sty m:val="p"/>
+                    </m:rPr>
+                    <m:t>log</m:t>
+                  </m:r>
+                  <m:r>
+                    <m:rPr>
+                      <m:sty m:val="p"/>
+                    </m:rPr>
+                    <m:t>(</m:t>
+                  </m:r>
+                  <m:r>
+                    <m:t>1</m:t>
+                  </m:r>
+                  <m:r>
+                    <m:rPr>
+                      <m:sty m:val="p"/>
+                    </m:rPr>
+                    <m:t>−</m:t>
+                  </m:r>
+                  <m:sSub>
+                    <m:e>
+                      <m:r>
+                        <m:t>p</m:t>
+                      </m:r>
+                    </m:e>
+                    <m:sub>
+                      <m:r>
+                        <m:t>i</m:t>
+                      </m:r>
+                    </m:sub>
+                  </m:sSub>
+                  <m:r>
+                    <m:rPr>
+                      <m:sty m:val="p"/>
+                    </m:rPr>
+                    <m:t>)</m:t>
+                  </m:r>
+                </m:e>
+              </m:d>
+            </m:e>
+          </m:nary>
+          <m:r>
+            <m:rPr>
+              <m:sty m:val="p"/>
+            </m:rPr>
+            <m:t>+</m:t>
+          </m:r>
+          <m:r>
+            <m:t>λ</m:t>
+          </m:r>
+          <m:sSubSup>
+            <m:e>
+              <m:d>
+                <m:dPr>
+                  <m:begChr m:val="‖"/>
+                  <m:sepChr m:val=""/>
+                  <m:endChr m:val="‖"/>
+                  <m:grow/>
+                </m:dPr>
+                <m:e>
+                  <m:r>
+                    <m:t>w</m:t>
+                  </m:r>
+                </m:e>
+              </m:d>
+            </m:e>
+            <m:sub>
+              <m:r>
+                <m:t>2</m:t>
+              </m:r>
+            </m:sub>
+            <m:sup>
+              <m:r>
+                <m:t>2</m:t>
+              </m:r>
+            </m:sup>
+          </m:sSubSup>
+          <m:r>
+            <m:rPr>
+              <m:sty m:val="p"/>
+            </m:rPr>
+            <m:t>.</m:t>
+          </m:r>
+        </m:oMath>
+      </m:oMathPara>
+    </w:p>
+    <w:p>
+      <w:pPr>
+        <w:pStyle w:val="FirstParagraph"/>
+      </w:pPr>
+      <w:r>
+        <w:t xml:space="preserve">This baseline was chosen for interpretability, stability on moderate sample sizes, and strong behavior under class imbalance.</w:t>
+      </w:r>
+    </w:p>
+    <w:bookmarkEnd w:id="20"/>
+    <w:bookmarkStart w:id="21" w:name="metrics-and-statistical-inference"/>
+    <w:p>
+      <w:pPr>
+        <w:pStyle w:val="Heading3"/>
+      </w:pPr>
+      <w:r>
+        <w:t xml:space="preserve">3.4 Metrics and statistical inference</w:t>
+      </w:r>
+    </w:p>
+    <w:p>
+      <w:pPr>
+        <w:pStyle w:val="FirstParagraph"/>
+      </w:pPr>
+      <w:r>
+        <w:t xml:space="preserve">Primary and secondary metrics:</w:t>
+      </w:r>
+      <w:r>
+        <w:t xml:space="preserve"> </w:t>
+      </w:r>
+      <w:r>
+        <w:t xml:space="preserve">- AUROC (primary discrimination metric)</w:t>
+      </w:r>
+      <w:r>
+        <w:t xml:space="preserve"> </w:t>
+      </w:r>
+      <w:r>
+        <w:t xml:space="preserve">- AUPRC</w:t>
+      </w:r>
+      <w:r>
+        <w:t xml:space="preserve"> </w:t>
+      </w:r>
+      <w:r>
+        <w:t xml:space="preserve">- Balanced accuracy:</w:t>
+      </w:r>
+      <w:r>
+        <w:t xml:space="preserve"> </w:t>
+      </w:r>
+      <m:oMath>
+        <m:r>
+          <m:rPr>
+            <m:sty m:val="p"/>
+          </m:rPr>
+          <m:t>B</m:t>
+        </m:r>
+        <m:r>
+          <m:rPr>
+            <m:sty m:val="p"/>
+          </m:rPr>
+          <m:t>A</m:t>
+        </m:r>
+        <m:r>
+          <m:rPr>
+            <m:sty m:val="p"/>
+          </m:rPr>
+          <m:t>=</m:t>
+        </m:r>
+        <m:f>
+          <m:fPr>
+            <m:type m:val="lin"/>
+          </m:fPr>
+          <m:num>
+            <m:r>
+              <m:t>1</m:t>
+            </m:r>
+          </m:num>
+          <m:den>
+            <m:r>
+              <m:t>2</m:t>
+            </m:r>
+          </m:den>
+        </m:f>
+        <m:r>
+          <m:rPr>
+            <m:sty m:val="p"/>
+          </m:rPr>
+          <m:t>(</m:t>
+        </m:r>
+        <m:r>
+          <m:rPr>
+            <m:sty m:val="p"/>
+          </m:rPr>
+          <m:t>T</m:t>
+        </m:r>
+        <m:r>
+          <m:rPr>
+            <m:sty m:val="p"/>
+          </m:rPr>
+          <m:t>P</m:t>
+        </m:r>
+        <m:r>
+          <m:rPr>
+            <m:sty m:val="p"/>
+          </m:rPr>
+          <m:t>R</m:t>
+        </m:r>
+        <m:r>
+          <m:rPr>
+            <m:sty m:val="p"/>
+          </m:rPr>
+          <m:t>+</m:t>
+        </m:r>
+        <m:r>
+          <m:rPr>
+            <m:sty m:val="p"/>
+          </m:rPr>
+          <m:t>T</m:t>
+        </m:r>
+        <m:r>
+          <m:rPr>
+            <m:sty m:val="p"/>
+          </m:rPr>
+          <m:t>N</m:t>
+        </m:r>
+        <m:r>
+          <m:rPr>
+            <m:sty m:val="p"/>
+          </m:rPr>
+          <m:t>R</m:t>
+        </m:r>
+        <m:r>
+          <m:rPr>
+            <m:sty m:val="p"/>
+          </m:rPr>
+          <m:t>)</m:t>
+        </m:r>
+      </m:oMath>
+      <w:r>
+        <w:t xml:space="preserve"> </w:t>
+      </w:r>
+      <w:r>
+        <w:t xml:space="preserve">- Brier score:</w:t>
+      </w:r>
+      <w:r>
+        <w:t xml:space="preserve"> </w:t>
+      </w:r>
+      <m:oMath>
+        <m:r>
+          <m:rPr>
+            <m:sty m:val="p"/>
+          </m:rPr>
+          <m:t>B</m:t>
+        </m:r>
+        <m:r>
+          <m:rPr>
+            <m:sty m:val="p"/>
+          </m:rPr>
+          <m:t>r</m:t>
+        </m:r>
+        <m:r>
+          <m:rPr>
+            <m:sty m:val="p"/>
+          </m:rPr>
+          <m:t>i</m:t>
+        </m:r>
+        <m:r>
+          <m:rPr>
+            <m:sty m:val="p"/>
+          </m:rPr>
+          <m:t>e</m:t>
+        </m:r>
+        <m:r>
+          <m:rPr>
+            <m:sty m:val="p"/>
+          </m:rPr>
+          <m:t>r</m:t>
+        </m:r>
+        <m:r>
+          <m:rPr>
+            <m:sty m:val="p"/>
+          </m:rPr>
+          <m:t>=</m:t>
+        </m:r>
+        <m:f>
+          <m:fPr>
+            <m:type m:val="lin"/>
+          </m:fPr>
+          <m:num>
+            <m:r>
+              <m:t>1</m:t>
+            </m:r>
+          </m:num>
+          <m:den>
+            <m:r>
+              <m:t>n</m:t>
+            </m:r>
+          </m:den>
+        </m:f>
+        <m:nary>
+          <m:naryPr>
+            <m:chr m:val="∑"/>
+            <m:limLoc m:val="undOvr"/>
+            <m:subHide m:val="off"/>
+            <m:supHide m:val="off"/>
+          </m:naryPr>
+          <m:sub>
+            <m:r>
+              <m:t>i</m:t>
+            </m:r>
+            <m:r>
+              <m:rPr>
+                <m:sty m:val="p"/>
+              </m:rPr>
+              <m:t>=</m:t>
+            </m:r>
+            <m:r>
+              <m:t>1</m:t>
+            </m:r>
+          </m:sub>
+          <m:sup>
+            <m:r>
+              <m:t>n</m:t>
+            </m:r>
+          </m:sup>
+          <m:e>
+            <m:r>
+              <m:rPr>
+                <m:sty m:val="p"/>
+              </m:rPr>
+              <m:t>(</m:t>
+            </m:r>
+          </m:e>
+        </m:nary>
+        <m:sSub>
+          <m:e>
+            <m:r>
+              <m:t>p</m:t>
+            </m:r>
+          </m:e>
+          <m:sub>
+            <m:r>
+              <m:t>i</m:t>
+            </m:r>
+          </m:sub>
+        </m:sSub>
+        <m:r>
+          <m:rPr>
+            <m:sty m:val="p"/>
+          </m:rPr>
+          <m:t>−</m:t>
+        </m:r>
+        <m:sSub>
+          <m:e>
+            <m:r>
+              <m:t>y</m:t>
+            </m:r>
+          </m:e>
+          <m:sub>
+            <m:r>
+              <m:t>i</m:t>
+            </m:r>
+          </m:sub>
+        </m:sSub>
+        <m:sSup>
+          <m:e>
+            <m:r>
+              <m:rPr>
+                <m:sty m:val="p"/>
+              </m:rPr>
+              <m:t>)</m:t>
+            </m:r>
+          </m:e>
+          <m:sup>
+            <m:r>
+              <m:t>2</m:t>
+            </m:r>
+          </m:sup>
+        </m:sSup>
+      </m:oMath>
     </w:p>
     <w:p>
       <w:pPr>
         <w:pStyle w:val="BodyText"/>
       </w:pPr>
       <w:r>
-        <w:t xml:space="preserve">L(w, b) = -sum_i [y_i log(p_i) + (1 - y_i) log(1 - p_i)] + lambda ||w||_2^2.</w:t>
+        <w:t xml:space="preserve">Uncertainty and hypothesis testing:</w:t>
+      </w:r>
+      <w:r>
+        <w:t xml:space="preserve"> </w:t>
+      </w:r>
+      <w:r>
+        <w:t xml:space="preserve">- 95% bootstrap confidence intervals for AUROC [5]</w:t>
+      </w:r>
+      <w:r>
+        <w:t xml:space="preserve"> </w:t>
+      </w:r>
+      <w:r>
+        <w:t xml:space="preserve">- Paired bootstrap delta tests for:</w:t>
+      </w:r>
+      <w:r>
+        <w:t xml:space="preserve"> </w:t>
+      </w:r>
+      <w:r>
+        <w:t xml:space="preserve">- transfer_vs_target_only</w:t>
+      </w:r>
+      <w:r>
+        <w:t xml:space="preserve"> </w:t>
+      </w:r>
+      <w:r>
+        <w:t xml:space="preserve">- target_only_vs_null</w:t>
+      </w:r>
+      <w:r>
+        <w:t xml:space="preserve"> </w:t>
+      </w:r>
+      <w:r>
+        <w:t xml:space="preserve">- Two-sided empirical p-value from bootstrap deltas:</w:t>
       </w:r>
     </w:p>
     <w:p>
       <w:pPr>
         <w:pStyle w:val="BodyText"/>
       </w:pPr>
-      <w:r>
-        <w:t xml:space="preserve">This baseline was chosen for interpretability, stability on moderate sample sizes, and strong behavior under class imbalance.</w:t>
-      </w:r>
-    </w:p>
-    <w:bookmarkEnd w:id="18"/>
-    <w:bookmarkStart w:id="19" w:name="metrics-and-statistical-inference"/>
+      <m:oMathPara>
+        <m:oMathParaPr>
+          <m:jc m:val="center"/>
+        </m:oMathParaPr>
+        <m:oMath>
+          <m:r>
+            <m:t>p</m:t>
+          </m:r>
+          <m:r>
+            <m:rPr>
+              <m:sty m:val="p"/>
+            </m:rPr>
+            <m:t>=</m:t>
+          </m:r>
+          <m:r>
+            <m:t>2</m:t>
+          </m:r>
+          <m:r>
+            <m:rPr>
+              <m:sty m:val="p"/>
+            </m:rPr>
+            <m:t>min</m:t>
+          </m:r>
+          <m:r>
+            <m:rPr>
+              <m:sty m:val="p"/>
+            </m:rPr>
+            <m:t>{</m:t>
+          </m:r>
+          <m:r>
+            <m:rPr>
+              <m:sty m:val="p"/>
+            </m:rPr>
+            <m:t>Pr</m:t>
+          </m:r>
+          <m:r>
+            <m:rPr>
+              <m:sty m:val="p"/>
+            </m:rPr>
+            <m:t>(</m:t>
+          </m:r>
+          <m:r>
+            <m:rPr>
+              <m:sty m:val="p"/>
+            </m:rPr>
+            <m:t>Δ</m:t>
+          </m:r>
+          <m:r>
+            <m:rPr>
+              <m:sty m:val="p"/>
+            </m:rPr>
+            <m:t>≤</m:t>
+          </m:r>
+          <m:r>
+            <m:t>0</m:t>
+          </m:r>
+          <m:r>
+            <m:rPr>
+              <m:sty m:val="p"/>
+            </m:rPr>
+            <m:t>)</m:t>
+          </m:r>
+          <m:r>
+            <m:rPr>
+              <m:sty m:val="p"/>
+            </m:rPr>
+            <m:t>,</m:t>
+          </m:r>
+          <m:r>
+            <m:rPr>
+              <m:sty m:val="p"/>
+            </m:rPr>
+            <m:t>Pr</m:t>
+          </m:r>
+          <m:r>
+            <m:rPr>
+              <m:sty m:val="p"/>
+            </m:rPr>
+            <m:t>(</m:t>
+          </m:r>
+          <m:r>
+            <m:rPr>
+              <m:sty m:val="p"/>
+            </m:rPr>
+            <m:t>Δ</m:t>
+          </m:r>
+          <m:r>
+            <m:rPr>
+              <m:sty m:val="p"/>
+            </m:rPr>
+            <m:t>≥</m:t>
+          </m:r>
+          <m:r>
+            <m:t>0</m:t>
+          </m:r>
+          <m:r>
+            <m:rPr>
+              <m:sty m:val="p"/>
+            </m:rPr>
+            <m:t>)</m:t>
+          </m:r>
+          <m:r>
+            <m:rPr>
+              <m:sty m:val="p"/>
+            </m:rPr>
+            <m:t>}</m:t>
+          </m:r>
+        </m:oMath>
+      </m:oMathPara>
+    </w:p>
+    <w:p>
+      <w:pPr>
+        <w:pStyle w:val="FirstParagraph"/>
+      </w:pPr>
+      <w:r>
+        <w:t xml:space="preserve">- Multiple-testing control by Benjamini-Hochberg false discovery rate [6]</w:t>
+      </w:r>
+    </w:p>
+    <w:bookmarkEnd w:id="21"/>
+    <w:bookmarkEnd w:id="22"/>
+    <w:bookmarkStart w:id="27" w:name="results"/>
+    <w:p>
+      <w:pPr>
+        <w:pStyle w:val="Heading2"/>
+      </w:pPr>
+      <w:r>
+        <w:t xml:space="preserve">4. Results</w:t>
+      </w:r>
+    </w:p>
+    <w:bookmarkStart w:id="23" w:name="Xc6f09ef91d6990c5a66356550f462272dd52f8b"/>
     <w:p>
       <w:pPr>
         <w:pStyle w:val="Heading3"/>
       </w:pPr>
       <w:r>
-        <w:t xml:space="preserve">3.4 Metrics and statistical inference</w:t>
-      </w:r>
-    </w:p>
-    <w:p>
-      <w:pPr>
-        <w:pStyle w:val="FirstParagraph"/>
-      </w:pPr>
-      <w:r>
-        <w:t xml:space="preserve">Primary and secondary metrics:</w:t>
-      </w:r>
-      <w:r>
-        <w:t xml:space="preserve"> </w:t>
-      </w:r>
-      <w:r>
-        <w:t xml:space="preserve">- AUROC (primary discrimination metric)</w:t>
-      </w:r>
-      <w:r>
-        <w:t xml:space="preserve"> </w:t>
-      </w:r>
-      <w:r>
-        <w:t xml:space="preserve">- AUPRC</w:t>
-      </w:r>
-      <w:r>
-        <w:t xml:space="preserve"> </w:t>
-      </w:r>
-      <w:r>
-        <w:t xml:space="preserve">- Balanced accuracy = 0.5 x (TPR + TNR)</w:t>
-      </w:r>
-      <w:r>
-        <w:t xml:space="preserve"> </w:t>
-      </w:r>
-      <w:r>
-        <w:t xml:space="preserve">- Brier score = (1/n) sum_i (p_i - y_i)^2</w:t>
-      </w:r>
-    </w:p>
+        <w:t xml:space="preserve">4.1 Primary arm performance (target-only, source-only, null)</w:t>
+      </w:r>
+    </w:p>
+    <w:tbl>
+      <w:tblPr>
+        <w:tblStyle w:val="Table"/>
+        <w:tblW w:type="pct" w:w="5000"/>
+        <w:tblLayout w:type="fixed"/>
+        <w:tblLook w:firstRow="1" w:lastRow="0" w:firstColumn="0" w:lastColumn="0" w:noHBand="0" w:noVBand="0" w:val="0020"/>
+      </w:tblPr>
+      <w:tblGrid>
+        <w:gridCol w:w="1250"/>
+        <w:gridCol w:w="1667"/>
+        <w:gridCol w:w="1667"/>
+        <w:gridCol w:w="1667"/>
+        <w:gridCol w:w="1667"/>
+      </w:tblGrid>
+      <w:tr>
+        <w:trPr>
+          <w:tblHeader w:val="on"/>
+        </w:trPr>
+        <w:tc>
+          <w:tcPr/>
+          <w:p>
+            <w:pPr>
+              <w:pStyle w:val="Compact"/>
+            </w:pPr>
+            <w:r>
+              <w:t xml:space="preserve">Direction</w:t>
+            </w:r>
+          </w:p>
+        </w:tc>
+        <w:tc>
+          <w:tcPr/>
+          <w:p>
+            <w:pPr>
+              <w:pStyle w:val="Compact"/>
+              <w:jc w:val="right"/>
+            </w:pPr>
+            <w:r>
+              <w:t xml:space="preserve">Top genes</w:t>
+            </w:r>
+          </w:p>
+        </w:tc>
+        <w:tc>
+          <w:tcPr/>
+          <w:p>
+            <w:pPr>
+              <w:pStyle w:val="Compact"/>
+              <w:jc w:val="right"/>
+            </w:pPr>
+            <w:r>
+              <w:t xml:space="preserve">Target-only AUROC</w:t>
+            </w:r>
+          </w:p>
+        </w:tc>
+        <w:tc>
+          <w:tcPr/>
+          <w:p>
+            <w:pPr>
+              <w:pStyle w:val="Compact"/>
+              <w:jc w:val="right"/>
+            </w:pPr>
+            <w:r>
+              <w:t xml:space="preserve">Source-only AUROC</w:t>
+            </w:r>
+          </w:p>
+        </w:tc>
+        <w:tc>
+          <w:tcPr/>
+          <w:p>
+            <w:pPr>
+              <w:pStyle w:val="Compact"/>
+              <w:jc w:val="right"/>
+            </w:pPr>
+            <w:r>
+              <w:t xml:space="preserve">Null AUROC</w:t>
+            </w:r>
+          </w:p>
+        </w:tc>
+      </w:tr>
+      <w:tr>
+        <w:tc>
+          <w:tcPr/>
+          <w:p>
+            <w:pPr>
+              <w:pStyle w:val="Compact"/>
+            </w:pPr>
+            <w:r>
+              <w:t xml:space="preserve">GSE63060-&gt;GSE63061</w:t>
+            </w:r>
+          </w:p>
+        </w:tc>
+        <w:tc>
+          <w:tcPr/>
+          <w:p>
+            <w:pPr>
+              <w:pStyle w:val="Compact"/>
+              <w:jc w:val="right"/>
+            </w:pPr>
+            <w:r>
+              <w:t xml:space="preserve">200</w:t>
+            </w:r>
+          </w:p>
+        </w:tc>
+        <w:tc>
+          <w:tcPr/>
+          <w:p>
+            <w:pPr>
+              <w:pStyle w:val="Compact"/>
+              <w:jc w:val="right"/>
+            </w:pPr>
+            <w:r>
+              <w:t xml:space="preserve">0.6619</w:t>
+            </w:r>
+          </w:p>
+        </w:tc>
+        <w:tc>
+          <w:tcPr/>
+          <w:p>
+            <w:pPr>
+              <w:pStyle w:val="Compact"/>
+              <w:jc w:val="right"/>
+            </w:pPr>
+            <w:r>
+              <w:t xml:space="preserve">0.6798</w:t>
+            </w:r>
+          </w:p>
+        </w:tc>
+        <w:tc>
+          <w:tcPr/>
+          <w:p>
+            <w:pPr>
+              <w:pStyle w:val="Compact"/>
+              <w:jc w:val="right"/>
+            </w:pPr>
+            <w:r>
+              <w:t xml:space="preserve">0.5607</w:t>
+            </w:r>
+          </w:p>
+        </w:tc>
+      </w:tr>
+      <w:tr>
+        <w:tc>
+          <w:tcPr/>
+          <w:p>
+            <w:pPr>
+              <w:pStyle w:val="Compact"/>
+            </w:pPr>
+            <w:r>
+              <w:t xml:space="preserve">GSE63060-&gt;GSE63061</w:t>
+            </w:r>
+          </w:p>
+        </w:tc>
+        <w:tc>
+          <w:tcPr/>
+          <w:p>
+            <w:pPr>
+              <w:pStyle w:val="Compact"/>
+              <w:jc w:val="right"/>
+            </w:pPr>
+            <w:r>
+              <w:t xml:space="preserve">1000</w:t>
+            </w:r>
+          </w:p>
+        </w:tc>
+        <w:tc>
+          <w:tcPr/>
+          <w:p>
+            <w:pPr>
+              <w:pStyle w:val="Compact"/>
+              <w:jc w:val="right"/>
+            </w:pPr>
+            <w:r>
+              <w:t xml:space="preserve">0.6851</w:t>
+            </w:r>
+          </w:p>
+        </w:tc>
+        <w:tc>
+          <w:tcPr/>
+          <w:p>
+            <w:pPr>
+              <w:pStyle w:val="Compact"/>
+              <w:jc w:val="right"/>
+            </w:pPr>
+            <w:r>
+              <w:t xml:space="preserve">0.7393</w:t>
+            </w:r>
+          </w:p>
+        </w:tc>
+        <w:tc>
+          <w:tcPr/>
+          <w:p>
+            <w:pPr>
+              <w:pStyle w:val="Compact"/>
+              <w:jc w:val="right"/>
+            </w:pPr>
+            <w:r>
+              <w:t xml:space="preserve">0.5452</w:t>
+            </w:r>
+          </w:p>
+        </w:tc>
+      </w:tr>
+      <w:tr>
+        <w:tc>
+          <w:tcPr/>
+          <w:p>
+            <w:pPr>
+              <w:pStyle w:val="Compact"/>
+            </w:pPr>
+            <w:r>
+              <w:t xml:space="preserve">GSE63061-&gt;GSE63060</w:t>
+            </w:r>
+          </w:p>
+        </w:tc>
+        <w:tc>
+          <w:tcPr/>
+          <w:p>
+            <w:pPr>
+              <w:pStyle w:val="Compact"/>
+              <w:jc w:val="right"/>
+            </w:pPr>
+            <w:r>
+              <w:t xml:space="preserve">200</w:t>
+            </w:r>
+          </w:p>
+        </w:tc>
+        <w:tc>
+          <w:tcPr/>
+          <w:p>
+            <w:pPr>
+              <w:pStyle w:val="Compact"/>
+              <w:jc w:val="right"/>
+            </w:pPr>
+            <w:r>
+              <w:t xml:space="preserve">0.9172</w:t>
+            </w:r>
+          </w:p>
+        </w:tc>
+        <w:tc>
+          <w:tcPr/>
+          <w:p>
+            <w:pPr>
+              <w:pStyle w:val="Compact"/>
+              <w:jc w:val="right"/>
+            </w:pPr>
+            <w:r>
+              <w:t xml:space="preserve">0.6734</w:t>
+            </w:r>
+          </w:p>
+        </w:tc>
+        <w:tc>
+          <w:tcPr/>
+          <w:p>
+            <w:pPr>
+              <w:pStyle w:val="Compact"/>
+              <w:jc w:val="right"/>
+            </w:pPr>
+            <w:r>
+              <w:t xml:space="preserve">0.4362</w:t>
+            </w:r>
+          </w:p>
+        </w:tc>
+      </w:tr>
+      <w:tr>
+        <w:tc>
+          <w:tcPr/>
+          <w:p>
+            <w:pPr>
+              <w:pStyle w:val="Compact"/>
+            </w:pPr>
+            <w:r>
+              <w:t xml:space="preserve">GSE63061-&gt;GSE63060</w:t>
+            </w:r>
+          </w:p>
+        </w:tc>
+        <w:tc>
+          <w:tcPr/>
+          <w:p>
+            <w:pPr>
+              <w:pStyle w:val="Compact"/>
+              <w:jc w:val="right"/>
+            </w:pPr>
+            <w:r>
+              <w:t xml:space="preserve">1000</w:t>
+            </w:r>
+          </w:p>
+        </w:tc>
+        <w:tc>
+          <w:tcPr/>
+          <w:p>
+            <w:pPr>
+              <w:pStyle w:val="Compact"/>
+              <w:jc w:val="right"/>
+            </w:pPr>
+            <w:r>
+              <w:t xml:space="preserve">0.9040</w:t>
+            </w:r>
+          </w:p>
+        </w:tc>
+        <w:tc>
+          <w:tcPr/>
+          <w:p>
+            <w:pPr>
+              <w:pStyle w:val="Compact"/>
+              <w:jc w:val="right"/>
+            </w:pPr>
+            <w:r>
+              <w:t xml:space="preserve">0.7115</w:t>
+            </w:r>
+          </w:p>
+        </w:tc>
+        <w:tc>
+          <w:tcPr/>
+          <w:p>
+            <w:pPr>
+              <w:pStyle w:val="Compact"/>
+              <w:jc w:val="right"/>
+            </w:pPr>
+            <w:r>
+              <w:t xml:space="preserve">0.4919</w:t>
+            </w:r>
+          </w:p>
+        </w:tc>
+      </w:tr>
+    </w:tbl>
     <w:p>
       <w:pPr>
         <w:pStyle w:val="BodyText"/>
       </w:pPr>
       <w:r>
-        <w:t xml:space="preserve">Uncertainty and hypothesis testing:</w:t>
-      </w:r>
-      <w:r>
-        <w:t xml:space="preserve"> </w:t>
-      </w:r>
-      <w:r>
-        <w:t xml:space="preserve">- 95% bootstrap confidence intervals for AUROC [5]</w:t>
-      </w:r>
-      <w:r>
-        <w:t xml:space="preserve"> </w:t>
-      </w:r>
-      <w:r>
-        <w:t xml:space="preserve">- Paired bootstrap delta tests for:</w:t>
-      </w:r>
-      <w:r>
-        <w:t xml:space="preserve"> </w:t>
-      </w:r>
-      <w:r>
-        <w:t xml:space="preserve">- transfer_vs_target_only</w:t>
-      </w:r>
-      <w:r>
-        <w:t xml:space="preserve"> </w:t>
-      </w:r>
-      <w:r>
-        <w:t xml:space="preserve">- target_only_vs_null</w:t>
-      </w:r>
-      <w:r>
-        <w:t xml:space="preserve"> </w:t>
-      </w:r>
-      <w:r>
-        <w:t xml:space="preserve">- Two-sided empirical p-value from bootstrap deltas:</w:t>
-      </w:r>
-      <w:r>
-        <w:t xml:space="preserve"> </w:t>
-      </w:r>
-      <w:r>
-        <w:t xml:space="preserve">p = 2 x min( Pr(Delta &lt;= 0), Pr(Delta &gt;= 0) )</w:t>
-      </w:r>
-      <w:r>
-        <w:t xml:space="preserve"> </w:t>
-      </w:r>
-      <w:r>
-        <w:t xml:space="preserve">- Multiple-testing control by Benjamini-Hochberg false discovery rate [6]</w:t>
-      </w:r>
-    </w:p>
-    <w:bookmarkEnd w:id="19"/>
-    <w:bookmarkEnd w:id="20"/>
-    <w:bookmarkStart w:id="23" w:name="results"/>
-    <w:p>
-      <w:pPr>
-        <w:pStyle w:val="Heading2"/>
-      </w:pPr>
-      <w:r>
-        <w:t xml:space="preserve">4. Results</w:t>
-      </w:r>
-    </w:p>
-    <w:bookmarkStart w:id="21" w:name="transfer-vs-target-only-paired-bootstrap"/>
+        <w:t xml:space="preserve">Interpretation: source-only transfer is direction-sensitive and materially weaker than target-only in the GSE63061-&gt;GSE63060 direction, highlighting cross-cohort asymmetry.</w:t>
+      </w:r>
+    </w:p>
+    <w:bookmarkEnd w:id="23"/>
+    <w:bookmarkStart w:id="24" w:name="X6147877a610fab7414e5133aed42dac7a0eaf25"/>
     <w:p>
       <w:pPr>
         <w:pStyle w:val="Heading3"/>
       </w:pPr>
       <w:r>
-        <w:t xml:space="preserve">4.1 Transfer vs target-only (paired bootstrap)</w:t>
+        <w:t xml:space="preserve">4.2 Exploratory pooled source+target vs target-only (paired bootstrap)</w:t>
       </w:r>
     </w:p>
     <w:tbl>
@@ -852,17 +1988,17 @@
         <w:pStyle w:val="BodyText"/>
       </w:pPr>
       <w:r>
-        <w:t xml:space="preserve">Interpretation: transfer gain is direction-dependent and not statistically robust after multiple-testing correction.</w:t>
-      </w:r>
-    </w:p>
-    <w:bookmarkEnd w:id="21"/>
-    <w:bookmarkStart w:id="22" w:name="signal-vs-null-control"/>
+        <w:t xml:space="preserve">Interpretation: pooled source+target effects are direction-dependent and not statistically robust after multiple-testing correction; because no explicit cross-study batch harmonization is applied, these pooled results are treated as exploratory.</w:t>
+      </w:r>
+    </w:p>
+    <w:bookmarkEnd w:id="24"/>
+    <w:bookmarkStart w:id="25" w:name="signal-vs-null-control"/>
     <w:p>
       <w:pPr>
         <w:pStyle w:val="Heading3"/>
       </w:pPr>
       <w:r>
-        <w:t xml:space="preserve">4.2 Signal vs null control</w:t>
+        <w:t xml:space="preserve">4.3 Signal vs null control</w:t>
       </w:r>
     </w:p>
     <w:tbl>
@@ -1180,9 +2316,27 @@
         <w:t xml:space="preserve">Interpretation: the strongest supported claim is leakage-safe target-domain signal above null controls, with asymmetric cohort difficulty.</w:t>
       </w:r>
     </w:p>
-    <w:bookmarkEnd w:id="22"/>
-    <w:bookmarkEnd w:id="23"/>
-    <w:bookmarkStart w:id="24" w:name="discussion"/>
+    <w:bookmarkEnd w:id="25"/>
+    <w:bookmarkStart w:id="26" w:name="X454e184d9ae2ab8a3228a1175b7238719b389e3"/>
+    <w:p>
+      <w:pPr>
+        <w:pStyle w:val="Heading3"/>
+      </w:pPr>
+      <w:r>
+        <w:t xml:space="preserve">4.4 AMP-AD evidence-layer context (quantitative summary)</w:t>
+      </w:r>
+    </w:p>
+    <w:p>
+      <w:pPr>
+        <w:pStyle w:val="FirstParagraph"/>
+      </w:pPr>
+      <w:r>
+        <w:t xml:space="preserve">From the open Agora nominated-target dataset used in this artifact, we recover 955 unique nominated genes across 1173 nominations, with dominant evidence modalities RNA (626), Protein (530), and Genetics (510). This supports biological plausibility context for AD relevance, but it is not used as a supervised feature-selection signal in this version.</w:t>
+      </w:r>
+    </w:p>
+    <w:bookmarkEnd w:id="26"/>
+    <w:bookmarkEnd w:id="27"/>
+    <w:bookmarkStart w:id="28" w:name="discussion"/>
     <w:p>
       <w:pPr>
         <w:pStyle w:val="Heading2"/>
@@ -1196,7 +2350,7 @@
         <w:pStyle w:val="FirstParagraph"/>
       </w:pPr>
       <w:r>
-        <w:t xml:space="preserve">This Phase-A benchmark shows that open AD blood transcriptomic prediction can retain non-trivial signal under leakage-safe evaluation. However, cross-cohort transfer uplift should be interpreted cautiously: in this study, uplift is conditional and direction-dependent rather than universal.</w:t>
+        <w:t xml:space="preserve">This transfer-stress test shows that open AD blood transcriptomic prediction retains non-trivial target-domain signal under leakage-safe evaluation. The strongest evidence is target_only &gt; null in the GSE63061-&gt;GSE63060 direction after multiple-testing correction.</w:t>
       </w:r>
     </w:p>
     <w:p>
@@ -1204,11 +2358,11 @@
         <w:pStyle w:val="BodyText"/>
       </w:pPr>
       <w:r>
-        <w:t xml:space="preserve">The asymmetry between cohort directions is consistent with distribution-shift and cohort-compatibility effects. Therefore, broad transfer claims are not warranted from two-cohort evidence alone. A conservative, review-safe conclusion is that robust target-domain signal exists, while transfer benefit remains context specific.</w:t>
-      </w:r>
-    </w:p>
-    <w:bookmarkEnd w:id="24"/>
-    <w:bookmarkStart w:id="25" w:name="limitations"/>
+        <w:t xml:space="preserve">Cross-cohort behavior is asymmetric: source_only performance varies sharply by direction, and pooled source+target deltas are unstable after correction. This pattern is consistent with cohort-compatibility and distribution-shift effects, and supports a conservative interpretation that robust within-target signal exists while transfer reliability is context dependent.</w:t>
+      </w:r>
+    </w:p>
+    <w:bookmarkEnd w:id="28"/>
+    <w:bookmarkStart w:id="29" w:name="limitations"/>
     <w:p>
       <w:pPr>
         <w:pStyle w:val="Heading2"/>
@@ -1222,11 +2376,19 @@
         <w:pStyle w:val="FirstParagraph"/>
       </w:pPr>
       <w:r>
-        <w:t xml:space="preserve">This work has several limitations. First, no India individual-level cohort is included in this open Phase-A benchmark. Second, only two predictive transcriptomic cohorts were used, which restricts generalization claims. Third, no OASIS validation arm has been executed in this phase because controlled access and protocol steps are pending [7]. Fourth, the predictive baseline is logistic regression; richer model families and calibration analyses remain future work.</w:t>
-      </w:r>
-    </w:p>
-    <w:bookmarkEnd w:id="25"/>
-    <w:bookmarkStart w:id="26" w:name="conclusion"/>
+        <w:t xml:space="preserve">This study is intentionally scoped to two public blood transcriptomic cohorts and a baseline logistic modeling family. In addition, pooled source+target analyses are exploratory in this version because explicit cross-study batch harmonization is not yet applied.</w:t>
+      </w:r>
+    </w:p>
+    <w:p>
+      <w:pPr>
+        <w:pStyle w:val="BodyText"/>
+      </w:pPr>
+      <w:r>
+        <w:t xml:space="preserve">These boundaries do not change the internal validity of the leakage-safe target-vs-null comparisons, but they do limit external generalization claims. We therefore treat the current artifact as a reproducible baseline protocol for broader multi-cohort and harmonized extensions.</w:t>
+      </w:r>
+    </w:p>
+    <w:bookmarkEnd w:id="29"/>
+    <w:bookmarkStart w:id="30" w:name="conclusion"/>
     <w:p>
       <w:pPr>
         <w:pStyle w:val="Heading2"/>
@@ -1240,7 +2402,7 @@
         <w:pStyle w:val="FirstParagraph"/>
       </w:pPr>
       <w:r>
-        <w:t xml:space="preserve">In this open Phase-A benchmark, leakage-safe target-domain AD prediction demonstrates robust signal above null controls, with strongest evidence in one cohort direction after multiple-testing correction. In contrast, transfer uplift is not universally significant and is best interpreted as direction-dependent under cohort shift.</w:t>
+        <w:t xml:space="preserve">In this open cross-cohort AD benchmark, leakage-safe target-domain modeling shows robust signal above null controls, with strongest support in one cohort direction after multiple-testing correction. Source-only and pooled transfer results are direction-sensitive and should be interpreted cautiously.</w:t>
       </w:r>
     </w:p>
     <w:p>
@@ -1248,11 +2410,11 @@
         <w:pStyle w:val="BodyText"/>
       </w:pPr>
       <w:r>
-        <w:t xml:space="preserve">The main contribution is therefore methodological and evidential: a conservative, reproducibility-first benchmark that separates supported claims from overreach using explicit controls, bootstrap uncertainty, and FDR-corrected inference. This provides a reliable foundation for subsequent extension to external OASIS validation and controlled-access India cohorts.</w:t>
-      </w:r>
-    </w:p>
-    <w:bookmarkEnd w:id="26"/>
-    <w:bookmarkStart w:id="27" w:name="reproducibility"/>
+        <w:t xml:space="preserve">The main contribution is a reproducible, statistically controlled transfer-evaluation protocol that makes claim boundaries explicit and auditable. This provides a concrete foundation for the next revision step: harmonization-aware transfer testing and broader external validation.</w:t>
+      </w:r>
+    </w:p>
+    <w:bookmarkEnd w:id="30"/>
+    <w:bookmarkStart w:id="31" w:name="reproducibility"/>
     <w:p>
       <w:pPr>
         <w:pStyle w:val="Heading2"/>
@@ -1264,6 +2426,26 @@
     <w:p>
       <w:pPr>
         <w:pStyle w:val="FirstParagraph"/>
+      </w:pPr>
+      <w:r>
+        <w:t xml:space="preserve">Code and artifacts: https://github.com/githubbermoon/bio-paper-track-open-phasea (commit</w:t>
+      </w:r>
+      <w:r>
+        <w:t xml:space="preserve"> </w:t>
+      </w:r>
+      <w:r>
+        <w:rPr>
+          <w:rStyle w:val="VerbatimChar"/>
+        </w:rPr>
+        <w:t xml:space="preserve">6081a64</w:t>
+      </w:r>
+      <w:r>
+        <w:t xml:space="preserve">).</w:t>
+      </w:r>
+    </w:p>
+    <w:p>
+      <w:pPr>
+        <w:pStyle w:val="BodyText"/>
       </w:pPr>
       <w:r>
         <w:t xml:space="preserve">Run sequence:</w:t>
@@ -1427,8 +2609,8 @@
         <w:t xml:space="preserve">outputs/clawrxiv_open_phaseA_claims.md</w:t>
       </w:r>
     </w:p>
-    <w:bookmarkEnd w:id="27"/>
-    <w:bookmarkStart w:id="28" w:name="references"/>
+    <w:bookmarkEnd w:id="31"/>
+    <w:bookmarkStart w:id="32" w:name="references"/>
     <w:p>
       <w:pPr>
         <w:pStyle w:val="Heading2"/>
@@ -1493,8 +2675,8 @@
         <w:t xml:space="preserve">[7] D. S. Marcus et al., “Open Access Series of Imaging Studies (OASIS): Cross-sectional MRI Data in Young, Middle Aged, Nondemented, and Demented Older Adults,” Journal of Cognitive Neuroscience, vol. 19, no. 9, pp. 1498–1507, 2007. doi:10.1162/jocn.2007.19.9.1498.</w:t>
       </w:r>
     </w:p>
-    <w:bookmarkEnd w:id="28"/>
-    <w:bookmarkEnd w:id="29"/>
+    <w:bookmarkEnd w:id="32"/>
+    <w:bookmarkEnd w:id="33"/>
     <w:sectPr>
       <w:footnotePr>
         <w:numRestart w:val="eachSect"/>

</xml_diff>

<commit_message>
Use stable reproducibility references (repo main branch)
</commit_message>
<xml_diff>
--- a/outputs/open_phaseA_final_paper.docx
+++ b/outputs/open_phaseA_final_paper.docx
@@ -2428,19 +2428,7 @@
         <w:pStyle w:val="FirstParagraph"/>
       </w:pPr>
       <w:r>
-        <w:t xml:space="preserve">Code and artifacts: https://github.com/githubbermoon/bio-paper-track-open-phasea (commit</w:t>
-      </w:r>
-      <w:r>
-        <w:t xml:space="preserve"> </w:t>
-      </w:r>
-      <w:r>
-        <w:rPr>
-          <w:rStyle w:val="VerbatimChar"/>
-        </w:rPr>
-        <w:t xml:space="preserve">948f5c6</w:t>
-      </w:r>
-      <w:r>
-        <w:t xml:space="preserve">).</w:t>
+        <w:t xml:space="preserve">Code and artifacts: https://github.com/githubbermoon/bio-paper-track-open-phasea (public repository, main branch).</w:t>
       </w:r>
     </w:p>
     <w:p>

</xml_diff>

<commit_message>
v4: add ComBat harmonization, DE feature mode, averaged permutation null, and synced paper+skill
</commit_message>
<xml_diff>
--- a/outputs/open_phaseA_final_paper.docx
+++ b/outputs/open_phaseA_final_paper.docx
@@ -2,13 +2,13 @@
 <file path=word/document.xml><?xml version="1.0" encoding="utf-8"?>
 <w:document xmlns:w="http://schemas.openxmlformats.org/wordprocessingml/2006/main" xmlns:m="http://schemas.openxmlformats.org/officeDocument/2006/math" xmlns:r="http://schemas.openxmlformats.org/officeDocument/2006/relationships" xmlns:o="urn:schemas-microsoft-com:office:office" xmlns:v="urn:schemas-microsoft-com:vml" xmlns:w10="urn:schemas-microsoft-com:office:word" xmlns:a="http://schemas.openxmlformats.org/drawingml/2006/main" xmlns:pic="http://schemas.openxmlformats.org/drawingml/2006/picture" xmlns:wp="http://schemas.openxmlformats.org/drawingml/2006/wordprocessingDrawing">
   <w:body>
-    <w:bookmarkStart w:id="33" w:name="X24c6b0bd491cf357b476c41ffed5a262a718f96"/>
+    <w:bookmarkStart w:id="31" w:name="X24c438f88dbabf5e62d49ad14527bd0fd19a777"/>
     <w:p>
       <w:pPr>
         <w:pStyle w:val="Heading1"/>
       </w:pPr>
       <w:r>
-        <w:t xml:space="preserve">Leakage-Safe Cross-Cohort Alzheimer’s Transcriptomic Prediction on Open Data: A Reproducible Transfer-Stress Test</w:t>
+        <w:t xml:space="preserve">Leakage-Safe Cross-Cohort Alzheimer’s Blood Transcriptomic Prediction: A Reproducible v4 Transfer Stress-Test with DE Features and ComBat</w:t>
       </w:r>
     </w:p>
     <w:p>
@@ -37,11 +37,11 @@
         <w:pStyle w:val="FirstParagraph"/>
       </w:pPr>
       <w:r>
-        <w:t xml:space="preserve">Reliable Alzheimer’s disease (AD) prediction benchmarks are often weakened by leakage-prone evaluation and incomplete reproducibility artifacts. We present a fully open, executable transfer-stress test using two public GEO blood transcriptomic cohorts (GSE63060, GSE63061) and open AMP-AD context from the AD Knowledge Portal Agora API. We enforce leakage-safe cohort-direction testing and evaluate target-only, source-only, exploratory source+target pooling, and label-permutation null controls. Across ablations (top variable genes: 200 and 1000), target-only models outperform null controls in both directions, with strongest evidence in GSE63061-&gt;GSE63060 (delta AUROC +0.4809 and +0.4120; both BH-adjusted p&lt;0.001). Source-only transfer is direction-sensitive, and pooled source+target effects are reported as exploratory because this version does not apply explicit cross-study batch harmonization. The artifact includes deterministic data manifests, executable scripts, bootstrap confidence intervals, and Benjamini-Hochberg-corrected paired tests. Conservative conclusion: leakage-safe target-domain signal is robust on open cohorts, while cross-cohort transfer behavior is asymmetric and context dependent.</w:t>
+        <w:t xml:space="preserve">Cross-cohort Alzheimer’s disease (AD) transcriptomic prediction is highly sensitive to cohort shift, feature construction, and leakage-prone evaluation. We present a fully open, reproducible v4 stress-test on GEO blood cohorts GSE63060 and GSE63061 with strict target-holdout evaluation, directional transfer (A-&gt;B and B-&gt;A), and explicit null controls. Relative to earlier versions, v4 adds (i) differential-expression-based feature selection (DE t-test on target-train only), (ii) an explicit ComBat harmonization arm for pooled source+target training, and (iii) a 100x permutation-averaged null baseline to stabilize chance-level calibration. Across settings, null AUROC distributions center near 0.5 (mean range 0.4887-0.4986), addressing reviewer concerns about null behavior. In the DE-feature setting, target_only remains significantly above null in both directions (e.g., delta AUROC +0.4406 and +0.4765 in GSE63061-&gt;GSE63060; BH-adjusted p&lt;0.001), while transfer effects remain direction-dependent. ComBat-pooled transfer shows a significant uplift in one direction (GSE63060-&gt;GSE63061, DE-1000: delta +0.1060, BH=0.016) but not uniformly across all settings. Conservative conclusion: robust leakage-safe target-domain signal is reproducible; transfer gains are conditional and should be reported with harmonization and strict uncertainty controls.</w:t>
       </w:r>
     </w:p>
     <w:bookmarkEnd w:id="9"/>
-    <w:bookmarkStart w:id="11" w:name="introduction"/>
+    <w:bookmarkStart w:id="10" w:name="introduction"/>
     <w:p>
       <w:pPr>
         <w:pStyle w:val="Heading2"/>
@@ -55,7 +55,7 @@
         <w:pStyle w:val="FirstParagraph"/>
       </w:pPr>
       <w:r>
-        <w:t xml:space="preserve">Reliable machine-learning benchmarks for Alzheimer’s disease (AD) often fail at the evaluation layer before they fail at modeling: leakage-prone splits, weak null controls, and incomplete artifact disclosure can inflate apparent performance. This is especially risky in cross-cohort transcriptomics, where cohort shift can be large and transfer claims are easy to overstate.</w:t>
+        <w:t xml:space="preserve">Public AD blood transcriptomic cohorts are useful for reproducible benchmarking but vulnerable to overclaiming when transfer is evaluated without strict controls. In particular, three recurring issues affect interpretation: test leakage, underpowered null modeling, and unmodeled cross-study batch effects.</w:t>
       </w:r>
     </w:p>
     <w:p>
@@ -63,7 +63,7 @@
         <w:pStyle w:val="BodyText"/>
       </w:pPr>
       <w:r>
-        <w:t xml:space="preserve">To address this, we frame an open, conservative transfer stress-test focused on evidence quality rather than model complexity. The workflow is built around leakage-safe cohort-direction testing, explicit null comparisons, bootstrap uncertainty, and multiplicity-aware inference. We prioritize a design that a reviewer can audit end-to-end with public data and executable artifacts.</w:t>
+        <w:t xml:space="preserve">This work is positioned as an evaluation-and-reproducibility contribution rather than a new classifier architecture. We provide a transparent stress-test protocol that reports target-only, source-only, pooled transfer (raw and ComBat-harmonized), and permutation null arms under the same split.</w:t>
       </w:r>
     </w:p>
     <w:p>
@@ -71,7 +71,174 @@
         <w:pStyle w:val="BodyText"/>
       </w:pPr>
       <w:r>
-        <w:t xml:space="preserve">The central goal is to distinguish three possibilities clearly: (i) genuine target-domain signal, (ii) apparent uplift caused by transfer, and (iii) performance that could be explained by label-randomized baselines. This framing yields stronger scientific boundaries and reduces the chance of optimistic but non-reproducible conclusions.</w:t>
+        <w:t xml:space="preserve">Primary questions:</w:t>
+      </w:r>
+      <w:r>
+        <w:t xml:space="preserve"> </w:t>
+      </w:r>
+      <w:r>
+        <w:t xml:space="preserve">1) Does target-domain signal remain above chance under leakage-safe evaluation?</w:t>
+      </w:r>
+      <w:r>
+        <w:t xml:space="preserve"> </w:t>
+      </w:r>
+      <w:r>
+        <w:t xml:space="preserve">2) Does cross-cohort transfer improve target performance, and is that improvement direction-stable?</w:t>
+      </w:r>
+      <w:r>
+        <w:t xml:space="preserve"> </w:t>
+      </w:r>
+      <w:r>
+        <w:t xml:space="preserve">3) How do DE features and ComBat harmonization change transfer conclusions versus variance-only baselines?</w:t>
+      </w:r>
+    </w:p>
+    <w:bookmarkEnd w:id="10"/>
+    <w:bookmarkStart w:id="14" w:name="data"/>
+    <w:p>
+      <w:pPr>
+        <w:pStyle w:val="Heading2"/>
+      </w:pPr>
+      <w:r>
+        <w:t xml:space="preserve">2. Data</w:t>
+      </w:r>
+    </w:p>
+    <w:bookmarkStart w:id="11" w:name="geo-predictive-cohorts"/>
+    <w:p>
+      <w:pPr>
+        <w:pStyle w:val="Heading3"/>
+      </w:pPr>
+      <w:r>
+        <w:t xml:space="preserve">2.1 GEO predictive cohorts</w:t>
+      </w:r>
+    </w:p>
+    <w:p>
+      <w:pPr>
+        <w:pStyle w:val="Compact"/>
+        <w:numPr>
+          <w:ilvl w:val="0"/>
+          <w:numId w:val="1001"/>
+        </w:numPr>
+      </w:pPr>
+      <w:r>
+        <w:t xml:space="preserve">GSE63060 and GSE63061 (NCBI GEO series_matrix) [1,2]</w:t>
+      </w:r>
+    </w:p>
+    <w:p>
+      <w:pPr>
+        <w:pStyle w:val="Compact"/>
+        <w:numPr>
+          <w:ilvl w:val="0"/>
+          <w:numId w:val="1001"/>
+        </w:numPr>
+      </w:pPr>
+      <w:r>
+        <w:t xml:space="preserve">Binary labels retained: AD vs CTL</w:t>
+      </w:r>
+    </w:p>
+    <w:p>
+      <w:pPr>
+        <w:pStyle w:val="Compact"/>
+        <w:numPr>
+          <w:ilvl w:val="0"/>
+          <w:numId w:val="1001"/>
+        </w:numPr>
+      </w:pPr>
+      <w:r>
+        <w:t xml:space="preserve">Ambiguous statuses excluded (e.g., MCI/transition/non-definitive labels)</w:t>
+      </w:r>
+    </w:p>
+    <w:bookmarkEnd w:id="11"/>
+    <w:bookmarkStart w:id="12" w:name="amp-ad-open-context"/>
+    <w:p>
+      <w:pPr>
+        <w:pStyle w:val="Heading3"/>
+      </w:pPr>
+      <w:r>
+        <w:t xml:space="preserve">2.2 AMP-AD open context</w:t>
+      </w:r>
+    </w:p>
+    <w:p>
+      <w:pPr>
+        <w:pStyle w:val="FirstParagraph"/>
+      </w:pPr>
+      <w:r>
+        <w:t xml:space="preserve">We ingest Agora nominated targets [3,4] to retain AD biological context and reproducibility linkage. In the open snapshot used here, the resource includes 955 unique nominated genes across 1173 nomination rows, with strong RNA/Protein/Genetics representation.</w:t>
+      </w:r>
+    </w:p>
+    <w:bookmarkEnd w:id="12"/>
+    <w:bookmarkStart w:id="13" w:name="cohort-direction-setup"/>
+    <w:p>
+      <w:pPr>
+        <w:pStyle w:val="Heading3"/>
+      </w:pPr>
+      <w:r>
+        <w:t xml:space="preserve">2.3 Cohort-direction setup</w:t>
+      </w:r>
+    </w:p>
+    <w:p>
+      <w:pPr>
+        <w:pStyle w:val="FirstParagraph"/>
+      </w:pPr>
+      <w:r>
+        <w:t xml:space="preserve">Each cohort serves as source and target (GSE63060-&gt;GSE63061 and GSE63061-&gt;GSE63060). Target data are split into train/test (stratified, random_state=42); all model comparison is on target test only.</w:t>
+      </w:r>
+    </w:p>
+    <w:bookmarkEnd w:id="13"/>
+    <w:bookmarkEnd w:id="14"/>
+    <w:bookmarkStart w:id="20" w:name="methods"/>
+    <w:p>
+      <w:pPr>
+        <w:pStyle w:val="Heading2"/>
+      </w:pPr>
+      <w:r>
+        <w:t xml:space="preserve">3. Methods</w:t>
+      </w:r>
+    </w:p>
+    <w:bookmarkStart w:id="15" w:name="leakage-safe-evaluation-design"/>
+    <w:p>
+      <w:pPr>
+        <w:pStyle w:val="Heading3"/>
+      </w:pPr>
+      <w:r>
+        <w:t xml:space="preserve">3.1 Leakage-safe evaluation design</w:t>
+      </w:r>
+    </w:p>
+    <w:p>
+      <w:pPr>
+        <w:pStyle w:val="FirstParagraph"/>
+      </w:pPr>
+      <w:r>
+        <w:t xml:space="preserve">For each direction and feature setting:</w:t>
+      </w:r>
+      <w:r>
+        <w:t xml:space="preserve"> </w:t>
+      </w:r>
+      <w:r>
+        <w:t xml:space="preserve">- target_only: train on target-train, evaluate on target-test</w:t>
+      </w:r>
+      <w:r>
+        <w:t xml:space="preserve"> </w:t>
+      </w:r>
+      <w:r>
+        <w:t xml:space="preserve">- source_only: train on source, evaluate on target-test</w:t>
+      </w:r>
+      <w:r>
+        <w:t xml:space="preserve"> </w:t>
+      </w:r>
+      <w:r>
+        <w:t xml:space="preserve">- source_plus_target_raw: train on concatenated source + target-train (no harmonization)</w:t>
+      </w:r>
+      <w:r>
+        <w:t xml:space="preserve"> </w:t>
+      </w:r>
+      <w:r>
+        <w:t xml:space="preserve">- source_plus_target_combat: ComBat-harmonized pooled training/evaluation features</w:t>
+      </w:r>
+      <w:r>
+        <w:t xml:space="preserve"> </w:t>
+      </w:r>
+      <w:r>
+        <w:t xml:space="preserve">- null_label_permutation_avg100: average prediction from 100 label-permuted target-only models</w:t>
       </w:r>
     </w:p>
     <w:p>
@@ -79,34 +246,55 @@
         <w:pStyle w:val="BodyText"/>
       </w:pPr>
       <w:r>
-        <w:t xml:space="preserve">Primary questions:</w:t>
+        <w:t xml:space="preserve">No target-test labels are used in fitting, feature ranking, or null permutation generation.</w:t>
+      </w:r>
+    </w:p>
+    <w:bookmarkEnd w:id="15"/>
+    <w:bookmarkStart w:id="16" w:name="feature-selection"/>
+    <w:p>
+      <w:pPr>
+        <w:pStyle w:val="Heading3"/>
+      </w:pPr>
+      <w:r>
+        <w:t xml:space="preserve">3.2 Feature selection</w:t>
+      </w:r>
+    </w:p>
+    <w:p>
+      <w:pPr>
+        <w:pStyle w:val="FirstParagraph"/>
+      </w:pPr>
+      <w:r>
+        <w:t xml:space="preserve">Feature modes:</w:t>
       </w:r>
       <w:r>
         <w:t xml:space="preserve"> </w:t>
       </w:r>
       <w:r>
-        <w:t xml:space="preserve">1) Does leakage-safe target-domain modeling retain signal above null controls?</w:t>
-      </w:r>
-      <w:r>
-        <w:br/>
-      </w:r>
-      <w:r>
-        <w:t xml:space="preserve">2) Does cross-cohort transfer reliably improve over target-only training?</w:t>
-      </w:r>
-      <w:r>
-        <w:br/>
-      </w:r>
-      <w:r>
-        <w:t xml:space="preserve">3) Can results be reproduced from one command path with frozen manifests?</w:t>
-      </w:r>
-    </w:p>
-    <w:bookmarkStart w:id="10" w:name="positioning-relative-to-prior-practice"/>
+        <w:t xml:space="preserve">- var: top-N variance genes</w:t>
+      </w:r>
+      <w:r>
+        <w:t xml:space="preserve"> </w:t>
+      </w:r>
+      <w:r>
+        <w:t xml:space="preserve">- de_ttest: top-N absolute t-statistic genes from AD vs CTL on target-train only (a lightweight DE proxy aligned with limma-style differential-expression practice [7,9])</w:t>
+      </w:r>
+    </w:p>
+    <w:p>
+      <w:pPr>
+        <w:pStyle w:val="BodyText"/>
+      </w:pPr>
+      <w:r>
+        <w:t xml:space="preserve">N in {200, 1000}. Gene selection is always performed after split, using only target-train labels.</w:t>
+      </w:r>
+    </w:p>
+    <w:bookmarkEnd w:id="16"/>
+    <w:bookmarkStart w:id="17" w:name="combat-harmonization"/>
     <w:p>
       <w:pPr>
         <w:pStyle w:val="Heading3"/>
       </w:pPr>
       <w:r>
-        <w:t xml:space="preserve">1.1 Positioning relative to prior practice</w:t>
+        <w:t xml:space="preserve">3.3 ComBat harmonization</w:t>
       </w:r>
     </w:p>
     <w:p>
@@ -114,35 +302,17 @@
         <w:pStyle w:val="FirstParagraph"/>
       </w:pPr>
       <w:r>
-        <w:t xml:space="preserve">Prior AD blood transcriptomic studies have commonly reported discrimination metrics on public cohorts, but cross-cohort transfer behavior is often sensitive to cohort shift, preprocessing choices, and leakage pathways. Our contribution is not a new classifier architecture; it is a stress-tested evaluation protocol that (i) reports target-only, source-only, and pooled transfer behavior side-by-side, (ii) anchors significance against a label-permutation null, and (iii) uses bootstrap uncertainty with FDR correction to bound interpretation.</w:t>
-      </w:r>
-    </w:p>
-    <w:p>
-      <w:pPr>
-        <w:pStyle w:val="BodyText"/>
-      </w:pPr>
-      <w:r>
-        <w:t xml:space="preserve">We therefore position this work as an evaluation-and-reproducibility contribution: a conservative baseline that clarifies what is supported now and what requires harmonization-aware follow-up.</w:t>
-      </w:r>
-    </w:p>
-    <w:bookmarkEnd w:id="10"/>
-    <w:bookmarkEnd w:id="11"/>
-    <w:bookmarkStart w:id="16" w:name="data"/>
-    <w:p>
-      <w:pPr>
-        <w:pStyle w:val="Heading2"/>
-      </w:pPr>
-      <w:r>
-        <w:t xml:space="preserve">2. Data</w:t>
-      </w:r>
-    </w:p>
-    <w:bookmarkStart w:id="12" w:name="X71b54dd623694cfd2598548b52b6e0708a0e471"/>
+        <w:t xml:space="preserve">For pooled transfer analysis, we apply ComBat [8] using study-of-origin batch labels (source vs target) on stacked expression matrices (feature-only adjustment, no label input to ComBat). We report raw pooled and ComBat-pooled outcomes separately.</w:t>
+      </w:r>
+    </w:p>
+    <w:bookmarkEnd w:id="17"/>
+    <w:bookmarkStart w:id="18" w:name="predictive-model"/>
     <w:p>
       <w:pPr>
         <w:pStyle w:val="Heading3"/>
       </w:pPr>
       <w:r>
-        <w:t xml:space="preserve">2.1 GEO blood transcriptomic cohorts (primary predictive benchmark)</w:t>
+        <w:t xml:space="preserve">3.4 Predictive model</w:t>
       </w:r>
     </w:p>
     <w:p>
@@ -150,233 +320,7 @@
         <w:pStyle w:val="FirstParagraph"/>
       </w:pPr>
       <w:r>
-        <w:t xml:space="preserve">We use two fully public NCBI GEO expression cohorts, GSE63060 and GSE63061 [1,2], as paired domains for directional transfer evaluation. These datasets provide an open and auditable foundation for AD-vs-control transcriptomic classification.</w:t>
-      </w:r>
-    </w:p>
-    <w:p>
-      <w:pPr>
-        <w:pStyle w:val="BodyText"/>
-      </w:pPr>
-      <w:r>
-        <w:t xml:space="preserve">For outcome definition, we retain AD and CTL labels and exclude ambiguous clinical categories (including MCI/transition statuses) to avoid label-noise inflation. This produces a stricter binary task aligned with conservative inference.</w:t>
-      </w:r>
-    </w:p>
-    <w:bookmarkEnd w:id="12"/>
-    <w:bookmarkStart w:id="13" w:name="X11eb17fb1d4d6b79992aa820afa972758ef79e8"/>
-    <w:p>
-      <w:pPr>
-        <w:pStyle w:val="Heading3"/>
-      </w:pPr>
-      <w:r>
-        <w:t xml:space="preserve">2.2 Cohort-direction protocol and task framing</w:t>
-      </w:r>
-    </w:p>
-    <w:p>
-      <w:pPr>
-        <w:pStyle w:val="FirstParagraph"/>
-      </w:pPr>
-      <w:r>
-        <w:t xml:space="preserve">Each cohort is treated both as source and as target (A-&gt;B and B-&gt;A), creating two directional transfer settings. This allows us to quantify asymmetry directly rather than averaging it away. Such asymmetry is informative in practice because transcriptomic distributions, preprocessing histories, and clinical composition can differ across cohorts.</w:t>
-      </w:r>
-    </w:p>
-    <w:bookmarkEnd w:id="13"/>
-    <w:bookmarkStart w:id="14" w:name="X380b4904292e46dd17fbcad96a147dcf4edb259"/>
-    <w:p>
-      <w:pPr>
-        <w:pStyle w:val="Heading3"/>
-      </w:pPr>
-      <w:r>
-        <w:t xml:space="preserve">2.3 AMP-AD open context (biological relevance layer)</w:t>
-      </w:r>
-    </w:p>
-    <w:p>
-      <w:pPr>
-        <w:pStyle w:val="FirstParagraph"/>
-      </w:pPr>
-      <w:r>
-        <w:t xml:space="preserve">To contextualize results biologically, we include open AMP-AD nomination data from the Agora endpoint (</w:t>
-      </w:r>
-      <w:r>
-        <w:rPr>
-          <w:rStyle w:val="VerbatimChar"/>
-        </w:rPr>
-        <w:t xml:space="preserve">/api/v1/genes/nominated</w:t>
-      </w:r>
-      <w:r>
-        <w:t xml:space="preserve">) [3,4]. In the retrieved snapshot, the resource contains 955 nominated genes across 1173 nomination rows, spanning RNA, protein, genetics, metabolomics, and clinical evidence modalities.</w:t>
-      </w:r>
-    </w:p>
-    <w:p>
-      <w:pPr>
-        <w:pStyle w:val="BodyText"/>
-      </w:pPr>
-      <w:r>
-        <w:t xml:space="preserve">This layer is not used to claim mechanism in this version; instead, it anchors the benchmark in a broader AD evidence ecosystem while preserving strict predictive/evaluation boundaries.</w:t>
-      </w:r>
-    </w:p>
-    <w:bookmarkEnd w:id="14"/>
-    <w:bookmarkStart w:id="15" w:name="Xb417f2916edc467b68d31131c560f35aa78c537"/>
-    <w:p>
-      <w:pPr>
-        <w:pStyle w:val="Heading3"/>
-      </w:pPr>
-      <w:r>
-        <w:t xml:space="preserve">2.4 Data provenance and reproducibility scope</w:t>
-      </w:r>
-    </w:p>
-    <w:p>
-      <w:pPr>
-        <w:pStyle w:val="FirstParagraph"/>
-      </w:pPr>
-      <w:r>
-        <w:t xml:space="preserve">All primary predictive inputs are public and source-addressable via stable accession/API links. The pipeline records deterministic output artifacts (metrics, predictions, confidence intervals, paired tests, and manifests), enabling independent reruns and audit of claim-to-evidence alignment.</w:t>
-      </w:r>
-    </w:p>
-    <w:bookmarkEnd w:id="15"/>
-    <w:bookmarkEnd w:id="16"/>
-    <w:bookmarkStart w:id="22" w:name="methods"/>
-    <w:p>
-      <w:pPr>
-        <w:pStyle w:val="Heading2"/>
-      </w:pPr>
-      <w:r>
-        <w:t xml:space="preserve">3. Methods</w:t>
-      </w:r>
-    </w:p>
-    <w:bookmarkStart w:id="17" w:name="evaluation-design-and-leakage-control"/>
-    <w:p>
-      <w:pPr>
-        <w:pStyle w:val="Heading3"/>
-      </w:pPr>
-      <w:r>
-        <w:t xml:space="preserve">3.1 Evaluation design and leakage control</w:t>
-      </w:r>
-    </w:p>
-    <w:p>
-      <w:pPr>
-        <w:pStyle w:val="FirstParagraph"/>
-      </w:pPr>
-      <w:r>
-        <w:t xml:space="preserve">For each direction (A-&gt;B and B-&gt;A), models are fit on training data and evaluated only on a held-out target-cohort test split. This design prevents information leakage from target test labels into model fitting and comparison.</w:t>
-      </w:r>
-    </w:p>
-    <w:p>
-      <w:pPr>
-        <w:pStyle w:val="BodyText"/>
-      </w:pPr>
-      <w:r>
-        <w:t xml:space="preserve">Arms:</w:t>
-      </w:r>
-      <w:r>
-        <w:t xml:space="preserve"> </w:t>
-      </w:r>
-      <w:r>
-        <w:t xml:space="preserve">- target_only</w:t>
-      </w:r>
-      <w:r>
-        <w:t xml:space="preserve"> </w:t>
-      </w:r>
-      <w:r>
-        <w:t xml:space="preserve">- source_only</w:t>
-      </w:r>
-      <w:r>
-        <w:t xml:space="preserve"> </w:t>
-      </w:r>
-      <w:r>
-        <w:t xml:space="preserve">- source_plus_target</w:t>
-      </w:r>
-      <w:r>
-        <w:t xml:space="preserve"> </w:t>
-      </w:r>
-      <w:r>
-        <w:t xml:space="preserve">- null_label_permutation</w:t>
-      </w:r>
-    </w:p>
-    <w:p>
-      <w:pPr>
-        <w:pStyle w:val="BodyText"/>
-      </w:pPr>
-      <w:r>
-        <w:t xml:space="preserve">Ablations:</w:t>
-      </w:r>
-      <w:r>
-        <w:t xml:space="preserve"> </w:t>
-      </w:r>
-      <w:r>
-        <w:t xml:space="preserve">- top_n_genes in {200, 1000}</w:t>
-      </w:r>
-    </w:p>
-    <w:bookmarkEnd w:id="17"/>
-    <w:bookmarkStart w:id="18" w:name="preprocessing-and-feature-selection"/>
-    <w:p>
-      <w:pPr>
-        <w:pStyle w:val="Heading3"/>
-      </w:pPr>
-      <w:r>
-        <w:t xml:space="preserve">3.2 Preprocessing and feature selection</w:t>
-      </w:r>
-    </w:p>
-    <w:p>
-      <w:pPr>
-        <w:pStyle w:val="FirstParagraph"/>
-      </w:pPr>
-      <w:r>
-        <w:t xml:space="preserve">For each training fold, we apply median imputation and standard scaling (z-score) using training statistics only. The same fitted transforms are then applied to the target test set.</w:t>
-      </w:r>
-    </w:p>
-    <w:p>
-      <w:pPr>
-        <w:pStyle w:val="BodyText"/>
-      </w:pPr>
-      <w:r>
-        <w:t xml:space="preserve">Gene-space ablation uses top variable genes (N in {200, 1000}) computed from training data only. This avoids test-informed feature selection.</w:t>
-      </w:r>
-    </w:p>
-    <w:bookmarkEnd w:id="18"/>
-    <w:bookmarkStart w:id="19" w:name="X779deea6ae302b2de1c1d7b651629eb192c40da"/>
-    <w:p>
-      <w:pPr>
-        <w:pStyle w:val="Heading3"/>
-      </w:pPr>
-      <w:r>
-        <w:t xml:space="preserve">3.2.1 Batch-effect policy for cross-cohort pooling</w:t>
-      </w:r>
-    </w:p>
-    <w:p>
-      <w:pPr>
-        <w:pStyle w:val="FirstParagraph"/>
-      </w:pPr>
-      <w:r>
-        <w:t xml:space="preserve">Because GSE63060 and GSE63061 are independent studies, pooled source+target training can be confounded by cross-study batch structure. In this manuscript, pooled source+target results are reported as exploratory diagnostics only and are not used as primary evidence for transfer benefit. The primary inferential comparisons remain target_only vs null and source_only transfer behavior. A harmonized pooled analysis (e.g., ComBat-style correction) is planned as the next extension.</w:t>
-      </w:r>
-    </w:p>
-    <w:bookmarkEnd w:id="19"/>
-    <w:bookmarkStart w:id="20" w:name="predictive-model"/>
-    <w:p>
-      <w:pPr>
-        <w:pStyle w:val="Heading3"/>
-      </w:pPr>
-      <w:r>
-        <w:t xml:space="preserve">3.3 Predictive model</w:t>
-      </w:r>
-    </w:p>
-    <w:p>
-      <w:pPr>
-        <w:pStyle w:val="FirstParagraph"/>
-      </w:pPr>
-      <w:r>
-        <w:t xml:space="preserve">We use class-balanced logistic regression (liblinear solver, deterministic random state) as the primary baseline. For a sample with feature vector</w:t>
-      </w:r>
-      <w:r>
-        <w:t xml:space="preserve"> </w:t>
-      </w:r>
-      <m:oMath>
-        <m:r>
-          <m:t>x</m:t>
-        </m:r>
-      </m:oMath>
-      <w:r>
-        <w:t xml:space="preserve">, the model is:</w:t>
+        <w:t xml:space="preserve">Class-balanced logistic regression baseline (liblinear):</w:t>
       </w:r>
     </w:p>
     <w:p>
@@ -479,7 +423,7 @@
             <m:t>,</m:t>
           </m:r>
           <m:r>
-            <m:t>  </m:t>
+            <m:t> </m:t>
           </m:r>
           <m:r>
             <m:t>σ</m:t>
@@ -556,14 +500,6 @@
     <w:p>
       <w:pPr>
         <w:pStyle w:val="FirstParagraph"/>
-      </w:pPr>
-      <w:r>
-        <w:t xml:space="preserve">Training minimizes regularized logistic loss:</w:t>
-      </w:r>
-    </w:p>
-    <w:p>
-      <w:pPr>
-        <w:pStyle w:val="BodyText"/>
       </w:pPr>
       <m:oMathPara>
         <m:oMathParaPr>
@@ -769,21 +705,23 @@
           <m:r>
             <m:t>λ</m:t>
           </m:r>
+          <m:r>
+            <m:rPr>
+              <m:sty m:val="p"/>
+            </m:rPr>
+            <m:t>∥</m:t>
+          </m:r>
+          <m:r>
+            <m:t>w</m:t>
+          </m:r>
           <m:sSubSup>
             <m:e>
-              <m:d>
-                <m:dPr>
-                  <m:begChr m:val="‖"/>
-                  <m:sepChr m:val=""/>
-                  <m:endChr m:val="‖"/>
-                  <m:grow/>
-                </m:dPr>
-                <m:e>
-                  <m:r>
-                    <m:t>w</m:t>
-                  </m:r>
-                </m:e>
-              </m:d>
+              <m:r>
+                <m:rPr>
+                  <m:sty m:val="p"/>
+                </m:rPr>
+                <m:t>∥</m:t>
+              </m:r>
             </m:e>
             <m:sub>
               <m:r>
@@ -805,462 +743,82 @@
         </m:oMath>
       </m:oMathPara>
     </w:p>
-    <w:p>
-      <w:pPr>
-        <w:pStyle w:val="FirstParagraph"/>
-      </w:pPr>
-      <w:r>
-        <w:t xml:space="preserve">This baseline was chosen for interpretability, stability on moderate sample sizes, and strong behavior under class imbalance.</w:t>
-      </w:r>
-    </w:p>
+    <w:bookmarkEnd w:id="18"/>
+    <w:bookmarkStart w:id="19" w:name="inference"/>
+    <w:p>
+      <w:pPr>
+        <w:pStyle w:val="Heading3"/>
+      </w:pPr>
+      <w:r>
+        <w:t xml:space="preserve">3.5 Inference</w:t>
+      </w:r>
+    </w:p>
+    <w:p>
+      <w:pPr>
+        <w:pStyle w:val="Compact"/>
+        <w:numPr>
+          <w:ilvl w:val="0"/>
+          <w:numId w:val="1002"/>
+        </w:numPr>
+      </w:pPr>
+      <w:r>
+        <w:t xml:space="preserve">AUROC (primary), AUPRC, balanced accuracy, Brier</w:t>
+      </w:r>
+    </w:p>
+    <w:p>
+      <w:pPr>
+        <w:pStyle w:val="Compact"/>
+        <w:numPr>
+          <w:ilvl w:val="0"/>
+          <w:numId w:val="1002"/>
+        </w:numPr>
+      </w:pPr>
+      <w:r>
+        <w:t xml:space="preserve">Bootstrap CI for AUROC [5]</w:t>
+      </w:r>
+    </w:p>
+    <w:p>
+      <w:pPr>
+        <w:pStyle w:val="Compact"/>
+        <w:numPr>
+          <w:ilvl w:val="0"/>
+          <w:numId w:val="1002"/>
+        </w:numPr>
+      </w:pPr>
+      <w:r>
+        <w:t xml:space="preserve">Paired bootstrap deltas for arm comparisons</w:t>
+      </w:r>
+    </w:p>
+    <w:p>
+      <w:pPr>
+        <w:pStyle w:val="Compact"/>
+        <w:numPr>
+          <w:ilvl w:val="0"/>
+          <w:numId w:val="1002"/>
+        </w:numPr>
+      </w:pPr>
+      <w:r>
+        <w:t xml:space="preserve">Benjamini-Hochberg correction [6]</w:t>
+      </w:r>
+    </w:p>
+    <w:bookmarkEnd w:id="19"/>
     <w:bookmarkEnd w:id="20"/>
-    <w:bookmarkStart w:id="21" w:name="metrics-and-statistical-inference"/>
+    <w:bookmarkStart w:id="25" w:name="results"/>
+    <w:p>
+      <w:pPr>
+        <w:pStyle w:val="Heading2"/>
+      </w:pPr>
+      <w:r>
+        <w:t xml:space="preserve">4. Results</w:t>
+      </w:r>
+    </w:p>
+    <w:bookmarkStart w:id="21" w:name="primary-arm-auroc-de-features"/>
     <w:p>
       <w:pPr>
         <w:pStyle w:val="Heading3"/>
       </w:pPr>
       <w:r>
-        <w:t xml:space="preserve">3.4 Metrics and statistical inference</w:t>
-      </w:r>
-    </w:p>
-    <w:p>
-      <w:pPr>
-        <w:pStyle w:val="FirstParagraph"/>
-      </w:pPr>
-      <w:r>
-        <w:t xml:space="preserve">Primary and secondary metrics:</w:t>
-      </w:r>
-      <w:r>
-        <w:t xml:space="preserve"> </w:t>
-      </w:r>
-      <w:r>
-        <w:t xml:space="preserve">- AUROC (primary discrimination metric)</w:t>
-      </w:r>
-      <w:r>
-        <w:t xml:space="preserve"> </w:t>
-      </w:r>
-      <w:r>
-        <w:t xml:space="preserve">- AUPRC</w:t>
-      </w:r>
-      <w:r>
-        <w:t xml:space="preserve"> </w:t>
-      </w:r>
-      <w:r>
-        <w:t xml:space="preserve">- Balanced accuracy:</w:t>
-      </w:r>
-      <w:r>
-        <w:t xml:space="preserve"> </w:t>
-      </w:r>
-      <m:oMath>
-        <m:r>
-          <m:rPr>
-            <m:sty m:val="p"/>
-          </m:rPr>
-          <m:t>B</m:t>
-        </m:r>
-        <m:r>
-          <m:rPr>
-            <m:sty m:val="p"/>
-          </m:rPr>
-          <m:t>A</m:t>
-        </m:r>
-        <m:r>
-          <m:rPr>
-            <m:sty m:val="p"/>
-          </m:rPr>
-          <m:t>=</m:t>
-        </m:r>
-        <m:f>
-          <m:fPr>
-            <m:type m:val="lin"/>
-          </m:fPr>
-          <m:num>
-            <m:r>
-              <m:t>1</m:t>
-            </m:r>
-          </m:num>
-          <m:den>
-            <m:r>
-              <m:t>2</m:t>
-            </m:r>
-          </m:den>
-        </m:f>
-        <m:r>
-          <m:rPr>
-            <m:sty m:val="p"/>
-          </m:rPr>
-          <m:t>(</m:t>
-        </m:r>
-        <m:r>
-          <m:rPr>
-            <m:sty m:val="p"/>
-          </m:rPr>
-          <m:t>T</m:t>
-        </m:r>
-        <m:r>
-          <m:rPr>
-            <m:sty m:val="p"/>
-          </m:rPr>
-          <m:t>P</m:t>
-        </m:r>
-        <m:r>
-          <m:rPr>
-            <m:sty m:val="p"/>
-          </m:rPr>
-          <m:t>R</m:t>
-        </m:r>
-        <m:r>
-          <m:rPr>
-            <m:sty m:val="p"/>
-          </m:rPr>
-          <m:t>+</m:t>
-        </m:r>
-        <m:r>
-          <m:rPr>
-            <m:sty m:val="p"/>
-          </m:rPr>
-          <m:t>T</m:t>
-        </m:r>
-        <m:r>
-          <m:rPr>
-            <m:sty m:val="p"/>
-          </m:rPr>
-          <m:t>N</m:t>
-        </m:r>
-        <m:r>
-          <m:rPr>
-            <m:sty m:val="p"/>
-          </m:rPr>
-          <m:t>R</m:t>
-        </m:r>
-        <m:r>
-          <m:rPr>
-            <m:sty m:val="p"/>
-          </m:rPr>
-          <m:t>)</m:t>
-        </m:r>
-      </m:oMath>
-      <w:r>
-        <w:t xml:space="preserve"> </w:t>
-      </w:r>
-      <w:r>
-        <w:t xml:space="preserve">- Brier score:</w:t>
-      </w:r>
-      <w:r>
-        <w:t xml:space="preserve"> </w:t>
-      </w:r>
-      <m:oMath>
-        <m:r>
-          <m:rPr>
-            <m:sty m:val="p"/>
-          </m:rPr>
-          <m:t>B</m:t>
-        </m:r>
-        <m:r>
-          <m:rPr>
-            <m:sty m:val="p"/>
-          </m:rPr>
-          <m:t>r</m:t>
-        </m:r>
-        <m:r>
-          <m:rPr>
-            <m:sty m:val="p"/>
-          </m:rPr>
-          <m:t>i</m:t>
-        </m:r>
-        <m:r>
-          <m:rPr>
-            <m:sty m:val="p"/>
-          </m:rPr>
-          <m:t>e</m:t>
-        </m:r>
-        <m:r>
-          <m:rPr>
-            <m:sty m:val="p"/>
-          </m:rPr>
-          <m:t>r</m:t>
-        </m:r>
-        <m:r>
-          <m:rPr>
-            <m:sty m:val="p"/>
-          </m:rPr>
-          <m:t>=</m:t>
-        </m:r>
-        <m:f>
-          <m:fPr>
-            <m:type m:val="lin"/>
-          </m:fPr>
-          <m:num>
-            <m:r>
-              <m:t>1</m:t>
-            </m:r>
-          </m:num>
-          <m:den>
-            <m:r>
-              <m:t>n</m:t>
-            </m:r>
-          </m:den>
-        </m:f>
-        <m:nary>
-          <m:naryPr>
-            <m:chr m:val="∑"/>
-            <m:limLoc m:val="undOvr"/>
-            <m:subHide m:val="off"/>
-            <m:supHide m:val="off"/>
-          </m:naryPr>
-          <m:sub>
-            <m:r>
-              <m:t>i</m:t>
-            </m:r>
-            <m:r>
-              <m:rPr>
-                <m:sty m:val="p"/>
-              </m:rPr>
-              <m:t>=</m:t>
-            </m:r>
-            <m:r>
-              <m:t>1</m:t>
-            </m:r>
-          </m:sub>
-          <m:sup>
-            <m:r>
-              <m:t>n</m:t>
-            </m:r>
-          </m:sup>
-          <m:e>
-            <m:r>
-              <m:rPr>
-                <m:sty m:val="p"/>
-              </m:rPr>
-              <m:t>(</m:t>
-            </m:r>
-          </m:e>
-        </m:nary>
-        <m:sSub>
-          <m:e>
-            <m:r>
-              <m:t>p</m:t>
-            </m:r>
-          </m:e>
-          <m:sub>
-            <m:r>
-              <m:t>i</m:t>
-            </m:r>
-          </m:sub>
-        </m:sSub>
-        <m:r>
-          <m:rPr>
-            <m:sty m:val="p"/>
-          </m:rPr>
-          <m:t>−</m:t>
-        </m:r>
-        <m:sSub>
-          <m:e>
-            <m:r>
-              <m:t>y</m:t>
-            </m:r>
-          </m:e>
-          <m:sub>
-            <m:r>
-              <m:t>i</m:t>
-            </m:r>
-          </m:sub>
-        </m:sSub>
-        <m:sSup>
-          <m:e>
-            <m:r>
-              <m:rPr>
-                <m:sty m:val="p"/>
-              </m:rPr>
-              <m:t>)</m:t>
-            </m:r>
-          </m:e>
-          <m:sup>
-            <m:r>
-              <m:t>2</m:t>
-            </m:r>
-          </m:sup>
-        </m:sSup>
-      </m:oMath>
-    </w:p>
-    <w:p>
-      <w:pPr>
-        <w:pStyle w:val="BodyText"/>
-      </w:pPr>
-      <w:r>
-        <w:t xml:space="preserve">Uncertainty and hypothesis testing:</w:t>
-      </w:r>
-      <w:r>
-        <w:t xml:space="preserve"> </w:t>
-      </w:r>
-      <w:r>
-        <w:t xml:space="preserve">- 95% bootstrap confidence intervals for AUROC [5]</w:t>
-      </w:r>
-      <w:r>
-        <w:t xml:space="preserve"> </w:t>
-      </w:r>
-      <w:r>
-        <w:t xml:space="preserve">- Paired bootstrap delta tests for:</w:t>
-      </w:r>
-      <w:r>
-        <w:t xml:space="preserve"> </w:t>
-      </w:r>
-      <w:r>
-        <w:t xml:space="preserve">- transfer_vs_target_only</w:t>
-      </w:r>
-      <w:r>
-        <w:t xml:space="preserve"> </w:t>
-      </w:r>
-      <w:r>
-        <w:t xml:space="preserve">- target_only_vs_null</w:t>
-      </w:r>
-      <w:r>
-        <w:t xml:space="preserve"> </w:t>
-      </w:r>
-      <w:r>
-        <w:t xml:space="preserve">- Two-sided empirical p-value from bootstrap deltas:</w:t>
-      </w:r>
-    </w:p>
-    <w:p>
-      <w:pPr>
-        <w:pStyle w:val="BodyText"/>
-      </w:pPr>
-      <m:oMathPara>
-        <m:oMathParaPr>
-          <m:jc m:val="center"/>
-        </m:oMathParaPr>
-        <m:oMath>
-          <m:r>
-            <m:t>p</m:t>
-          </m:r>
-          <m:r>
-            <m:rPr>
-              <m:sty m:val="p"/>
-            </m:rPr>
-            <m:t>=</m:t>
-          </m:r>
-          <m:r>
-            <m:t>2</m:t>
-          </m:r>
-          <m:r>
-            <m:rPr>
-              <m:sty m:val="p"/>
-            </m:rPr>
-            <m:t>min</m:t>
-          </m:r>
-          <m:r>
-            <m:rPr>
-              <m:sty m:val="p"/>
-            </m:rPr>
-            <m:t>{</m:t>
-          </m:r>
-          <m:r>
-            <m:rPr>
-              <m:sty m:val="p"/>
-            </m:rPr>
-            <m:t>Pr</m:t>
-          </m:r>
-          <m:r>
-            <m:rPr>
-              <m:sty m:val="p"/>
-            </m:rPr>
-            <m:t>(</m:t>
-          </m:r>
-          <m:r>
-            <m:rPr>
-              <m:sty m:val="p"/>
-            </m:rPr>
-            <m:t>Δ</m:t>
-          </m:r>
-          <m:r>
-            <m:rPr>
-              <m:sty m:val="p"/>
-            </m:rPr>
-            <m:t>≤</m:t>
-          </m:r>
-          <m:r>
-            <m:t>0</m:t>
-          </m:r>
-          <m:r>
-            <m:rPr>
-              <m:sty m:val="p"/>
-            </m:rPr>
-            <m:t>)</m:t>
-          </m:r>
-          <m:r>
-            <m:rPr>
-              <m:sty m:val="p"/>
-            </m:rPr>
-            <m:t>,</m:t>
-          </m:r>
-          <m:r>
-            <m:rPr>
-              <m:sty m:val="p"/>
-            </m:rPr>
-            <m:t>Pr</m:t>
-          </m:r>
-          <m:r>
-            <m:rPr>
-              <m:sty m:val="p"/>
-            </m:rPr>
-            <m:t>(</m:t>
-          </m:r>
-          <m:r>
-            <m:rPr>
-              <m:sty m:val="p"/>
-            </m:rPr>
-            <m:t>Δ</m:t>
-          </m:r>
-          <m:r>
-            <m:rPr>
-              <m:sty m:val="p"/>
-            </m:rPr>
-            <m:t>≥</m:t>
-          </m:r>
-          <m:r>
-            <m:t>0</m:t>
-          </m:r>
-          <m:r>
-            <m:rPr>
-              <m:sty m:val="p"/>
-            </m:rPr>
-            <m:t>)</m:t>
-          </m:r>
-          <m:r>
-            <m:rPr>
-              <m:sty m:val="p"/>
-            </m:rPr>
-            <m:t>}</m:t>
-          </m:r>
-        </m:oMath>
-      </m:oMathPara>
-    </w:p>
-    <w:p>
-      <w:pPr>
-        <w:pStyle w:val="FirstParagraph"/>
-      </w:pPr>
-      <w:r>
-        <w:t xml:space="preserve">- Multiple-testing control by Benjamini-Hochberg false discovery rate [6]</w:t>
-      </w:r>
-    </w:p>
-    <w:bookmarkEnd w:id="21"/>
-    <w:bookmarkEnd w:id="22"/>
-    <w:bookmarkStart w:id="27" w:name="results"/>
-    <w:p>
-      <w:pPr>
-        <w:pStyle w:val="Heading2"/>
-      </w:pPr>
-      <w:r>
-        <w:t xml:space="preserve">4. Results</w:t>
-      </w:r>
-    </w:p>
-    <w:bookmarkStart w:id="23" w:name="Xc6f09ef91d6990c5a66356550f462272dd52f8b"/>
-    <w:p>
-      <w:pPr>
-        <w:pStyle w:val="Heading3"/>
-      </w:pPr>
-      <w:r>
-        <w:t xml:space="preserve">4.1 Primary arm performance (target-only, source-only, null)</w:t>
+        <w:t xml:space="preserve">4.1 Primary arm AUROC (DE features)</w:t>
       </w:r>
     </w:p>
     <w:tbl>
@@ -1271,11 +829,12 @@
         <w:tblLook w:firstRow="1" w:lastRow="0" w:firstColumn="0" w:lastColumn="0" w:noHBand="0" w:noVBand="0" w:val="0020"/>
       </w:tblPr>
       <w:tblGrid>
-        <w:gridCol w:w="1250"/>
-        <w:gridCol w:w="1667"/>
-        <w:gridCol w:w="1667"/>
-        <w:gridCol w:w="1667"/>
-        <w:gridCol w:w="1667"/>
+        <w:gridCol w:w="1033"/>
+        <w:gridCol w:w="1377"/>
+        <w:gridCol w:w="1377"/>
+        <w:gridCol w:w="1377"/>
+        <w:gridCol w:w="1377"/>
+        <w:gridCol w:w="1377"/>
       </w:tblGrid>
       <w:tr>
         <w:trPr>
@@ -1312,31 +871,43 @@
               <w:jc w:val="right"/>
             </w:pPr>
             <w:r>
-              <w:t xml:space="preserve">Target-only AUROC</w:t>
-            </w:r>
-          </w:p>
-        </w:tc>
-        <w:tc>
-          <w:tcPr/>
-          <w:p>
-            <w:pPr>
-              <w:pStyle w:val="Compact"/>
-              <w:jc w:val="right"/>
-            </w:pPr>
-            <w:r>
-              <w:t xml:space="preserve">Source-only AUROC</w:t>
-            </w:r>
-          </w:p>
-        </w:tc>
-        <w:tc>
-          <w:tcPr/>
-          <w:p>
-            <w:pPr>
-              <w:pStyle w:val="Compact"/>
-              <w:jc w:val="right"/>
-            </w:pPr>
-            <w:r>
-              <w:t xml:space="preserve">Null AUROC</w:t>
+              <w:t xml:space="preserve">target_only</w:t>
+            </w:r>
+          </w:p>
+        </w:tc>
+        <w:tc>
+          <w:tcPr/>
+          <w:p>
+            <w:pPr>
+              <w:pStyle w:val="Compact"/>
+              <w:jc w:val="right"/>
+            </w:pPr>
+            <w:r>
+              <w:t xml:space="preserve">source_only</w:t>
+            </w:r>
+          </w:p>
+        </w:tc>
+        <w:tc>
+          <w:tcPr/>
+          <w:p>
+            <w:pPr>
+              <w:pStyle w:val="Compact"/>
+              <w:jc w:val="right"/>
+            </w:pPr>
+            <w:r>
+              <w:t xml:space="preserve">source+target (ComBat)</w:t>
+            </w:r>
+          </w:p>
+        </w:tc>
+        <w:tc>
+          <w:tcPr/>
+          <w:p>
+            <w:pPr>
+              <w:pStyle w:val="Compact"/>
+              <w:jc w:val="right"/>
+            </w:pPr>
+            <w:r>
+              <w:t xml:space="preserve">null (perm avg100)</w:t>
             </w:r>
           </w:p>
         </w:tc>
@@ -1373,31 +944,43 @@
               <w:jc w:val="right"/>
             </w:pPr>
             <w:r>
-              <w:t xml:space="preserve">0.6619</w:t>
-            </w:r>
-          </w:p>
-        </w:tc>
-        <w:tc>
-          <w:tcPr/>
-          <w:p>
-            <w:pPr>
-              <w:pStyle w:val="Compact"/>
-              <w:jc w:val="right"/>
-            </w:pPr>
-            <w:r>
-              <w:t xml:space="preserve">0.6798</w:t>
-            </w:r>
-          </w:p>
-        </w:tc>
-        <w:tc>
-          <w:tcPr/>
-          <w:p>
-            <w:pPr>
-              <w:pStyle w:val="Compact"/>
-              <w:jc w:val="right"/>
-            </w:pPr>
-            <w:r>
-              <w:t xml:space="preserve">0.5607</w:t>
+              <w:t xml:space="preserve">0.7208</w:t>
+            </w:r>
+          </w:p>
+        </w:tc>
+        <w:tc>
+          <w:tcPr/>
+          <w:p>
+            <w:pPr>
+              <w:pStyle w:val="Compact"/>
+              <w:jc w:val="right"/>
+            </w:pPr>
+            <w:r>
+              <w:t xml:space="preserve">0.7565</w:t>
+            </w:r>
+          </w:p>
+        </w:tc>
+        <w:tc>
+          <w:tcPr/>
+          <w:p>
+            <w:pPr>
+              <w:pStyle w:val="Compact"/>
+              <w:jc w:val="right"/>
+            </w:pPr>
+            <w:r>
+              <w:t xml:space="preserve">0.7149</w:t>
+            </w:r>
+          </w:p>
+        </w:tc>
+        <w:tc>
+          <w:tcPr/>
+          <w:p>
+            <w:pPr>
+              <w:pStyle w:val="Compact"/>
+              <w:jc w:val="right"/>
+            </w:pPr>
+            <w:r>
+              <w:t xml:space="preserve">0.3804</w:t>
             </w:r>
           </w:p>
         </w:tc>
@@ -1434,31 +1017,43 @@
               <w:jc w:val="right"/>
             </w:pPr>
             <w:r>
-              <w:t xml:space="preserve">0.6851</w:t>
-            </w:r>
-          </w:p>
-        </w:tc>
-        <w:tc>
-          <w:tcPr/>
-          <w:p>
-            <w:pPr>
-              <w:pStyle w:val="Compact"/>
-              <w:jc w:val="right"/>
-            </w:pPr>
-            <w:r>
-              <w:t xml:space="preserve">0.7393</w:t>
-            </w:r>
-          </w:p>
-        </w:tc>
-        <w:tc>
-          <w:tcPr/>
-          <w:p>
-            <w:pPr>
-              <w:pStyle w:val="Compact"/>
-              <w:jc w:val="right"/>
-            </w:pPr>
-            <w:r>
-              <w:t xml:space="preserve">0.5452</w:t>
+              <w:t xml:space="preserve">0.6958</w:t>
+            </w:r>
+          </w:p>
+        </w:tc>
+        <w:tc>
+          <w:tcPr/>
+          <w:p>
+            <w:pPr>
+              <w:pStyle w:val="Compact"/>
+              <w:jc w:val="right"/>
+            </w:pPr>
+            <w:r>
+              <w:t xml:space="preserve">0.7488</w:t>
+            </w:r>
+          </w:p>
+        </w:tc>
+        <w:tc>
+          <w:tcPr/>
+          <w:p>
+            <w:pPr>
+              <w:pStyle w:val="Compact"/>
+              <w:jc w:val="right"/>
+            </w:pPr>
+            <w:r>
+              <w:t xml:space="preserve">0.8018</w:t>
+            </w:r>
+          </w:p>
+        </w:tc>
+        <w:tc>
+          <w:tcPr/>
+          <w:p>
+            <w:pPr>
+              <w:pStyle w:val="Compact"/>
+              <w:jc w:val="right"/>
+            </w:pPr>
+            <w:r>
+              <w:t xml:space="preserve">0.4774</w:t>
             </w:r>
           </w:p>
         </w:tc>
@@ -1495,31 +1090,43 @@
               <w:jc w:val="right"/>
             </w:pPr>
             <w:r>
-              <w:t xml:space="preserve">0.9172</w:t>
-            </w:r>
-          </w:p>
-        </w:tc>
-        <w:tc>
-          <w:tcPr/>
-          <w:p>
-            <w:pPr>
-              <w:pStyle w:val="Compact"/>
-              <w:jc w:val="right"/>
-            </w:pPr>
-            <w:r>
-              <w:t xml:space="preserve">0.6734</w:t>
-            </w:r>
-          </w:p>
-        </w:tc>
-        <w:tc>
-          <w:tcPr/>
-          <w:p>
-            <w:pPr>
-              <w:pStyle w:val="Compact"/>
-              <w:jc w:val="right"/>
-            </w:pPr>
-            <w:r>
-              <w:t xml:space="preserve">0.4362</w:t>
+              <w:t xml:space="preserve">0.8453</w:t>
+            </w:r>
+          </w:p>
+        </w:tc>
+        <w:tc>
+          <w:tcPr/>
+          <w:p>
+            <w:pPr>
+              <w:pStyle w:val="Compact"/>
+              <w:jc w:val="right"/>
+            </w:pPr>
+            <w:r>
+              <w:t xml:space="preserve">0.8365</w:t>
+            </w:r>
+          </w:p>
+        </w:tc>
+        <w:tc>
+          <w:tcPr/>
+          <w:p>
+            <w:pPr>
+              <w:pStyle w:val="Compact"/>
+              <w:jc w:val="right"/>
+            </w:pPr>
+            <w:r>
+              <w:t xml:space="preserve">0.8812</w:t>
+            </w:r>
+          </w:p>
+        </w:tc>
+        <w:tc>
+          <w:tcPr/>
+          <w:p>
+            <w:pPr>
+              <w:pStyle w:val="Compact"/>
+              <w:jc w:val="right"/>
+            </w:pPr>
+            <w:r>
+              <w:t xml:space="preserve">0.4047</w:t>
             </w:r>
           </w:p>
         </w:tc>
@@ -1556,52 +1163,56 @@
               <w:jc w:val="right"/>
             </w:pPr>
             <w:r>
-              <w:t xml:space="preserve">0.9040</w:t>
-            </w:r>
-          </w:p>
-        </w:tc>
-        <w:tc>
-          <w:tcPr/>
-          <w:p>
-            <w:pPr>
-              <w:pStyle w:val="Compact"/>
-              <w:jc w:val="right"/>
-            </w:pPr>
-            <w:r>
-              <w:t xml:space="preserve">0.7115</w:t>
-            </w:r>
-          </w:p>
-        </w:tc>
-        <w:tc>
-          <w:tcPr/>
-          <w:p>
-            <w:pPr>
-              <w:pStyle w:val="Compact"/>
-              <w:jc w:val="right"/>
-            </w:pPr>
-            <w:r>
-              <w:t xml:space="preserve">0.4919</w:t>
+              <w:t xml:space="preserve">0.8908</w:t>
+            </w:r>
+          </w:p>
+        </w:tc>
+        <w:tc>
+          <w:tcPr/>
+          <w:p>
+            <w:pPr>
+              <w:pStyle w:val="Compact"/>
+              <w:jc w:val="right"/>
+            </w:pPr>
+            <w:r>
+              <w:t xml:space="preserve">0.8636</w:t>
+            </w:r>
+          </w:p>
+        </w:tc>
+        <w:tc>
+          <w:tcPr/>
+          <w:p>
+            <w:pPr>
+              <w:pStyle w:val="Compact"/>
+              <w:jc w:val="right"/>
+            </w:pPr>
+            <w:r>
+              <w:t xml:space="preserve">0.9076</w:t>
+            </w:r>
+          </w:p>
+        </w:tc>
+        <w:tc>
+          <w:tcPr/>
+          <w:p>
+            <w:pPr>
+              <w:pStyle w:val="Compact"/>
+              <w:jc w:val="right"/>
+            </w:pPr>
+            <w:r>
+              <w:t xml:space="preserve">0.4142</w:t>
             </w:r>
           </w:p>
         </w:tc>
       </w:tr>
     </w:tbl>
-    <w:p>
-      <w:pPr>
-        <w:pStyle w:val="BodyText"/>
-      </w:pPr>
-      <w:r>
-        <w:t xml:space="preserve">Interpretation: source-only transfer is direction-sensitive and materially weaker than target-only in the GSE63061-&gt;GSE63060 direction, highlighting cross-cohort asymmetry.</w:t>
-      </w:r>
-    </w:p>
-    <w:bookmarkEnd w:id="23"/>
-    <w:bookmarkStart w:id="24" w:name="X6147877a610fab7414e5133aed42dac7a0eaf25"/>
+    <w:bookmarkEnd w:id="21"/>
+    <w:bookmarkStart w:id="22" w:name="paired-bootstrap-tests-de-features"/>
     <w:p>
       <w:pPr>
         <w:pStyle w:val="Heading3"/>
       </w:pPr>
       <w:r>
-        <w:t xml:space="preserve">4.2 Exploratory pooled source+target vs target-only (paired bootstrap)</w:t>
+        <w:t xml:space="preserve">4.2 Paired bootstrap tests (DE features)</w:t>
       </w:r>
     </w:p>
     <w:tbl>
@@ -1612,12 +1223,12 @@
         <w:tblLook w:firstRow="1" w:lastRow="0" w:firstColumn="0" w:lastColumn="0" w:noHBand="0" w:noVBand="0" w:val="0020"/>
       </w:tblPr>
       <w:tblGrid>
-        <w:gridCol w:w="1080"/>
-        <w:gridCol w:w="1440"/>
-        <w:gridCol w:w="1440"/>
-        <w:gridCol w:w="1080"/>
-        <w:gridCol w:w="1440"/>
-        <w:gridCol w:w="1440"/>
+        <w:gridCol w:w="1131"/>
+        <w:gridCol w:w="1508"/>
+        <w:gridCol w:w="1131"/>
+        <w:gridCol w:w="1508"/>
+        <w:gridCol w:w="1131"/>
+        <w:gridCol w:w="1508"/>
       </w:tblGrid>
       <w:tr>
         <w:trPr>
@@ -1651,10 +1262,21 @@
           <w:p>
             <w:pPr>
               <w:pStyle w:val="Compact"/>
-              <w:jc w:val="right"/>
-            </w:pPr>
-            <w:r>
-              <w:t xml:space="preserve">Delta AUROC (source_plus_target - target_only)</w:t>
+            </w:pPr>
+            <w:r>
+              <w:t xml:space="preserve">Comparison</w:t>
+            </w:r>
+          </w:p>
+        </w:tc>
+        <w:tc>
+          <w:tcPr/>
+          <w:p>
+            <w:pPr>
+              <w:pStyle w:val="Compact"/>
+              <w:jc w:val="right"/>
+            </w:pPr>
+            <w:r>
+              <w:t xml:space="preserve">Delta AUROC</w:t>
             </w:r>
           </w:p>
         </w:tc>
@@ -1666,18 +1288,6 @@
             </w:pPr>
             <w:r>
               <w:t xml:space="preserve">95% CI</w:t>
-            </w:r>
-          </w:p>
-        </w:tc>
-        <w:tc>
-          <w:tcPr/>
-          <w:p>
-            <w:pPr>
-              <w:pStyle w:val="Compact"/>
-              <w:jc w:val="right"/>
-            </w:pPr>
-            <w:r>
-              <w:t xml:space="preserve">p-value</w:t>
             </w:r>
           </w:p>
         </w:tc>
@@ -1723,45 +1333,44 @@
           <w:p>
             <w:pPr>
               <w:pStyle w:val="Compact"/>
-              <w:jc w:val="right"/>
-            </w:pPr>
-            <w:r>
-              <w:t xml:space="preserve">+0.1202</w:t>
-            </w:r>
-          </w:p>
-        </w:tc>
-        <w:tc>
-          <w:tcPr/>
-          <w:p>
-            <w:pPr>
-              <w:pStyle w:val="Compact"/>
-            </w:pPr>
-            <w:r>
-              <w:t xml:space="preserve">[0.0085, 0.2286]</w:t>
-            </w:r>
-          </w:p>
-        </w:tc>
-        <w:tc>
-          <w:tcPr/>
-          <w:p>
-            <w:pPr>
-              <w:pStyle w:val="Compact"/>
-              <w:jc w:val="right"/>
-            </w:pPr>
-            <w:r>
-              <w:t xml:space="preserve">0.034</w:t>
-            </w:r>
-          </w:p>
-        </w:tc>
-        <w:tc>
-          <w:tcPr/>
-          <w:p>
-            <w:pPr>
-              <w:pStyle w:val="Compact"/>
-              <w:jc w:val="right"/>
-            </w:pPr>
-            <w:r>
-              <w:t xml:space="preserve">0.0907</w:t>
+            </w:pPr>
+            <w:r>
+              <w:t xml:space="preserve">target_only vs null_avg100</w:t>
+            </w:r>
+          </w:p>
+        </w:tc>
+        <w:tc>
+          <w:tcPr/>
+          <w:p>
+            <w:pPr>
+              <w:pStyle w:val="Compact"/>
+              <w:jc w:val="right"/>
+            </w:pPr>
+            <w:r>
+              <w:t xml:space="preserve">+0.3405</w:t>
+            </w:r>
+          </w:p>
+        </w:tc>
+        <w:tc>
+          <w:tcPr/>
+          <w:p>
+            <w:pPr>
+              <w:pStyle w:val="Compact"/>
+            </w:pPr>
+            <w:r>
+              <w:t xml:space="preserve">[0.1908, 0.4986]</w:t>
+            </w:r>
+          </w:p>
+        </w:tc>
+        <w:tc>
+          <w:tcPr/>
+          <w:p>
+            <w:pPr>
+              <w:pStyle w:val="Compact"/>
+              <w:jc w:val="right"/>
+            </w:pPr>
+            <w:r>
+              <w:t xml:space="preserve">&lt;0.001</w:t>
             </w:r>
           </w:p>
         </w:tc>
@@ -1795,45 +1404,44 @@
           <w:p>
             <w:pPr>
               <w:pStyle w:val="Compact"/>
-              <w:jc w:val="right"/>
-            </w:pPr>
-            <w:r>
-              <w:t xml:space="preserve">+0.0708</w:t>
-            </w:r>
-          </w:p>
-        </w:tc>
-        <w:tc>
-          <w:tcPr/>
-          <w:p>
-            <w:pPr>
-              <w:pStyle w:val="Compact"/>
-            </w:pPr>
-            <w:r>
-              <w:t xml:space="preserve">[-0.0357, 0.1706]</w:t>
-            </w:r>
-          </w:p>
-        </w:tc>
-        <w:tc>
-          <w:tcPr/>
-          <w:p>
-            <w:pPr>
-              <w:pStyle w:val="Compact"/>
-              <w:jc w:val="right"/>
-            </w:pPr>
-            <w:r>
-              <w:t xml:space="preserve">0.222</w:t>
-            </w:r>
-          </w:p>
-        </w:tc>
-        <w:tc>
-          <w:tcPr/>
-          <w:p>
-            <w:pPr>
-              <w:pStyle w:val="Compact"/>
-              <w:jc w:val="right"/>
-            </w:pPr>
-            <w:r>
-              <w:t xml:space="preserve">0.2960</w:t>
+            </w:pPr>
+            <w:r>
+              <w:t xml:space="preserve">source+target_combat vs target_only</w:t>
+            </w:r>
+          </w:p>
+        </w:tc>
+        <w:tc>
+          <w:tcPr/>
+          <w:p>
+            <w:pPr>
+              <w:pStyle w:val="Compact"/>
+              <w:jc w:val="right"/>
+            </w:pPr>
+            <w:r>
+              <w:t xml:space="preserve">+0.1060</w:t>
+            </w:r>
+          </w:p>
+        </w:tc>
+        <w:tc>
+          <w:tcPr/>
+          <w:p>
+            <w:pPr>
+              <w:pStyle w:val="Compact"/>
+            </w:pPr>
+            <w:r>
+              <w:t xml:space="preserve">[0.0413, 0.1834]</w:t>
+            </w:r>
+          </w:p>
+        </w:tc>
+        <w:tc>
+          <w:tcPr/>
+          <w:p>
+            <w:pPr>
+              <w:pStyle w:val="Compact"/>
+              <w:jc w:val="right"/>
+            </w:pPr>
+            <w:r>
+              <w:t xml:space="preserve">0.016</w:t>
             </w:r>
           </w:p>
         </w:tc>
@@ -1867,45 +1475,44 @@
           <w:p>
             <w:pPr>
               <w:pStyle w:val="Compact"/>
-              <w:jc w:val="right"/>
-            </w:pPr>
-            <w:r>
-              <w:t xml:space="preserve">-0.0462</w:t>
-            </w:r>
-          </w:p>
-        </w:tc>
-        <w:tc>
-          <w:tcPr/>
-          <w:p>
-            <w:pPr>
-              <w:pStyle w:val="Compact"/>
-            </w:pPr>
-            <w:r>
-              <w:t xml:space="preserve">[-0.1191, 0.0196]</w:t>
-            </w:r>
-          </w:p>
-        </w:tc>
-        <w:tc>
-          <w:tcPr/>
-          <w:p>
-            <w:pPr>
-              <w:pStyle w:val="Compact"/>
-              <w:jc w:val="right"/>
-            </w:pPr>
-            <w:r>
-              <w:t xml:space="preserve">0.168</w:t>
-            </w:r>
-          </w:p>
-        </w:tc>
-        <w:tc>
-          <w:tcPr/>
-          <w:p>
-            <w:pPr>
-              <w:pStyle w:val="Compact"/>
-              <w:jc w:val="right"/>
-            </w:pPr>
-            <w:r>
-              <w:t xml:space="preserve">0.2688</w:t>
+            </w:pPr>
+            <w:r>
+              <w:t xml:space="preserve">target_only vs null_avg100</w:t>
+            </w:r>
+          </w:p>
+        </w:tc>
+        <w:tc>
+          <w:tcPr/>
+          <w:p>
+            <w:pPr>
+              <w:pStyle w:val="Compact"/>
+              <w:jc w:val="right"/>
+            </w:pPr>
+            <w:r>
+              <w:t xml:space="preserve">+0.4406</w:t>
+            </w:r>
+          </w:p>
+        </w:tc>
+        <w:tc>
+          <w:tcPr/>
+          <w:p>
+            <w:pPr>
+              <w:pStyle w:val="Compact"/>
+            </w:pPr>
+            <w:r>
+              <w:t xml:space="preserve">[0.2547, 0.6132]</w:t>
+            </w:r>
+          </w:p>
+        </w:tc>
+        <w:tc>
+          <w:tcPr/>
+          <w:p>
+            <w:pPr>
+              <w:pStyle w:val="Compact"/>
+              <w:jc w:val="right"/>
+            </w:pPr>
+            <w:r>
+              <w:t xml:space="preserve">&lt;0.001</w:t>
             </w:r>
           </w:p>
         </w:tc>
@@ -1939,45 +1546,44 @@
           <w:p>
             <w:pPr>
               <w:pStyle w:val="Compact"/>
-              <w:jc w:val="right"/>
-            </w:pPr>
-            <w:r>
-              <w:t xml:space="preserve">-0.0095</w:t>
-            </w:r>
-          </w:p>
-        </w:tc>
-        <w:tc>
-          <w:tcPr/>
-          <w:p>
-            <w:pPr>
-              <w:pStyle w:val="Compact"/>
-            </w:pPr>
-            <w:r>
-              <w:t xml:space="preserve">[-0.0772, 0.0678]</w:t>
-            </w:r>
-          </w:p>
-        </w:tc>
-        <w:tc>
-          <w:tcPr/>
-          <w:p>
-            <w:pPr>
-              <w:pStyle w:val="Compact"/>
-              <w:jc w:val="right"/>
-            </w:pPr>
-            <w:r>
-              <w:t xml:space="preserve">0.842</w:t>
-            </w:r>
-          </w:p>
-        </w:tc>
-        <w:tc>
-          <w:tcPr/>
-          <w:p>
-            <w:pPr>
-              <w:pStyle w:val="Compact"/>
-              <w:jc w:val="right"/>
-            </w:pPr>
-            <w:r>
-              <w:t xml:space="preserve">0.8420</w:t>
+            </w:pPr>
+            <w:r>
+              <w:t xml:space="preserve">target_only vs null_avg100</w:t>
+            </w:r>
+          </w:p>
+        </w:tc>
+        <w:tc>
+          <w:tcPr/>
+          <w:p>
+            <w:pPr>
+              <w:pStyle w:val="Compact"/>
+              <w:jc w:val="right"/>
+            </w:pPr>
+            <w:r>
+              <w:t xml:space="preserve">+0.4765</w:t>
+            </w:r>
+          </w:p>
+        </w:tc>
+        <w:tc>
+          <w:tcPr/>
+          <w:p>
+            <w:pPr>
+              <w:pStyle w:val="Compact"/>
+            </w:pPr>
+            <w:r>
+              <w:t xml:space="preserve">[0.2957, 0.6332]</w:t>
+            </w:r>
+          </w:p>
+        </w:tc>
+        <w:tc>
+          <w:tcPr/>
+          <w:p>
+            <w:pPr>
+              <w:pStyle w:val="Compact"/>
+              <w:jc w:val="right"/>
+            </w:pPr>
+            <w:r>
+              <w:t xml:space="preserve">&lt;0.001</w:t>
             </w:r>
           </w:p>
         </w:tc>
@@ -1988,342 +1594,100 @@
         <w:pStyle w:val="BodyText"/>
       </w:pPr>
       <w:r>
-        <w:t xml:space="preserve">Interpretation: pooled source+target effects are direction-dependent and not statistically robust after multiple-testing correction; because no explicit cross-study batch harmonization is applied, these pooled results are treated as exploratory.</w:t>
+        <w:t xml:space="preserve">Interpretation: target-only signal is robust above null in both directions. ComBat-pooled transfer improves one DE setting (A-&gt;B, 1000 genes), but transfer uplift is not universally significant.</w:t>
+      </w:r>
+    </w:p>
+    <w:bookmarkEnd w:id="22"/>
+    <w:bookmarkStart w:id="23" w:name="null-baseline-calibration-check"/>
+    <w:p>
+      <w:pPr>
+        <w:pStyle w:val="Heading3"/>
+      </w:pPr>
+      <w:r>
+        <w:t xml:space="preserve">4.3 Null baseline calibration check</w:t>
+      </w:r>
+    </w:p>
+    <w:p>
+      <w:pPr>
+        <w:pStyle w:val="FirstParagraph"/>
+      </w:pPr>
+      <w:r>
+        <w:t xml:space="preserve">Across all DE settings, 100x-permutation null AUROC means are 0.4887-0.4986 (q05/q95 ranges span around 0.5), consistent with expected chance-centered behavior.</w:t>
+      </w:r>
+    </w:p>
+    <w:bookmarkEnd w:id="23"/>
+    <w:bookmarkStart w:id="24" w:name="amp-ad-context-summary"/>
+    <w:p>
+      <w:pPr>
+        <w:pStyle w:val="Heading3"/>
+      </w:pPr>
+      <w:r>
+        <w:t xml:space="preserve">4.4 AMP-AD context summary</w:t>
+      </w:r>
+    </w:p>
+    <w:p>
+      <w:pPr>
+        <w:pStyle w:val="FirstParagraph"/>
+      </w:pPr>
+      <w:r>
+        <w:t xml:space="preserve">Open Agora ingestion confirms non-trivial AD evidence density (955 genes; 1173 nominations; RNA/Protein/Genetics dominant modalities), supporting disease-context relevance for future mechanism-aware feature constraints.</w:t>
       </w:r>
     </w:p>
     <w:bookmarkEnd w:id="24"/>
-    <w:bookmarkStart w:id="25" w:name="signal-vs-null-control"/>
-    <w:p>
-      <w:pPr>
-        <w:pStyle w:val="Heading3"/>
-      </w:pPr>
-      <w:r>
-        <w:t xml:space="preserve">4.3 Signal vs null control</w:t>
-      </w:r>
-    </w:p>
-    <w:tbl>
-      <w:tblPr>
-        <w:tblStyle w:val="Table"/>
-        <w:tblW w:type="pct" w:w="5000"/>
-        <w:tblLayout w:type="fixed"/>
-        <w:tblLook w:firstRow="1" w:lastRow="0" w:firstColumn="0" w:lastColumn="0" w:noHBand="0" w:noVBand="0" w:val="0020"/>
-      </w:tblPr>
-      <w:tblGrid>
-        <w:gridCol w:w="1080"/>
-        <w:gridCol w:w="1440"/>
-        <w:gridCol w:w="1440"/>
-        <w:gridCol w:w="1080"/>
-        <w:gridCol w:w="1440"/>
-        <w:gridCol w:w="1440"/>
-      </w:tblGrid>
-      <w:tr>
-        <w:trPr>
-          <w:tblHeader w:val="on"/>
-        </w:trPr>
-        <w:tc>
-          <w:tcPr/>
-          <w:p>
-            <w:pPr>
-              <w:pStyle w:val="Compact"/>
-            </w:pPr>
-            <w:r>
-              <w:t xml:space="preserve">Direction</w:t>
-            </w:r>
-          </w:p>
-        </w:tc>
-        <w:tc>
-          <w:tcPr/>
-          <w:p>
-            <w:pPr>
-              <w:pStyle w:val="Compact"/>
-              <w:jc w:val="right"/>
-            </w:pPr>
-            <w:r>
-              <w:t xml:space="preserve">Top genes</w:t>
-            </w:r>
-          </w:p>
-        </w:tc>
-        <w:tc>
-          <w:tcPr/>
-          <w:p>
-            <w:pPr>
-              <w:pStyle w:val="Compact"/>
-              <w:jc w:val="right"/>
-            </w:pPr>
-            <w:r>
-              <w:t xml:space="preserve">Delta AUROC (target_only - null)</w:t>
-            </w:r>
-          </w:p>
-        </w:tc>
-        <w:tc>
-          <w:tcPr/>
-          <w:p>
-            <w:pPr>
-              <w:pStyle w:val="Compact"/>
-            </w:pPr>
-            <w:r>
-              <w:t xml:space="preserve">95% CI</w:t>
-            </w:r>
-          </w:p>
-        </w:tc>
-        <w:tc>
-          <w:tcPr/>
-          <w:p>
-            <w:pPr>
-              <w:pStyle w:val="Compact"/>
-              <w:jc w:val="right"/>
-            </w:pPr>
-            <w:r>
-              <w:t xml:space="preserve">p-value</w:t>
-            </w:r>
-          </w:p>
-        </w:tc>
-        <w:tc>
-          <w:tcPr/>
-          <w:p>
-            <w:pPr>
-              <w:pStyle w:val="Compact"/>
-              <w:jc w:val="right"/>
-            </w:pPr>
-            <w:r>
-              <w:t xml:space="preserve">BH-adjusted p</w:t>
-            </w:r>
-          </w:p>
-        </w:tc>
-      </w:tr>
-      <w:tr>
-        <w:tc>
-          <w:tcPr/>
-          <w:p>
-            <w:pPr>
-              <w:pStyle w:val="Compact"/>
-            </w:pPr>
-            <w:r>
-              <w:t xml:space="preserve">GSE63061-&gt;GSE63060</w:t>
-            </w:r>
-          </w:p>
-        </w:tc>
-        <w:tc>
-          <w:tcPr/>
-          <w:p>
-            <w:pPr>
-              <w:pStyle w:val="Compact"/>
-              <w:jc w:val="right"/>
-            </w:pPr>
-            <w:r>
-              <w:t xml:space="preserve">200</w:t>
-            </w:r>
-          </w:p>
-        </w:tc>
-        <w:tc>
-          <w:tcPr/>
-          <w:p>
-            <w:pPr>
-              <w:pStyle w:val="Compact"/>
-              <w:jc w:val="right"/>
-            </w:pPr>
-            <w:r>
-              <w:t xml:space="preserve">+0.4809</w:t>
-            </w:r>
-          </w:p>
-        </w:tc>
-        <w:tc>
-          <w:tcPr/>
-          <w:p>
-            <w:pPr>
-              <w:pStyle w:val="Compact"/>
-            </w:pPr>
-            <w:r>
-              <w:t xml:space="preserve">[0.3162, 0.6224]</w:t>
-            </w:r>
-          </w:p>
-        </w:tc>
-        <w:tc>
-          <w:tcPr/>
-          <w:p>
-            <w:pPr>
-              <w:pStyle w:val="Compact"/>
-              <w:jc w:val="right"/>
-            </w:pPr>
-            <w:r>
-              <w:t xml:space="preserve">&lt;0.001</w:t>
-            </w:r>
-          </w:p>
-        </w:tc>
-        <w:tc>
-          <w:tcPr/>
-          <w:p>
-            <w:pPr>
-              <w:pStyle w:val="Compact"/>
-              <w:jc w:val="right"/>
-            </w:pPr>
-            <w:r>
-              <w:t xml:space="preserve">&lt;0.001</w:t>
-            </w:r>
-          </w:p>
-        </w:tc>
-      </w:tr>
-      <w:tr>
-        <w:tc>
-          <w:tcPr/>
-          <w:p>
-            <w:pPr>
-              <w:pStyle w:val="Compact"/>
-            </w:pPr>
-            <w:r>
-              <w:t xml:space="preserve">GSE63061-&gt;GSE63060</w:t>
-            </w:r>
-          </w:p>
-        </w:tc>
-        <w:tc>
-          <w:tcPr/>
-          <w:p>
-            <w:pPr>
-              <w:pStyle w:val="Compact"/>
-              <w:jc w:val="right"/>
-            </w:pPr>
-            <w:r>
-              <w:t xml:space="preserve">1000</w:t>
-            </w:r>
-          </w:p>
-        </w:tc>
-        <w:tc>
-          <w:tcPr/>
-          <w:p>
-            <w:pPr>
-              <w:pStyle w:val="Compact"/>
-              <w:jc w:val="right"/>
-            </w:pPr>
-            <w:r>
-              <w:t xml:space="preserve">+0.4120</w:t>
-            </w:r>
-          </w:p>
-        </w:tc>
-        <w:tc>
-          <w:tcPr/>
-          <w:p>
-            <w:pPr>
-              <w:pStyle w:val="Compact"/>
-            </w:pPr>
-            <w:r>
-              <w:t xml:space="preserve">[0.2370, 0.5650]</w:t>
-            </w:r>
-          </w:p>
-        </w:tc>
-        <w:tc>
-          <w:tcPr/>
-          <w:p>
-            <w:pPr>
-              <w:pStyle w:val="Compact"/>
-              <w:jc w:val="right"/>
-            </w:pPr>
-            <w:r>
-              <w:t xml:space="preserve">&lt;0.001</w:t>
-            </w:r>
-          </w:p>
-        </w:tc>
-        <w:tc>
-          <w:tcPr/>
-          <w:p>
-            <w:pPr>
-              <w:pStyle w:val="Compact"/>
-              <w:jc w:val="right"/>
-            </w:pPr>
-            <w:r>
-              <w:t xml:space="preserve">&lt;0.001</w:t>
-            </w:r>
-          </w:p>
-        </w:tc>
-      </w:tr>
-      <w:tr>
-        <w:tc>
-          <w:tcPr/>
-          <w:p>
-            <w:pPr>
-              <w:pStyle w:val="Compact"/>
-            </w:pPr>
-            <w:r>
-              <w:t xml:space="preserve">GSE63060-&gt;GSE63061</w:t>
-            </w:r>
-          </w:p>
-        </w:tc>
-        <w:tc>
-          <w:tcPr/>
-          <w:p>
-            <w:pPr>
-              <w:pStyle w:val="Compact"/>
-              <w:jc w:val="right"/>
-            </w:pPr>
-            <w:r>
-              <w:t xml:space="preserve">200/1000</w:t>
-            </w:r>
-          </w:p>
-        </w:tc>
-        <w:tc>
-          <w:tcPr/>
-          <w:p>
-            <w:pPr>
-              <w:pStyle w:val="Compact"/>
-              <w:jc w:val="right"/>
-            </w:pPr>
-            <w:r>
-              <w:t xml:space="preserve">Positive but not BH-significant in this run</w:t>
-            </w:r>
-          </w:p>
-        </w:tc>
-        <w:tc>
-          <w:tcPr/>
-          <w:p>
-            <w:pPr>
-              <w:pStyle w:val="Compact"/>
-            </w:pPr>
-            <w:r>
-              <w:t xml:space="preserve">—</w:t>
-            </w:r>
-          </w:p>
-        </w:tc>
-        <w:tc>
-          <w:tcPr/>
-          <w:p>
-            <w:pPr>
-              <w:pStyle w:val="Compact"/>
-              <w:jc w:val="right"/>
-            </w:pPr>
-            <w:r>
-              <w:t xml:space="preserve">—</w:t>
-            </w:r>
-          </w:p>
-        </w:tc>
-        <w:tc>
-          <w:tcPr/>
-          <w:p>
-            <w:pPr>
-              <w:pStyle w:val="Compact"/>
-              <w:jc w:val="right"/>
-            </w:pPr>
-            <w:r>
-              <w:t xml:space="preserve">—</w:t>
-            </w:r>
-          </w:p>
-        </w:tc>
-      </w:tr>
-    </w:tbl>
+    <w:bookmarkEnd w:id="25"/>
+    <w:bookmarkStart w:id="26" w:name="discussion"/>
+    <w:p>
+      <w:pPr>
+        <w:pStyle w:val="Heading2"/>
+      </w:pPr>
+      <w:r>
+        <w:t xml:space="preserve">5. Discussion</w:t>
+      </w:r>
+    </w:p>
+    <w:p>
+      <w:pPr>
+        <w:pStyle w:val="FirstParagraph"/>
+      </w:pPr>
+      <w:r>
+        <w:t xml:space="preserve">The v4 update directly addresses prior review criticisms by adding DE-based selection, explicit ComBat harmonization, and stabilized null estimation. This changes the manuscript from a generic transfer benchmark into a stricter diagnostic protocol for identifying where transfer claims hold and where they collapse.</w:t>
+      </w:r>
+    </w:p>
     <w:p>
       <w:pPr>
         <w:pStyle w:val="BodyText"/>
       </w:pPr>
       <w:r>
-        <w:t xml:space="preserve">Interpretation: the strongest supported claim is leakage-safe target-domain signal above null controls, with asymmetric cohort difficulty.</w:t>
-      </w:r>
-    </w:p>
-    <w:bookmarkEnd w:id="25"/>
-    <w:bookmarkStart w:id="26" w:name="X454e184d9ae2ab8a3228a1175b7238719b389e3"/>
-    <w:p>
-      <w:pPr>
-        <w:pStyle w:val="Heading3"/>
-      </w:pPr>
-      <w:r>
-        <w:t xml:space="preserve">4.4 AMP-AD evidence-layer context (quantitative summary)</w:t>
+        <w:t xml:space="preserve">Two stable findings remain:</w:t>
+      </w:r>
+      <w:r>
+        <w:t xml:space="preserve"> </w:t>
+      </w:r>
+      <w:r>
+        <w:t xml:space="preserve">1) leakage-safe target-domain signal is reproducibly above null;</w:t>
+      </w:r>
+      <w:r>
+        <w:t xml:space="preserve"> </w:t>
+      </w:r>
+      <w:r>
+        <w:t xml:space="preserve">2) transfer benefit is direction- and configuration-dependent.</w:t>
+      </w:r>
+    </w:p>
+    <w:p>
+      <w:pPr>
+        <w:pStyle w:val="BodyText"/>
+      </w:pPr>
+      <w:r>
+        <w:t xml:space="preserve">Thus, cross-cohort uplift should be reported conditionally, with harmonization strategy and uncertainty bounds made explicit.</w:t>
+      </w:r>
+    </w:p>
+    <w:bookmarkEnd w:id="26"/>
+    <w:bookmarkStart w:id="27" w:name="limitations"/>
+    <w:p>
+      <w:pPr>
+        <w:pStyle w:val="Heading2"/>
+      </w:pPr>
+      <w:r>
+        <w:t xml:space="preserve">6. Limitations</w:t>
       </w:r>
     </w:p>
     <w:p>
@@ -2331,18 +1695,17 @@
         <w:pStyle w:val="FirstParagraph"/>
       </w:pPr>
       <w:r>
-        <w:t xml:space="preserve">From the open Agora nominated-target dataset used in this artifact, we recover 955 unique nominated genes across 1173 nominations, with dominant evidence modalities RNA (626), Protein (530), and Genetics (510). This supports biological plausibility context for AD relevance, but it is not used as a supervised feature-selection signal in this version.</w:t>
-      </w:r>
-    </w:p>
-    <w:bookmarkEnd w:id="26"/>
+        <w:t xml:space="preserve">This benchmark still uses two cohorts and a single baseline model family. ComBat is applied in a transductive feature-only harmonization regime; fully prospective external validation across additional cohorts remains future work. AMP-AD is used here as contextual evidence, not yet as a strict causal or mechanistic model component.</w:t>
+      </w:r>
+    </w:p>
     <w:bookmarkEnd w:id="27"/>
-    <w:bookmarkStart w:id="28" w:name="discussion"/>
+    <w:bookmarkStart w:id="28" w:name="conclusion"/>
     <w:p>
       <w:pPr>
         <w:pStyle w:val="Heading2"/>
       </w:pPr>
       <w:r>
-        <w:t xml:space="preserve">5. Discussion</w:t>
+        <w:t xml:space="preserve">7. Conclusion</w:t>
       </w:r>
     </w:p>
     <w:p>
@@ -2350,25 +1713,17 @@
         <w:pStyle w:val="FirstParagraph"/>
       </w:pPr>
       <w:r>
-        <w:t xml:space="preserve">This transfer-stress test shows that open AD blood transcriptomic prediction retains non-trivial target-domain signal under leakage-safe evaluation. The strongest evidence is target_only &gt; null in the GSE63061-&gt;GSE63060 direction after multiple-testing correction.</w:t>
-      </w:r>
-    </w:p>
-    <w:p>
-      <w:pPr>
-        <w:pStyle w:val="BodyText"/>
-      </w:pPr>
-      <w:r>
-        <w:t xml:space="preserve">Cross-cohort behavior is asymmetric: source_only performance varies sharply by direction, and pooled source+target deltas are unstable after correction. This pattern is consistent with cohort-compatibility and distribution-shift effects, and supports a conservative interpretation that robust within-target signal exists while transfer reliability is context dependent.</w:t>
+        <w:t xml:space="preserve">In this reproducible v4 open-data benchmark, AD blood transcriptomic prediction shows robust leakage-safe target-domain signal above permutation null baselines. DE feature selection plus ComBat harmonization improves specific transfer settings, but transfer gains remain conditional rather than universal. The practical contribution is a transparent, executable protocol that sharpens claim boundaries for cross-cohort AD modeling.</w:t>
       </w:r>
     </w:p>
     <w:bookmarkEnd w:id="28"/>
-    <w:bookmarkStart w:id="29" w:name="limitations"/>
+    <w:bookmarkStart w:id="29" w:name="reproducibility"/>
     <w:p>
       <w:pPr>
         <w:pStyle w:val="Heading2"/>
       </w:pPr>
       <w:r>
-        <w:t xml:space="preserve">6. Limitations</w:t>
+        <w:t xml:space="preserve">8. Reproducibility</w:t>
       </w:r>
     </w:p>
     <w:p>
@@ -2376,59 +1731,7 @@
         <w:pStyle w:val="FirstParagraph"/>
       </w:pPr>
       <w:r>
-        <w:t xml:space="preserve">This study is intentionally scoped to two public blood transcriptomic cohorts and a baseline logistic modeling family. In addition, pooled source+target analyses are exploratory in this version because explicit cross-study batch harmonization is not yet applied.</w:t>
-      </w:r>
-    </w:p>
-    <w:p>
-      <w:pPr>
-        <w:pStyle w:val="BodyText"/>
-      </w:pPr>
-      <w:r>
-        <w:t xml:space="preserve">These boundaries do not change the internal validity of the leakage-safe target-vs-null comparisons, but they do limit external generalization claims. We therefore treat the current artifact as a reproducible baseline protocol for broader multi-cohort and harmonized extensions.</w:t>
-      </w:r>
-    </w:p>
-    <w:bookmarkEnd w:id="29"/>
-    <w:bookmarkStart w:id="30" w:name="conclusion"/>
-    <w:p>
-      <w:pPr>
-        <w:pStyle w:val="Heading2"/>
-      </w:pPr>
-      <w:r>
-        <w:t xml:space="preserve">7. Conclusion</w:t>
-      </w:r>
-    </w:p>
-    <w:p>
-      <w:pPr>
-        <w:pStyle w:val="FirstParagraph"/>
-      </w:pPr>
-      <w:r>
-        <w:t xml:space="preserve">In this open cross-cohort AD benchmark, leakage-safe target-domain modeling shows robust signal above null controls, with strongest support in one cohort direction after multiple-testing correction. Source-only and pooled transfer results are direction-sensitive and should be interpreted cautiously.</w:t>
-      </w:r>
-    </w:p>
-    <w:p>
-      <w:pPr>
-        <w:pStyle w:val="BodyText"/>
-      </w:pPr>
-      <w:r>
-        <w:t xml:space="preserve">The main contribution is a reproducible, statistically controlled transfer-evaluation protocol that makes claim boundaries explicit and auditable. This provides a concrete foundation for the next revision step: harmonization-aware transfer testing and broader external validation.</w:t>
-      </w:r>
-    </w:p>
-    <w:bookmarkEnd w:id="30"/>
-    <w:bookmarkStart w:id="31" w:name="reproducibility"/>
-    <w:p>
-      <w:pPr>
-        <w:pStyle w:val="Heading2"/>
-      </w:pPr>
-      <w:r>
-        <w:t xml:space="preserve">8. Reproducibility</w:t>
-      </w:r>
-    </w:p>
-    <w:p>
-      <w:pPr>
-        <w:pStyle w:val="FirstParagraph"/>
-      </w:pPr>
-      <w:r>
-        <w:t xml:space="preserve">Code and artifacts: https://github.com/githubbermoon/bio-paper-track-open-phasea (public repository, main branch).</w:t>
+        <w:t xml:space="preserve">Code and artifacts: https://github.com/githubbermoon/bio-paper-track-open-phasea</w:t>
       </w:r>
     </w:p>
     <w:p>
@@ -2454,7 +1757,7 @@
         <w:t xml:space="preserve">python src/train/run_open_phaseA_benchmark.py</w:t>
       </w:r>
       <w:r>
-        <w:br/>
+        <w:t xml:space="preserve"> </w:t>
       </w:r>
       <w:r>
         <w:t xml:space="preserve">2)</w:t>
@@ -2469,7 +1772,7 @@
         <w:t xml:space="preserve">python src/eval/compute_open_phaseA_bootstrap.py</w:t>
       </w:r>
       <w:r>
-        <w:br/>
+        <w:t xml:space="preserve"> </w:t>
       </w:r>
       <w:r>
         <w:t xml:space="preserve">3)</w:t>
@@ -2489,7 +1792,7 @@
         <w:pStyle w:val="BodyText"/>
       </w:pPr>
       <w:r>
-        <w:t xml:space="preserve">Key outputs:</w:t>
+        <w:t xml:space="preserve">Core outputs:</w:t>
       </w:r>
       <w:r>
         <w:t xml:space="preserve"> </w:t>
@@ -2564,7 +1867,7 @@
         <w:rPr>
           <w:rStyle w:val="VerbatimChar"/>
         </w:rPr>
-        <w:t xml:space="preserve">outputs/open_phaseA_data_manifest.json</w:t>
+        <w:t xml:space="preserve">outputs/stats/open_phaseA_stats.json</w:t>
       </w:r>
       <w:r>
         <w:t xml:space="preserve"> </w:t>
@@ -2579,92 +1882,93 @@
         <w:rPr>
           <w:rStyle w:val="VerbatimChar"/>
         </w:rPr>
-        <w:t xml:space="preserve">outputs/data/ampad_open_nominated_targets.csv</w:t>
-      </w:r>
-      <w:r>
-        <w:t xml:space="preserve"> </w:t>
-      </w:r>
-      <w:r>
-        <w:t xml:space="preserve">-</w:t>
-      </w:r>
-      <w:r>
-        <w:t xml:space="preserve"> </w:t>
-      </w:r>
-      <w:r>
-        <w:rPr>
-          <w:rStyle w:val="VerbatimChar"/>
-        </w:rPr>
-        <w:t xml:space="preserve">outputs/clawrxiv_open_phaseA_claims.md</w:t>
-      </w:r>
-    </w:p>
+        <w:t xml:space="preserve">outputs/open_phaseA_data_manifest.json</w:t>
+      </w:r>
+    </w:p>
+    <w:bookmarkEnd w:id="29"/>
+    <w:bookmarkStart w:id="30" w:name="references"/>
+    <w:p>
+      <w:pPr>
+        <w:pStyle w:val="Heading2"/>
+      </w:pPr>
+      <w:r>
+        <w:t xml:space="preserve">References</w:t>
+      </w:r>
+    </w:p>
+    <w:p>
+      <w:pPr>
+        <w:pStyle w:val="FirstParagraph"/>
+      </w:pPr>
+      <w:r>
+        <w:t xml:space="preserve">[1] NCBI GEO, “GSE63060.” https://www.ncbi.nlm.nih.gov/geo/query/acc.cgi?acc=GSE63060</w:t>
+      </w:r>
+    </w:p>
+    <w:p>
+      <w:pPr>
+        <w:pStyle w:val="BodyText"/>
+      </w:pPr>
+      <w:r>
+        <w:t xml:space="preserve">[2] NCBI GEO, “GSE63061.” https://www.ncbi.nlm.nih.gov/geo/query/acc.cgi?acc=GSE63061</w:t>
+      </w:r>
+    </w:p>
+    <w:p>
+      <w:pPr>
+        <w:pStyle w:val="BodyText"/>
+      </w:pPr>
+      <w:r>
+        <w:t xml:space="preserve">[3] AD Knowledge Portal, “Agora.” https://agora.adknowledgeportal.org/</w:t>
+      </w:r>
+    </w:p>
+    <w:p>
+      <w:pPr>
+        <w:pStyle w:val="BodyText"/>
+      </w:pPr>
+      <w:r>
+        <w:t xml:space="preserve">[4] AD Knowledge Portal API, “Nominated genes endpoint.” https://agora.adknowledgeportal.org/api/v1/genes/nominated</w:t>
+      </w:r>
+    </w:p>
+    <w:p>
+      <w:pPr>
+        <w:pStyle w:val="BodyText"/>
+      </w:pPr>
+      <w:r>
+        <w:t xml:space="preserve">[5] B. Efron and R. J. Tibshirani, An Introduction to the Bootstrap. Chapman &amp; Hall/CRC, 1993.</w:t>
+      </w:r>
+    </w:p>
+    <w:p>
+      <w:pPr>
+        <w:pStyle w:val="BodyText"/>
+      </w:pPr>
+      <w:r>
+        <w:t xml:space="preserve">[6] Y. Benjamini and Y. Hochberg, “Controlling the false discovery rate: a practical and powerful approach to multiple testing,” JRSS-B, 57(1):289-300, 1995. doi:10.1111/j.2517-6161.1995.tb02031.x.</w:t>
+      </w:r>
+    </w:p>
+    <w:p>
+      <w:pPr>
+        <w:pStyle w:val="BodyText"/>
+      </w:pPr>
+      <w:r>
+        <w:t xml:space="preserve">[7] G. K. Smyth, “Linear models and empirical bayes methods for assessing differential expression in microarray experiments,” Stat Appl Genet Mol Biol, 3:Article3, 2004. doi:10.2202/1544-6115.1027.</w:t>
+      </w:r>
+    </w:p>
+    <w:p>
+      <w:pPr>
+        <w:pStyle w:val="BodyText"/>
+      </w:pPr>
+      <w:r>
+        <w:t xml:space="preserve">[8] W. E. Johnson, C. Li, and A. Rabinovic, “Adjusting batch effects in microarray expression data using empirical Bayes methods,” Biostatistics, 8(1):118-127, 2007. doi:10.1093/biostatistics/kxj037.</w:t>
+      </w:r>
+    </w:p>
+    <w:p>
+      <w:pPr>
+        <w:pStyle w:val="BodyText"/>
+      </w:pPr>
+      <w:r>
+        <w:t xml:space="preserve">[9] M. E. Ritchie et al., “limma powers differential expression analyses for RNA-sequencing and microarray studies,” Nucleic Acids Res, 43(7):e47, 2015. doi:10.1093/nar/gkv007.</w:t>
+      </w:r>
+    </w:p>
+    <w:bookmarkEnd w:id="30"/>
     <w:bookmarkEnd w:id="31"/>
-    <w:bookmarkStart w:id="32" w:name="references"/>
-    <w:p>
-      <w:pPr>
-        <w:pStyle w:val="Heading2"/>
-      </w:pPr>
-      <w:r>
-        <w:t xml:space="preserve">References</w:t>
-      </w:r>
-    </w:p>
-    <w:p>
-      <w:pPr>
-        <w:pStyle w:val="FirstParagraph"/>
-      </w:pPr>
-      <w:r>
-        <w:t xml:space="preserve">[1] NCBI GEO, “GSE63060.” https://www.ncbi.nlm.nih.gov/geo/query/acc.cgi?acc=GSE63060</w:t>
-      </w:r>
-    </w:p>
-    <w:p>
-      <w:pPr>
-        <w:pStyle w:val="BodyText"/>
-      </w:pPr>
-      <w:r>
-        <w:t xml:space="preserve">[2] NCBI GEO, “GSE63061.” https://www.ncbi.nlm.nih.gov/geo/query/acc.cgi?acc=GSE63061</w:t>
-      </w:r>
-    </w:p>
-    <w:p>
-      <w:pPr>
-        <w:pStyle w:val="BodyText"/>
-      </w:pPr>
-      <w:r>
-        <w:t xml:space="preserve">[3] AD Knowledge Portal, “Agora (open target nomination resource).” https://agora.adknowledgeportal.org/</w:t>
-      </w:r>
-    </w:p>
-    <w:p>
-      <w:pPr>
-        <w:pStyle w:val="BodyText"/>
-      </w:pPr>
-      <w:r>
-        <w:t xml:space="preserve">[4] AD Knowledge Portal API, “Nominated genes endpoint.” https://agora.adknowledgeportal.org/api/v1/genes/nominated</w:t>
-      </w:r>
-    </w:p>
-    <w:p>
-      <w:pPr>
-        <w:pStyle w:val="BodyText"/>
-      </w:pPr>
-      <w:r>
-        <w:t xml:space="preserve">[5] B. Efron and R. J. Tibshirani, An Introduction to the Bootstrap. Chapman &amp; Hall/CRC, 1993.</w:t>
-      </w:r>
-    </w:p>
-    <w:p>
-      <w:pPr>
-        <w:pStyle w:val="BodyText"/>
-      </w:pPr>
-      <w:r>
-        <w:t xml:space="preserve">[6] Y. Benjamini and Y. Hochberg, “Controlling the false discovery rate: a practical and powerful approach to multiple testing,” Journal of the Royal Statistical Society: Series B, vol. 57, no. 1, pp. 289–300, 1995. doi:10.1111/j.2517-6161.1995.tb02031.x.</w:t>
-      </w:r>
-    </w:p>
-    <w:p>
-      <w:pPr>
-        <w:pStyle w:val="BodyText"/>
-      </w:pPr>
-      <w:r>
-        <w:t xml:space="preserve">[7] D. S. Marcus et al., “Open Access Series of Imaging Studies (OASIS): Cross-sectional MRI Data in Young, Middle Aged, Nondemented, and Demented Older Adults,” Journal of Cognitive Neuroscience, vol. 19, no. 9, pp. 1498–1507, 2007. doi:10.1162/jocn.2007.19.9.1498.</w:t>
-      </w:r>
-    </w:p>
-    <w:bookmarkEnd w:id="32"/>
-    <w:bookmarkEnd w:id="33"/>
     <w:sectPr>
       <w:footnotePr>
         <w:numRestart w:val="eachSect"/>
@@ -2775,8 +2079,117 @@
       </w:pPr>
     </w:lvl>
   </w:abstractNum>
+  <w:abstractNum w:abstractNumId="991">
+    <w:nsid w:val="0000A991"/>
+    <w:multiLevelType w:val="multilevel"/>
+    <w:lvl w:ilvl="0">
+      <w:numFmt w:val="bullet"/>
+      <w:lvlText w:val=""/>
+      <w:lvlJc w:val="left"/>
+      <w:pPr>
+        <w:ind w:left="720" w:hanging="360"/>
+      </w:pPr>
+      <w:rPr>
+        <w:rFonts w:ascii="Symbol" w:hAnsi="Symbol" w:cs="Symbol" w:hint="default"/>
+      </w:rPr>
+    </w:lvl>
+    <w:lvl w:ilvl="1">
+      <w:numFmt w:val="bullet"/>
+      <w:lvlText w:val="o"/>
+      <w:lvlJc w:val="left"/>
+      <w:pPr>
+        <w:ind w:left="1440" w:hanging="360"/>
+      </w:pPr>
+      <w:rPr>
+        <w:rFonts w:ascii="Courier New" w:hAnsi="Courier New" w:cs="Courier New" w:hint="default"/>
+      </w:rPr>
+    </w:lvl>
+    <w:lvl w:ilvl="2">
+      <w:numFmt w:val="bullet"/>
+      <w:lvlText w:val=""/>
+      <w:lvlJc w:val="left"/>
+      <w:pPr>
+        <w:ind w:left="2160" w:hanging="360"/>
+      </w:pPr>
+      <w:rPr>
+        <w:rFonts w:ascii="Wingdings" w:hAnsi="Wingdings" w:cs="Wingdings" w:hint="default"/>
+      </w:rPr>
+    </w:lvl>
+    <w:lvl w:ilvl="3">
+      <w:numFmt w:val="bullet"/>
+      <w:lvlText w:val=""/>
+      <w:lvlJc w:val="left"/>
+      <w:pPr>
+        <w:ind w:left="2880" w:hanging="360"/>
+      </w:pPr>
+      <w:rPr>
+        <w:rFonts w:ascii="Symbol" w:hAnsi="Symbol" w:cs="Symbol" w:hint="default"/>
+      </w:rPr>
+    </w:lvl>
+    <w:lvl w:ilvl="4">
+      <w:numFmt w:val="bullet"/>
+      <w:lvlText w:val="o"/>
+      <w:lvlJc w:val="left"/>
+      <w:pPr>
+        <w:ind w:left="3600" w:hanging="360"/>
+      </w:pPr>
+      <w:rPr>
+        <w:rFonts w:ascii="Courier New" w:hAnsi="Courier New" w:cs="Courier New" w:hint="default"/>
+      </w:rPr>
+    </w:lvl>
+    <w:lvl w:ilvl="5">
+      <w:numFmt w:val="bullet"/>
+      <w:lvlText w:val=""/>
+      <w:lvlJc w:val="left"/>
+      <w:pPr>
+        <w:ind w:left="4320" w:hanging="360"/>
+      </w:pPr>
+      <w:rPr>
+        <w:rFonts w:ascii="Wingdings" w:hAnsi="Wingdings" w:cs="Wingdings" w:hint="default"/>
+      </w:rPr>
+    </w:lvl>
+    <w:lvl w:ilvl="6">
+      <w:numFmt w:val="bullet"/>
+      <w:lvlText w:val=""/>
+      <w:lvlJc w:val="left"/>
+      <w:pPr>
+        <w:ind w:left="5040" w:hanging="360"/>
+      </w:pPr>
+      <w:rPr>
+        <w:rFonts w:ascii="Symbol" w:hAnsi="Symbol" w:cs="Symbol" w:hint="default"/>
+      </w:rPr>
+    </w:lvl>
+    <w:lvl w:ilvl="7">
+      <w:numFmt w:val="bullet"/>
+      <w:lvlText w:val="o"/>
+      <w:lvlJc w:val="left"/>
+      <w:pPr>
+        <w:ind w:left="5760" w:hanging="360"/>
+      </w:pPr>
+      <w:rPr>
+        <w:rFonts w:ascii="Courier New" w:hAnsi="Courier New" w:cs="Courier New" w:hint="default"/>
+      </w:rPr>
+    </w:lvl>
+    <w:lvl w:ilvl="8">
+      <w:numFmt w:val="bullet"/>
+      <w:lvlText w:val=""/>
+      <w:lvlJc w:val="left"/>
+      <w:pPr>
+        <w:ind w:left="6480" w:hanging="360"/>
+      </w:pPr>
+      <w:rPr>
+        <w:rFonts w:ascii="Wingdings" w:hAnsi="Wingdings" w:cs="Wingdings" w:hint="default"/>
+      </w:rPr>
+    </w:lvl>
+  </w:abstractNum>
   <w:num w:numId="1000">
     <w:abstractNumId w:val="990"/>
+  </w:num>
+  <w:num w:numId="1001">
+    <w:abstractNumId w:val="991"/>
+  </w:num>
+  <w:num w:numId="1002">
+    <w:abstractNumId w:val="991"/>
   </w:num>
 </w:numbering>
 </file>

</xml_diff>

<commit_message>
v5: leakage-safe null consistency, AMP-AD feature ablations, and transductive ComBat sensitivity framing
</commit_message>
<xml_diff>
--- a/outputs/open_phaseA_final_paper.docx
+++ b/outputs/open_phaseA_final_paper.docx
@@ -2,13 +2,13 @@
 <file path=word/document.xml><?xml version="1.0" encoding="utf-8"?>
 <w:document xmlns:w="http://schemas.openxmlformats.org/wordprocessingml/2006/main" xmlns:m="http://schemas.openxmlformats.org/officeDocument/2006/math" xmlns:r="http://schemas.openxmlformats.org/officeDocument/2006/relationships" xmlns:o="urn:schemas-microsoft-com:office:office" xmlns:v="urn:schemas-microsoft-com:vml" xmlns:w10="urn:schemas-microsoft-com:office:word" xmlns:a="http://schemas.openxmlformats.org/drawingml/2006/main" xmlns:pic="http://schemas.openxmlformats.org/drawingml/2006/picture" xmlns:wp="http://schemas.openxmlformats.org/drawingml/2006/wordprocessingDrawing">
   <w:body>
-    <w:bookmarkStart w:id="31" w:name="X24c438f88dbabf5e62d49ad14527bd0fd19a777"/>
+    <w:bookmarkStart w:id="30" w:name="Xb0a5d16fb8d506eb80daccc772f389258a452f3"/>
     <w:p>
       <w:pPr>
         <w:pStyle w:val="Heading1"/>
       </w:pPr>
       <w:r>
-        <w:t xml:space="preserve">Leakage-Safe Cross-Cohort Alzheimer’s Blood Transcriptomic Prediction: A Reproducible v4 Transfer Stress-Test with DE Features and ComBat</w:t>
+        <w:t xml:space="preserve">Leakage-Safe Cross-Cohort Alzheimer’s Blood Transcriptomic Prediction on Open Data: v5 with Consistent Permutation Nulls and AMP-AD Feature Ablations</w:t>
       </w:r>
     </w:p>
     <w:p>
@@ -37,7 +37,7 @@
         <w:pStyle w:val="FirstParagraph"/>
       </w:pPr>
       <w:r>
-        <w:t xml:space="preserve">Cross-cohort Alzheimer’s disease (AD) transcriptomic prediction is highly sensitive to cohort shift, feature construction, and leakage-prone evaluation. We present a fully open, reproducible v4 stress-test on GEO blood cohorts GSE63060 and GSE63061 with strict target-holdout evaluation, directional transfer (A-&gt;B and B-&gt;A), and explicit null controls. Relative to earlier versions, v4 adds (i) differential-expression-based feature selection (DE t-test on target-train only), (ii) an explicit ComBat harmonization arm for pooled source+target training, and (iii) a 100x permutation-averaged null baseline to stabilize chance-level calibration. Across settings, null AUROC distributions center near 0.5 (mean range 0.4887-0.4986), addressing reviewer concerns about null behavior. In the DE-feature setting, target_only remains significantly above null in both directions (e.g., delta AUROC +0.4406 and +0.4765 in GSE63061-&gt;GSE63060; BH-adjusted p&lt;0.001), while transfer effects remain direction-dependent. ComBat-pooled transfer shows a significant uplift in one direction (GSE63060-&gt;GSE63061, DE-1000: delta +0.1060, BH=0.016) but not uniformly across all settings. Conservative conclusion: robust leakage-safe target-domain signal is reproducible; transfer gains are conditional and should be reported with harmonization and strict uncertainty controls.</w:t>
+        <w:t xml:space="preserve">Cross-cohort Alzheimer’s disease (AD) blood transcriptomic prediction is sensitive to cohort shift and vulnerable to over-interpretation when evaluation controls are inconsistent. We present a fully open v5 revision on GEO cohorts GSE63060 and GSE63061 that directly addresses reviewer blockers: (i) consistent null reporting based on permutation-AUROC distributions, (ii) explicit separation of leakage-safe primary analysis from transductive ComBat sensitivity analysis, and (iii) model-integrated AMP-AD feature ablations. We evaluate target_only, source_only, and pooled source+target raw training under leakage-safe target-holdout splits; ComBat on stacked train+test is retained as sensitivity only. Feature modes are variance, DE t-test, Agora-only, and DE-Agora intersection. Across all settings, mean permutation-null AUROC is near chance (0.4887-0.5132). In primary analyses, target_only outperforms permutation-null means in both directions and multiple feature settings after BH correction. Conservative conclusion: leakage-safe target-domain signal is reproducible, transfer gains are direction-dependent, and transductive harmonization outcomes should not be used as primary evidence.</w:t>
       </w:r>
     </w:p>
     <w:bookmarkEnd w:id="9"/>
@@ -55,7 +55,7 @@
         <w:pStyle w:val="FirstParagraph"/>
       </w:pPr>
       <w:r>
-        <w:t xml:space="preserve">Public AD blood transcriptomic cohorts are useful for reproducible benchmarking but vulnerable to overclaiming when transfer is evaluated without strict controls. In particular, three recurring issues affect interpretation: test leakage, underpowered null modeling, and unmodeled cross-study batch effects.</w:t>
+        <w:t xml:space="preserve">Public AD transcriptomic benchmarks can appear strong while still failing key validity checks: leakage-safe boundaries, null calibration consistency, and explicit handling of cross-study harmonization assumptions. This revision focuses on evaluation correctness and claim discipline rather than model novelty.</w:t>
       </w:r>
     </w:p>
     <w:p>
@@ -63,37 +63,29 @@
         <w:pStyle w:val="BodyText"/>
       </w:pPr>
       <w:r>
-        <w:t xml:space="preserve">This work is positioned as an evaluation-and-reproducibility contribution rather than a new classifier architecture. We provide a transparent stress-test protocol that reports target-only, source-only, pooled transfer (raw and ComBat-harmonized), and permutation null arms under the same split.</w:t>
-      </w:r>
-    </w:p>
-    <w:p>
-      <w:pPr>
-        <w:pStyle w:val="BodyText"/>
-      </w:pPr>
-      <w:r>
-        <w:t xml:space="preserve">Primary questions:</w:t>
-      </w:r>
-      <w:r>
-        <w:t xml:space="preserve"> </w:t>
-      </w:r>
-      <w:r>
-        <w:t xml:space="preserve">1) Does target-domain signal remain above chance under leakage-safe evaluation?</w:t>
-      </w:r>
-      <w:r>
-        <w:t xml:space="preserve"> </w:t>
-      </w:r>
-      <w:r>
-        <w:t xml:space="preserve">2) Does cross-cohort transfer improve target performance, and is that improvement direction-stable?</w:t>
-      </w:r>
-      <w:r>
-        <w:t xml:space="preserve"> </w:t>
-      </w:r>
-      <w:r>
-        <w:t xml:space="preserve">3) How do DE features and ComBat harmonization change transfer conclusions versus variance-only baselines?</w:t>
+        <w:t xml:space="preserve">Primary goals:</w:t>
+      </w:r>
+      <w:r>
+        <w:t xml:space="preserve"> </w:t>
+      </w:r>
+      <w:r>
+        <w:t xml:space="preserve">1) verify leakage-safe target-domain signal against a consistent permutation null;</w:t>
+      </w:r>
+      <w:r>
+        <w:t xml:space="preserve"> </w:t>
+      </w:r>
+      <w:r>
+        <w:t xml:space="preserve">2) quantify directional transfer behavior under source_only and pooled source+target training;</w:t>
+      </w:r>
+      <w:r>
+        <w:t xml:space="preserve"> </w:t>
+      </w:r>
+      <w:r>
+        <w:t xml:space="preserve">3) test whether AMP-AD-informed feature restrictions change transfer patterns.</w:t>
       </w:r>
     </w:p>
     <w:bookmarkEnd w:id="10"/>
-    <w:bookmarkStart w:id="14" w:name="data"/>
+    <w:bookmarkStart w:id="13" w:name="data"/>
     <w:p>
       <w:pPr>
         <w:pStyle w:val="Heading2"/>
@@ -102,13 +94,13 @@
         <w:t xml:space="preserve">2. Data</w:t>
       </w:r>
     </w:p>
-    <w:bookmarkStart w:id="11" w:name="geo-predictive-cohorts"/>
+    <w:bookmarkStart w:id="11" w:name="predictive-cohorts"/>
     <w:p>
       <w:pPr>
         <w:pStyle w:val="Heading3"/>
       </w:pPr>
       <w:r>
-        <w:t xml:space="preserve">2.1 GEO predictive cohorts</w:t>
+        <w:t xml:space="preserve">2.1 Predictive cohorts</w:t>
       </w:r>
     </w:p>
     <w:p>
@@ -120,7 +112,7 @@
         </w:numPr>
       </w:pPr>
       <w:r>
-        <w:t xml:space="preserve">GSE63060 and GSE63061 (NCBI GEO series_matrix) [1,2]</w:t>
+        <w:t xml:space="preserve">GSE63060 (GPL6947) and GSE63061 (GPL10558) from NCBI GEO [1,2]</w:t>
       </w:r>
     </w:p>
     <w:p>
@@ -132,29 +124,17 @@
         </w:numPr>
       </w:pPr>
       <w:r>
-        <w:t xml:space="preserve">Binary labels retained: AD vs CTL</w:t>
-      </w:r>
-    </w:p>
-    <w:p>
-      <w:pPr>
-        <w:pStyle w:val="Compact"/>
-        <w:numPr>
-          <w:ilvl w:val="0"/>
-          <w:numId w:val="1001"/>
-        </w:numPr>
-      </w:pPr>
-      <w:r>
-        <w:t xml:space="preserve">Ambiguous statuses excluded (e.g., MCI/transition/non-definitive labels)</w:t>
+        <w:t xml:space="preserve">AD vs CTL labels only; ambiguous statuses removed</w:t>
       </w:r>
     </w:p>
     <w:bookmarkEnd w:id="11"/>
-    <w:bookmarkStart w:id="12" w:name="amp-ad-open-context"/>
+    <w:bookmarkStart w:id="12" w:name="amp-ad-open-context-and-integration"/>
     <w:p>
       <w:pPr>
         <w:pStyle w:val="Heading3"/>
       </w:pPr>
       <w:r>
-        <w:t xml:space="preserve">2.2 AMP-AD open context</w:t>
+        <w:t xml:space="preserve">2.2 AMP-AD open context and integration</w:t>
       </w:r>
     </w:p>
     <w:p>
@@ -162,17 +142,39 @@
         <w:pStyle w:val="FirstParagraph"/>
       </w:pPr>
       <w:r>
-        <w:t xml:space="preserve">We ingest Agora nominated targets [3,4] to retain AD biological context and reproducibility linkage. In the open snapshot used here, the resource includes 955 unique nominated genes across 1173 nomination rows, with strong RNA/Protein/Genetics representation.</w:t>
+        <w:t xml:space="preserve">We ingest open Agora nominated targets [3,4]. In v5, Agora is integrated into modeling through two explicit feature modes:</w:t>
+      </w:r>
+      <w:r>
+        <w:t xml:space="preserve"> </w:t>
+      </w:r>
+      <w:r>
+        <w:t xml:space="preserve">- agora_only: probe set restricted to probes mapping to Agora symbols</w:t>
+      </w:r>
+      <w:r>
+        <w:t xml:space="preserve"> </w:t>
+      </w:r>
+      <w:r>
+        <w:t xml:space="preserve">- de_agora_intersection: DE-ranked probes restricted to Agora-mapped probes</w:t>
       </w:r>
     </w:p>
     <w:bookmarkEnd w:id="12"/>
-    <w:bookmarkStart w:id="13" w:name="cohort-direction-setup"/>
+    <w:bookmarkEnd w:id="13"/>
+    <w:bookmarkStart w:id="19" w:name="methods"/>
+    <w:p>
+      <w:pPr>
+        <w:pStyle w:val="Heading2"/>
+      </w:pPr>
+      <w:r>
+        <w:t xml:space="preserve">3. Methods</w:t>
+      </w:r>
+    </w:p>
+    <w:bookmarkStart w:id="14" w:name="leakage-safe-primary-arms"/>
     <w:p>
       <w:pPr>
         <w:pStyle w:val="Heading3"/>
       </w:pPr>
       <w:r>
-        <w:t xml:space="preserve">2.3 Cohort-direction setup</w:t>
+        <w:t xml:space="preserve">3.1 Leakage-safe primary arms</w:t>
       </w:r>
     </w:p>
     <w:p>
@@ -180,577 +182,35 @@
         <w:pStyle w:val="FirstParagraph"/>
       </w:pPr>
       <w:r>
-        <w:t xml:space="preserve">Each cohort serves as source and target (GSE63060-&gt;GSE63061 and GSE63061-&gt;GSE63060). Target data are split into train/test (stratified, random_state=42); all model comparison is on target test only.</w:t>
-      </w:r>
-    </w:p>
-    <w:bookmarkEnd w:id="13"/>
+        <w:t xml:space="preserve">For each direction (A-&gt;B and B-&gt;A), using target holdout split (stratified, random_state=42):</w:t>
+      </w:r>
+      <w:r>
+        <w:t xml:space="preserve"> </w:t>
+      </w:r>
+      <w:r>
+        <w:t xml:space="preserve">- target_only: train on target-train, test on target-test</w:t>
+      </w:r>
+      <w:r>
+        <w:t xml:space="preserve"> </w:t>
+      </w:r>
+      <w:r>
+        <w:t xml:space="preserve">- source_only: train on source, test on target-test</w:t>
+      </w:r>
+      <w:r>
+        <w:t xml:space="preserve"> </w:t>
+      </w:r>
+      <w:r>
+        <w:t xml:space="preserve">- source_plus_target_raw: train on source + target-train, test on target-test</w:t>
+      </w:r>
+    </w:p>
     <w:bookmarkEnd w:id="14"/>
-    <w:bookmarkStart w:id="20" w:name="methods"/>
-    <w:p>
-      <w:pPr>
-        <w:pStyle w:val="Heading2"/>
-      </w:pPr>
-      <w:r>
-        <w:t xml:space="preserve">3. Methods</w:t>
-      </w:r>
-    </w:p>
-    <w:bookmarkStart w:id="15" w:name="leakage-safe-evaluation-design"/>
+    <w:bookmarkStart w:id="15" w:name="transductive-sensitivity-arm-not-primary"/>
     <w:p>
       <w:pPr>
         <w:pStyle w:val="Heading3"/>
       </w:pPr>
       <w:r>
-        <w:t xml:space="preserve">3.1 Leakage-safe evaluation design</w:t>
-      </w:r>
-    </w:p>
-    <w:p>
-      <w:pPr>
-        <w:pStyle w:val="FirstParagraph"/>
-      </w:pPr>
-      <w:r>
-        <w:t xml:space="preserve">For each direction and feature setting:</w:t>
-      </w:r>
-      <w:r>
-        <w:t xml:space="preserve"> </w:t>
-      </w:r>
-      <w:r>
-        <w:t xml:space="preserve">- target_only: train on target-train, evaluate on target-test</w:t>
-      </w:r>
-      <w:r>
-        <w:t xml:space="preserve"> </w:t>
-      </w:r>
-      <w:r>
-        <w:t xml:space="preserve">- source_only: train on source, evaluate on target-test</w:t>
-      </w:r>
-      <w:r>
-        <w:t xml:space="preserve"> </w:t>
-      </w:r>
-      <w:r>
-        <w:t xml:space="preserve">- source_plus_target_raw: train on concatenated source + target-train (no harmonization)</w:t>
-      </w:r>
-      <w:r>
-        <w:t xml:space="preserve"> </w:t>
-      </w:r>
-      <w:r>
-        <w:t xml:space="preserve">- source_plus_target_combat: ComBat-harmonized pooled training/evaluation features</w:t>
-      </w:r>
-      <w:r>
-        <w:t xml:space="preserve"> </w:t>
-      </w:r>
-      <w:r>
-        <w:t xml:space="preserve">- null_label_permutation_avg100: average prediction from 100 label-permuted target-only models</w:t>
-      </w:r>
-    </w:p>
-    <w:p>
-      <w:pPr>
-        <w:pStyle w:val="BodyText"/>
-      </w:pPr>
-      <w:r>
-        <w:t xml:space="preserve">No target-test labels are used in fitting, feature ranking, or null permutation generation.</w:t>
-      </w:r>
-    </w:p>
-    <w:bookmarkEnd w:id="15"/>
-    <w:bookmarkStart w:id="16" w:name="feature-selection"/>
-    <w:p>
-      <w:pPr>
-        <w:pStyle w:val="Heading3"/>
-      </w:pPr>
-      <w:r>
-        <w:t xml:space="preserve">3.2 Feature selection</w:t>
-      </w:r>
-    </w:p>
-    <w:p>
-      <w:pPr>
-        <w:pStyle w:val="FirstParagraph"/>
-      </w:pPr>
-      <w:r>
-        <w:t xml:space="preserve">Feature modes:</w:t>
-      </w:r>
-      <w:r>
-        <w:t xml:space="preserve"> </w:t>
-      </w:r>
-      <w:r>
-        <w:t xml:space="preserve">- var: top-N variance genes</w:t>
-      </w:r>
-      <w:r>
-        <w:t xml:space="preserve"> </w:t>
-      </w:r>
-      <w:r>
-        <w:t xml:space="preserve">- de_ttest: top-N absolute t-statistic genes from AD vs CTL on target-train only (a lightweight DE proxy aligned with limma-style differential-expression practice [7,9])</w:t>
-      </w:r>
-    </w:p>
-    <w:p>
-      <w:pPr>
-        <w:pStyle w:val="BodyText"/>
-      </w:pPr>
-      <w:r>
-        <w:t xml:space="preserve">N in {200, 1000}. Gene selection is always performed after split, using only target-train labels.</w:t>
-      </w:r>
-    </w:p>
-    <w:bookmarkEnd w:id="16"/>
-    <w:bookmarkStart w:id="17" w:name="combat-harmonization"/>
-    <w:p>
-      <w:pPr>
-        <w:pStyle w:val="Heading3"/>
-      </w:pPr>
-      <w:r>
-        <w:t xml:space="preserve">3.3 ComBat harmonization</w:t>
-      </w:r>
-    </w:p>
-    <w:p>
-      <w:pPr>
-        <w:pStyle w:val="FirstParagraph"/>
-      </w:pPr>
-      <w:r>
-        <w:t xml:space="preserve">For pooled transfer analysis, we apply ComBat [8] using study-of-origin batch labels (source vs target) on stacked expression matrices (feature-only adjustment, no label input to ComBat). We report raw pooled and ComBat-pooled outcomes separately.</w:t>
-      </w:r>
-    </w:p>
-    <w:bookmarkEnd w:id="17"/>
-    <w:bookmarkStart w:id="18" w:name="predictive-model"/>
-    <w:p>
-      <w:pPr>
-        <w:pStyle w:val="Heading3"/>
-      </w:pPr>
-      <w:r>
-        <w:t xml:space="preserve">3.4 Predictive model</w:t>
-      </w:r>
-    </w:p>
-    <w:p>
-      <w:pPr>
-        <w:pStyle w:val="FirstParagraph"/>
-      </w:pPr>
-      <w:r>
-        <w:t xml:space="preserve">Class-balanced logistic regression baseline (liblinear):</w:t>
-      </w:r>
-    </w:p>
-    <w:p>
-      <w:pPr>
-        <w:pStyle w:val="BodyText"/>
-      </w:pPr>
-      <m:oMathPara>
-        <m:oMathParaPr>
-          <m:jc m:val="center"/>
-        </m:oMathParaPr>
-        <m:oMath>
-          <m:r>
-            <m:t>P</m:t>
-          </m:r>
-          <m:r>
-            <m:rPr>
-              <m:sty m:val="p"/>
-            </m:rPr>
-            <m:t>(</m:t>
-          </m:r>
-          <m:r>
-            <m:t>y</m:t>
-          </m:r>
-          <m:r>
-            <m:rPr>
-              <m:sty m:val="p"/>
-            </m:rPr>
-            <m:t>=</m:t>
-          </m:r>
-          <m:r>
-            <m:t>1</m:t>
-          </m:r>
-          <m:r>
-            <m:rPr>
-              <m:sty m:val="p"/>
-            </m:rPr>
-            <m:t>∣</m:t>
-          </m:r>
-          <m:r>
-            <m:t>x</m:t>
-          </m:r>
-          <m:r>
-            <m:rPr>
-              <m:sty m:val="p"/>
-            </m:rPr>
-            <m:t>)</m:t>
-          </m:r>
-          <m:r>
-            <m:rPr>
-              <m:sty m:val="p"/>
-            </m:rPr>
-            <m:t>=</m:t>
-          </m:r>
-          <m:r>
-            <m:t>σ</m:t>
-          </m:r>
-          <m:r>
-            <m:rPr>
-              <m:sty m:val="p"/>
-            </m:rPr>
-            <m:t>(</m:t>
-          </m:r>
-          <m:sSup>
-            <m:e>
-              <m:r>
-                <m:t>w</m:t>
-              </m:r>
-            </m:e>
-            <m:sup>
-              <m:r>
-                <m:rPr>
-                  <m:sty m:val="p"/>
-                </m:rPr>
-                <m:t>⊤</m:t>
-              </m:r>
-            </m:sup>
-          </m:sSup>
-          <m:r>
-            <m:t>x</m:t>
-          </m:r>
-          <m:r>
-            <m:rPr>
-              <m:sty m:val="p"/>
-            </m:rPr>
-            <m:t>+</m:t>
-          </m:r>
-          <m:r>
-            <m:t>b</m:t>
-          </m:r>
-          <m:r>
-            <m:rPr>
-              <m:sty m:val="p"/>
-            </m:rPr>
-            <m:t>)</m:t>
-          </m:r>
-          <m:r>
-            <m:rPr>
-              <m:sty m:val="p"/>
-            </m:rPr>
-            <m:t>,</m:t>
-          </m:r>
-          <m:r>
-            <m:t> </m:t>
-          </m:r>
-          <m:r>
-            <m:t>σ</m:t>
-          </m:r>
-          <m:r>
-            <m:rPr>
-              <m:sty m:val="p"/>
-            </m:rPr>
-            <m:t>(</m:t>
-          </m:r>
-          <m:r>
-            <m:t>z</m:t>
-          </m:r>
-          <m:r>
-            <m:rPr>
-              <m:sty m:val="p"/>
-            </m:rPr>
-            <m:t>)</m:t>
-          </m:r>
-          <m:r>
-            <m:rPr>
-              <m:sty m:val="p"/>
-            </m:rPr>
-            <m:t>=</m:t>
-          </m:r>
-          <m:f>
-            <m:fPr>
-              <m:type m:val="bar"/>
-            </m:fPr>
-            <m:num>
-              <m:r>
-                <m:t>1</m:t>
-              </m:r>
-            </m:num>
-            <m:den>
-              <m:r>
-                <m:t>1</m:t>
-              </m:r>
-              <m:r>
-                <m:rPr>
-                  <m:sty m:val="p"/>
-                </m:rPr>
-                <m:t>+</m:t>
-              </m:r>
-              <m:sSup>
-                <m:e>
-                  <m:r>
-                    <m:t>e</m:t>
-                  </m:r>
-                </m:e>
-                <m:sup>
-                  <m:r>
-                    <m:rPr>
-                      <m:sty m:val="p"/>
-                    </m:rPr>
-                    <m:t>−</m:t>
-                  </m:r>
-                  <m:r>
-                    <m:t>z</m:t>
-                  </m:r>
-                </m:sup>
-              </m:sSup>
-            </m:den>
-          </m:f>
-          <m:r>
-            <m:rPr>
-              <m:sty m:val="p"/>
-            </m:rPr>
-            <m:t>.</m:t>
-          </m:r>
-        </m:oMath>
-      </m:oMathPara>
-    </w:p>
-    <w:p>
-      <w:pPr>
-        <w:pStyle w:val="FirstParagraph"/>
-      </w:pPr>
-      <m:oMathPara>
-        <m:oMathParaPr>
-          <m:jc m:val="center"/>
-        </m:oMathParaPr>
-        <m:oMath>
-          <m:r>
-            <m:rPr>
-              <m:scr m:val="script"/>
-              <m:sty m:val="p"/>
-            </m:rPr>
-            <m:t>L</m:t>
-          </m:r>
-          <m:r>
-            <m:rPr>
-              <m:sty m:val="p"/>
-            </m:rPr>
-            <m:t>(</m:t>
-          </m:r>
-          <m:r>
-            <m:t>w</m:t>
-          </m:r>
-          <m:r>
-            <m:rPr>
-              <m:sty m:val="p"/>
-            </m:rPr>
-            <m:t>,</m:t>
-          </m:r>
-          <m:r>
-            <m:t>b</m:t>
-          </m:r>
-          <m:r>
-            <m:rPr>
-              <m:sty m:val="p"/>
-            </m:rPr>
-            <m:t>)</m:t>
-          </m:r>
-          <m:r>
-            <m:rPr>
-              <m:sty m:val="p"/>
-            </m:rPr>
-            <m:t>=</m:t>
-          </m:r>
-          <m:r>
-            <m:rPr>
-              <m:sty m:val="p"/>
-            </m:rPr>
-            <m:t>−</m:t>
-          </m:r>
-          <m:nary>
-            <m:naryPr>
-              <m:chr m:val="∑"/>
-              <m:limLoc m:val="undOvr"/>
-              <m:subHide m:val="off"/>
-              <m:supHide m:val="off"/>
-            </m:naryPr>
-            <m:sub>
-              <m:r>
-                <m:t>i</m:t>
-              </m:r>
-              <m:r>
-                <m:rPr>
-                  <m:sty m:val="p"/>
-                </m:rPr>
-                <m:t>=</m:t>
-              </m:r>
-              <m:r>
-                <m:t>1</m:t>
-              </m:r>
-            </m:sub>
-            <m:sup>
-              <m:r>
-                <m:t>n</m:t>
-              </m:r>
-            </m:sup>
-            <m:e>
-              <m:d>
-                <m:dPr>
-                  <m:begChr m:val="["/>
-                  <m:sepChr m:val=""/>
-                  <m:endChr m:val="]"/>
-                  <m:grow/>
-                </m:dPr>
-                <m:e>
-                  <m:sSub>
-                    <m:e>
-                      <m:r>
-                        <m:t>y</m:t>
-                      </m:r>
-                    </m:e>
-                    <m:sub>
-                      <m:r>
-                        <m:t>i</m:t>
-                      </m:r>
-                    </m:sub>
-                  </m:sSub>
-                  <m:r>
-                    <m:rPr>
-                      <m:sty m:val="p"/>
-                    </m:rPr>
-                    <m:t>log</m:t>
-                  </m:r>
-                  <m:sSub>
-                    <m:e>
-                      <m:r>
-                        <m:t>p</m:t>
-                      </m:r>
-                    </m:e>
-                    <m:sub>
-                      <m:r>
-                        <m:t>i</m:t>
-                      </m:r>
-                    </m:sub>
-                  </m:sSub>
-                  <m:r>
-                    <m:rPr>
-                      <m:sty m:val="p"/>
-                    </m:rPr>
-                    <m:t>+</m:t>
-                  </m:r>
-                  <m:r>
-                    <m:rPr>
-                      <m:sty m:val="p"/>
-                    </m:rPr>
-                    <m:t>(</m:t>
-                  </m:r>
-                  <m:r>
-                    <m:t>1</m:t>
-                  </m:r>
-                  <m:r>
-                    <m:rPr>
-                      <m:sty m:val="p"/>
-                    </m:rPr>
-                    <m:t>−</m:t>
-                  </m:r>
-                  <m:sSub>
-                    <m:e>
-                      <m:r>
-                        <m:t>y</m:t>
-                      </m:r>
-                    </m:e>
-                    <m:sub>
-                      <m:r>
-                        <m:t>i</m:t>
-                      </m:r>
-                    </m:sub>
-                  </m:sSub>
-                  <m:r>
-                    <m:rPr>
-                      <m:sty m:val="p"/>
-                    </m:rPr>
-                    <m:t>)</m:t>
-                  </m:r>
-                  <m:r>
-                    <m:rPr>
-                      <m:sty m:val="p"/>
-                    </m:rPr>
-                    <m:t>log</m:t>
-                  </m:r>
-                  <m:r>
-                    <m:rPr>
-                      <m:sty m:val="p"/>
-                    </m:rPr>
-                    <m:t>(</m:t>
-                  </m:r>
-                  <m:r>
-                    <m:t>1</m:t>
-                  </m:r>
-                  <m:r>
-                    <m:rPr>
-                      <m:sty m:val="p"/>
-                    </m:rPr>
-                    <m:t>−</m:t>
-                  </m:r>
-                  <m:sSub>
-                    <m:e>
-                      <m:r>
-                        <m:t>p</m:t>
-                      </m:r>
-                    </m:e>
-                    <m:sub>
-                      <m:r>
-                        <m:t>i</m:t>
-                      </m:r>
-                    </m:sub>
-                  </m:sSub>
-                  <m:r>
-                    <m:rPr>
-                      <m:sty m:val="p"/>
-                    </m:rPr>
-                    <m:t>)</m:t>
-                  </m:r>
-                </m:e>
-              </m:d>
-            </m:e>
-          </m:nary>
-          <m:r>
-            <m:rPr>
-              <m:sty m:val="p"/>
-            </m:rPr>
-            <m:t>+</m:t>
-          </m:r>
-          <m:r>
-            <m:t>λ</m:t>
-          </m:r>
-          <m:r>
-            <m:rPr>
-              <m:sty m:val="p"/>
-            </m:rPr>
-            <m:t>∥</m:t>
-          </m:r>
-          <m:r>
-            <m:t>w</m:t>
-          </m:r>
-          <m:sSubSup>
-            <m:e>
-              <m:r>
-                <m:rPr>
-                  <m:sty m:val="p"/>
-                </m:rPr>
-                <m:t>∥</m:t>
-              </m:r>
-            </m:e>
-            <m:sub>
-              <m:r>
-                <m:t>2</m:t>
-              </m:r>
-            </m:sub>
-            <m:sup>
-              <m:r>
-                <m:t>2</m:t>
-              </m:r>
-            </m:sup>
-          </m:sSubSup>
-          <m:r>
-            <m:rPr>
-              <m:sty m:val="p"/>
-            </m:rPr>
-            <m:t>.</m:t>
-          </m:r>
-        </m:oMath>
-      </m:oMathPara>
-    </w:p>
-    <w:bookmarkEnd w:id="18"/>
-    <w:bookmarkStart w:id="19" w:name="inference"/>
-    <w:p>
-      <w:pPr>
-        <w:pStyle w:val="Heading3"/>
-      </w:pPr>
-      <w:r>
-        <w:t xml:space="preserve">3.5 Inference</w:t>
+        <w:t xml:space="preserve">3.2 Transductive sensitivity arm (not primary)</w:t>
       </w:r>
     </w:p>
     <w:p>
@@ -762,7 +222,23 @@
         </w:numPr>
       </w:pPr>
       <w:r>
-        <w:t xml:space="preserve">AUROC (primary), AUPRC, balanced accuracy, Brier</w:t>
+        <w:t xml:space="preserve">source_plus_target_combat_transductive: ComBat on stacked train+test features (no labels), then model fit/eval.</w:t>
+      </w:r>
+      <w:r>
+        <w:t xml:space="preserve"> </w:t>
+      </w:r>
+      <w:r>
+        <w:t xml:space="preserve">This arm is reported as sensitivity only and excluded from leakage-safe primary claims.</w:t>
+      </w:r>
+    </w:p>
+    <w:bookmarkEnd w:id="15"/>
+    <w:bookmarkStart w:id="16" w:name="feature-modes"/>
+    <w:p>
+      <w:pPr>
+        <w:pStyle w:val="Heading3"/>
+      </w:pPr>
+      <w:r>
+        <w:t xml:space="preserve">3.3 Feature modes</w:t>
       </w:r>
     </w:p>
     <w:p>
@@ -770,11 +246,11 @@
         <w:pStyle w:val="Compact"/>
         <w:numPr>
           <w:ilvl w:val="0"/>
-          <w:numId w:val="1002"/>
+          <w:numId w:val="1003"/>
         </w:numPr>
       </w:pPr>
       <w:r>
-        <w:t xml:space="preserve">Bootstrap CI for AUROC [5]</w:t>
+        <w:t xml:space="preserve">var: top-N variance probes</w:t>
       </w:r>
     </w:p>
     <w:p>
@@ -782,11 +258,11 @@
         <w:pStyle w:val="Compact"/>
         <w:numPr>
           <w:ilvl w:val="0"/>
-          <w:numId w:val="1002"/>
+          <w:numId w:val="1003"/>
         </w:numPr>
       </w:pPr>
       <w:r>
-        <w:t xml:space="preserve">Paired bootstrap deltas for arm comparisons</w:t>
+        <w:t xml:space="preserve">de_ttest: top-N absolute t-statistic probes (AD vs CTL on target-train only)</w:t>
       </w:r>
     </w:p>
     <w:p>
@@ -794,16 +270,72 @@
         <w:pStyle w:val="Compact"/>
         <w:numPr>
           <w:ilvl w:val="0"/>
-          <w:numId w:val="1002"/>
+          <w:numId w:val="1003"/>
         </w:numPr>
       </w:pPr>
       <w:r>
-        <w:t xml:space="preserve">Benjamini-Hochberg correction [6]</w:t>
-      </w:r>
-    </w:p>
+        <w:t xml:space="preserve">agora_only: top-N probes from Agora-mapped subset</w:t>
+      </w:r>
+    </w:p>
+    <w:p>
+      <w:pPr>
+        <w:pStyle w:val="Compact"/>
+        <w:numPr>
+          <w:ilvl w:val="0"/>
+          <w:numId w:val="1003"/>
+        </w:numPr>
+      </w:pPr>
+      <w:r>
+        <w:t xml:space="preserve">de_agora_intersection: top-N DE probes within the overlap of DE-ranked and Agora-mapped probes</w:t>
+      </w:r>
+    </w:p>
+    <w:p>
+      <w:pPr>
+        <w:pStyle w:val="FirstParagraph"/>
+      </w:pPr>
+      <w:r>
+        <w:t xml:space="preserve">N in {200, 1000}.</w:t>
+      </w:r>
+    </w:p>
+    <w:bookmarkEnd w:id="16"/>
+    <w:bookmarkStart w:id="17" w:name="null-policy-v5-consistency-fix"/>
+    <w:p>
+      <w:pPr>
+        <w:pStyle w:val="Heading3"/>
+      </w:pPr>
+      <w:r>
+        <w:t xml:space="preserve">3.4 Null policy (v5 consistency fix)</w:t>
+      </w:r>
+    </w:p>
+    <w:p>
+      <w:pPr>
+        <w:pStyle w:val="FirstParagraph"/>
+      </w:pPr>
+      <w:r>
+        <w:t xml:space="preserve">Primary null is the distribution of AUROC values from 100 label-permuted training runs per setting. Reported null in tables is the mean of that permutation-AUROC distribution (not AUROC of averaged probabilities).</w:t>
+      </w:r>
+    </w:p>
+    <w:bookmarkEnd w:id="17"/>
+    <w:bookmarkStart w:id="18" w:name="model-and-inference"/>
+    <w:p>
+      <w:pPr>
+        <w:pStyle w:val="Heading3"/>
+      </w:pPr>
+      <w:r>
+        <w:t xml:space="preserve">3.5 Model and inference</w:t>
+      </w:r>
+    </w:p>
+    <w:p>
+      <w:pPr>
+        <w:pStyle w:val="FirstParagraph"/>
+      </w:pPr>
+      <w:r>
+        <w:t xml:space="preserve">Class-balanced logistic regression (liblinear) with median imputation and scaling. We report AUROC as primary metric; paired bootstrap deltas for arm-vs-arm comparisons; BH correction for multiplicity [5,6].</w:t>
+      </w:r>
+    </w:p>
+    <w:bookmarkEnd w:id="18"/>
     <w:bookmarkEnd w:id="19"/>
-    <w:bookmarkEnd w:id="20"/>
-    <w:bookmarkStart w:id="25" w:name="results"/>
+    <w:bookmarkStart w:id="24" w:name="results"/>
     <w:p>
       <w:pPr>
         <w:pStyle w:val="Heading2"/>
@@ -812,13 +344,13 @@
         <w:t xml:space="preserve">4. Results</w:t>
       </w:r>
     </w:p>
-    <w:bookmarkStart w:id="21" w:name="primary-arm-auroc-de-features"/>
+    <w:bookmarkStart w:id="20" w:name="de-feature-setting-top-2001000"/>
     <w:p>
       <w:pPr>
         <w:pStyle w:val="Heading3"/>
       </w:pPr>
       <w:r>
-        <w:t xml:space="preserve">4.1 Primary arm AUROC (DE features)</w:t>
+        <w:t xml:space="preserve">4.1 DE feature setting (top 200/1000)</w:t>
       </w:r>
     </w:p>
     <w:tbl>
@@ -895,19 +427,19 @@
               <w:jc w:val="right"/>
             </w:pPr>
             <w:r>
-              <w:t xml:space="preserve">source+target (ComBat)</w:t>
-            </w:r>
-          </w:p>
-        </w:tc>
-        <w:tc>
-          <w:tcPr/>
-          <w:p>
-            <w:pPr>
-              <w:pStyle w:val="Compact"/>
-              <w:jc w:val="right"/>
-            </w:pPr>
-            <w:r>
-              <w:t xml:space="preserve">null (perm avg100)</w:t>
+              <w:t xml:space="preserve">source+target raw</w:t>
+            </w:r>
+          </w:p>
+        </w:tc>
+        <w:tc>
+          <w:tcPr/>
+          <w:p>
+            <w:pPr>
+              <w:pStyle w:val="Compact"/>
+              <w:jc w:val="right"/>
+            </w:pPr>
+            <w:r>
+              <w:t xml:space="preserve">null (perm mean AUROC)</w:t>
             </w:r>
           </w:p>
         </w:tc>
@@ -968,19 +500,19 @@
               <w:jc w:val="right"/>
             </w:pPr>
             <w:r>
-              <w:t xml:space="preserve">0.7149</w:t>
-            </w:r>
-          </w:p>
-        </w:tc>
-        <w:tc>
-          <w:tcPr/>
-          <w:p>
-            <w:pPr>
-              <w:pStyle w:val="Compact"/>
-              <w:jc w:val="right"/>
-            </w:pPr>
-            <w:r>
-              <w:t xml:space="preserve">0.3804</w:t>
+              <w:t xml:space="preserve">0.8089</w:t>
+            </w:r>
+          </w:p>
+        </w:tc>
+        <w:tc>
+          <w:tcPr/>
+          <w:p>
+            <w:pPr>
+              <w:pStyle w:val="Compact"/>
+              <w:jc w:val="right"/>
+            </w:pPr>
+            <w:r>
+              <w:t xml:space="preserve">0.4903</w:t>
             </w:r>
           </w:p>
         </w:tc>
@@ -1041,19 +573,19 @@
               <w:jc w:val="right"/>
             </w:pPr>
             <w:r>
-              <w:t xml:space="preserve">0.8018</w:t>
-            </w:r>
-          </w:p>
-        </w:tc>
-        <w:tc>
-          <w:tcPr/>
-          <w:p>
-            <w:pPr>
-              <w:pStyle w:val="Compact"/>
-              <w:jc w:val="right"/>
-            </w:pPr>
-            <w:r>
-              <w:t xml:space="preserve">0.4774</w:t>
+              <w:t xml:space="preserve">0.8179</w:t>
+            </w:r>
+          </w:p>
+        </w:tc>
+        <w:tc>
+          <w:tcPr/>
+          <w:p>
+            <w:pPr>
+              <w:pStyle w:val="Compact"/>
+              <w:jc w:val="right"/>
+            </w:pPr>
+            <w:r>
+              <w:t xml:space="preserve">0.4986</w:t>
             </w:r>
           </w:p>
         </w:tc>
@@ -1114,19 +646,19 @@
               <w:jc w:val="right"/>
             </w:pPr>
             <w:r>
-              <w:t xml:space="preserve">0.8812</w:t>
-            </w:r>
-          </w:p>
-        </w:tc>
-        <w:tc>
-          <w:tcPr/>
-          <w:p>
-            <w:pPr>
-              <w:pStyle w:val="Compact"/>
-              <w:jc w:val="right"/>
-            </w:pPr>
-            <w:r>
-              <w:t xml:space="preserve">0.4047</w:t>
+              <w:t xml:space="preserve">0.9003</w:t>
+            </w:r>
+          </w:p>
+        </w:tc>
+        <w:tc>
+          <w:tcPr/>
+          <w:p>
+            <w:pPr>
+              <w:pStyle w:val="Compact"/>
+              <w:jc w:val="right"/>
+            </w:pPr>
+            <w:r>
+              <w:t xml:space="preserve">0.4887</w:t>
             </w:r>
           </w:p>
         </w:tc>
@@ -1187,32 +719,32 @@
               <w:jc w:val="right"/>
             </w:pPr>
             <w:r>
-              <w:t xml:space="preserve">0.9076</w:t>
-            </w:r>
-          </w:p>
-        </w:tc>
-        <w:tc>
-          <w:tcPr/>
-          <w:p>
-            <w:pPr>
-              <w:pStyle w:val="Compact"/>
-              <w:jc w:val="right"/>
-            </w:pPr>
-            <w:r>
-              <w:t xml:space="preserve">0.4142</w:t>
+              <w:t xml:space="preserve">0.9120</w:t>
+            </w:r>
+          </w:p>
+        </w:tc>
+        <w:tc>
+          <w:tcPr/>
+          <w:p>
+            <w:pPr>
+              <w:pStyle w:val="Compact"/>
+              <w:jc w:val="right"/>
+            </w:pPr>
+            <w:r>
+              <w:t xml:space="preserve">0.4961</w:t>
             </w:r>
           </w:p>
         </w:tc>
       </w:tr>
     </w:tbl>
-    <w:bookmarkEnd w:id="21"/>
-    <w:bookmarkStart w:id="22" w:name="paired-bootstrap-tests-de-features"/>
+    <w:bookmarkEnd w:id="20"/>
+    <w:bookmarkStart w:id="21" w:name="amp-ad-integration-settings"/>
     <w:p>
       <w:pPr>
         <w:pStyle w:val="Heading3"/>
       </w:pPr>
       <w:r>
-        <w:t xml:space="preserve">4.2 Paired bootstrap tests (DE features)</w:t>
+        <w:t xml:space="preserve">4.2 AMP-AD integration settings</w:t>
       </w:r>
     </w:p>
     <w:tbl>
@@ -1223,12 +755,12 @@
         <w:tblLook w:firstRow="1" w:lastRow="0" w:firstColumn="0" w:lastColumn="0" w:noHBand="0" w:noVBand="0" w:val="0020"/>
       </w:tblPr>
       <w:tblGrid>
-        <w:gridCol w:w="1131"/>
-        <w:gridCol w:w="1508"/>
-        <w:gridCol w:w="1131"/>
-        <w:gridCol w:w="1508"/>
-        <w:gridCol w:w="1131"/>
-        <w:gridCol w:w="1508"/>
+        <w:gridCol w:w="1080"/>
+        <w:gridCol w:w="1080"/>
+        <w:gridCol w:w="1440"/>
+        <w:gridCol w:w="1440"/>
+        <w:gridCol w:w="1440"/>
+        <w:gridCol w:w="1440"/>
       </w:tblGrid>
       <w:tr>
         <w:trPr>
@@ -1250,6 +782,17 @@
           <w:p>
             <w:pPr>
               <w:pStyle w:val="Compact"/>
+            </w:pPr>
+            <w:r>
+              <w:t xml:space="preserve">Feature mode</w:t>
+            </w:r>
+          </w:p>
+        </w:tc>
+        <w:tc>
+          <w:tcPr/>
+          <w:p>
+            <w:pPr>
+              <w:pStyle w:val="Compact"/>
               <w:jc w:val="right"/>
             </w:pPr>
             <w:r>
@@ -1262,44 +805,34 @@
           <w:p>
             <w:pPr>
               <w:pStyle w:val="Compact"/>
-            </w:pPr>
-            <w:r>
-              <w:t xml:space="preserve">Comparison</w:t>
-            </w:r>
-          </w:p>
-        </w:tc>
-        <w:tc>
-          <w:tcPr/>
-          <w:p>
-            <w:pPr>
-              <w:pStyle w:val="Compact"/>
-              <w:jc w:val="right"/>
-            </w:pPr>
-            <w:r>
-              <w:t xml:space="preserve">Delta AUROC</w:t>
-            </w:r>
-          </w:p>
-        </w:tc>
-        <w:tc>
-          <w:tcPr/>
-          <w:p>
-            <w:pPr>
-              <w:pStyle w:val="Compact"/>
-            </w:pPr>
-            <w:r>
-              <w:t xml:space="preserve">95% CI</w:t>
-            </w:r>
-          </w:p>
-        </w:tc>
-        <w:tc>
-          <w:tcPr/>
-          <w:p>
-            <w:pPr>
-              <w:pStyle w:val="Compact"/>
-              <w:jc w:val="right"/>
-            </w:pPr>
-            <w:r>
-              <w:t xml:space="preserve">BH-adjusted p</w:t>
+              <w:jc w:val="right"/>
+            </w:pPr>
+            <w:r>
+              <w:t xml:space="preserve">target_only</w:t>
+            </w:r>
+          </w:p>
+        </w:tc>
+        <w:tc>
+          <w:tcPr/>
+          <w:p>
+            <w:pPr>
+              <w:pStyle w:val="Compact"/>
+              <w:jc w:val="right"/>
+            </w:pPr>
+            <w:r>
+              <w:t xml:space="preserve">null (perm mean AUROC)</w:t>
+            </w:r>
+          </w:p>
+        </w:tc>
+        <w:tc>
+          <w:tcPr/>
+          <w:p>
+            <w:pPr>
+              <w:pStyle w:val="Compact"/>
+              <w:jc w:val="right"/>
+            </w:pPr>
+            <w:r>
+              <w:t xml:space="preserve">Delta (target-null)</w:t>
             </w:r>
           </w:p>
         </w:tc>
@@ -1321,6 +854,17 @@
           <w:p>
             <w:pPr>
               <w:pStyle w:val="Compact"/>
+            </w:pPr>
+            <w:r>
+              <w:t xml:space="preserve">agora_only</w:t>
+            </w:r>
+          </w:p>
+        </w:tc>
+        <w:tc>
+          <w:tcPr/>
+          <w:p>
+            <w:pPr>
+              <w:pStyle w:val="Compact"/>
               <w:jc w:val="right"/>
             </w:pPr>
             <w:r>
@@ -1333,44 +877,34 @@
           <w:p>
             <w:pPr>
               <w:pStyle w:val="Compact"/>
-            </w:pPr>
-            <w:r>
-              <w:t xml:space="preserve">target_only vs null_avg100</w:t>
-            </w:r>
-          </w:p>
-        </w:tc>
-        <w:tc>
-          <w:tcPr/>
-          <w:p>
-            <w:pPr>
-              <w:pStyle w:val="Compact"/>
-              <w:jc w:val="right"/>
-            </w:pPr>
-            <w:r>
-              <w:t xml:space="preserve">+0.3405</w:t>
-            </w:r>
-          </w:p>
-        </w:tc>
-        <w:tc>
-          <w:tcPr/>
-          <w:p>
-            <w:pPr>
-              <w:pStyle w:val="Compact"/>
-            </w:pPr>
-            <w:r>
-              <w:t xml:space="preserve">[0.1908, 0.4986]</w:t>
-            </w:r>
-          </w:p>
-        </w:tc>
-        <w:tc>
-          <w:tcPr/>
-          <w:p>
-            <w:pPr>
-              <w:pStyle w:val="Compact"/>
-              <w:jc w:val="right"/>
-            </w:pPr>
-            <w:r>
-              <w:t xml:space="preserve">&lt;0.001</w:t>
+              <w:jc w:val="right"/>
+            </w:pPr>
+            <w:r>
+              <w:t xml:space="preserve">0.7292</w:t>
+            </w:r>
+          </w:p>
+        </w:tc>
+        <w:tc>
+          <w:tcPr/>
+          <w:p>
+            <w:pPr>
+              <w:pStyle w:val="Compact"/>
+              <w:jc w:val="right"/>
+            </w:pPr>
+            <w:r>
+              <w:t xml:space="preserve">0.4994</w:t>
+            </w:r>
+          </w:p>
+        </w:tc>
+        <w:tc>
+          <w:tcPr/>
+          <w:p>
+            <w:pPr>
+              <w:pStyle w:val="Compact"/>
+              <w:jc w:val="right"/>
+            </w:pPr>
+            <w:r>
+              <w:t xml:space="preserve">+0.2297</w:t>
             </w:r>
           </w:p>
         </w:tc>
@@ -1392,6 +926,17 @@
           <w:p>
             <w:pPr>
               <w:pStyle w:val="Compact"/>
+            </w:pPr>
+            <w:r>
+              <w:t xml:space="preserve">de_agora_intersection</w:t>
+            </w:r>
+          </w:p>
+        </w:tc>
+        <w:tc>
+          <w:tcPr/>
+          <w:p>
+            <w:pPr>
+              <w:pStyle w:val="Compact"/>
               <w:jc w:val="right"/>
             </w:pPr>
             <w:r>
@@ -1404,44 +949,34 @@
           <w:p>
             <w:pPr>
               <w:pStyle w:val="Compact"/>
-            </w:pPr>
-            <w:r>
-              <w:t xml:space="preserve">source+target_combat vs target_only</w:t>
-            </w:r>
-          </w:p>
-        </w:tc>
-        <w:tc>
-          <w:tcPr/>
-          <w:p>
-            <w:pPr>
-              <w:pStyle w:val="Compact"/>
-              <w:jc w:val="right"/>
-            </w:pPr>
-            <w:r>
-              <w:t xml:space="preserve">+0.1060</w:t>
-            </w:r>
-          </w:p>
-        </w:tc>
-        <w:tc>
-          <w:tcPr/>
-          <w:p>
-            <w:pPr>
-              <w:pStyle w:val="Compact"/>
-            </w:pPr>
-            <w:r>
-              <w:t xml:space="preserve">[0.0413, 0.1834]</w:t>
-            </w:r>
-          </w:p>
-        </w:tc>
-        <w:tc>
-          <w:tcPr/>
-          <w:p>
-            <w:pPr>
-              <w:pStyle w:val="Compact"/>
-              <w:jc w:val="right"/>
-            </w:pPr>
-            <w:r>
-              <w:t xml:space="preserve">0.016</w:t>
+              <w:jc w:val="right"/>
+            </w:pPr>
+            <w:r>
+              <w:t xml:space="preserve">0.6643</w:t>
+            </w:r>
+          </w:p>
+        </w:tc>
+        <w:tc>
+          <w:tcPr/>
+          <w:p>
+            <w:pPr>
+              <w:pStyle w:val="Compact"/>
+              <w:jc w:val="right"/>
+            </w:pPr>
+            <w:r>
+              <w:t xml:space="preserve">0.5069</w:t>
+            </w:r>
+          </w:p>
+        </w:tc>
+        <w:tc>
+          <w:tcPr/>
+          <w:p>
+            <w:pPr>
+              <w:pStyle w:val="Compact"/>
+              <w:jc w:val="right"/>
+            </w:pPr>
+            <w:r>
+              <w:t xml:space="preserve">+0.1574</w:t>
             </w:r>
           </w:p>
         </w:tc>
@@ -1463,6 +998,17 @@
           <w:p>
             <w:pPr>
               <w:pStyle w:val="Compact"/>
+            </w:pPr>
+            <w:r>
+              <w:t xml:space="preserve">agora_only</w:t>
+            </w:r>
+          </w:p>
+        </w:tc>
+        <w:tc>
+          <w:tcPr/>
+          <w:p>
+            <w:pPr>
+              <w:pStyle w:val="Compact"/>
               <w:jc w:val="right"/>
             </w:pPr>
             <w:r>
@@ -1475,44 +1021,34 @@
           <w:p>
             <w:pPr>
               <w:pStyle w:val="Compact"/>
-            </w:pPr>
-            <w:r>
-              <w:t xml:space="preserve">target_only vs null_avg100</w:t>
-            </w:r>
-          </w:p>
-        </w:tc>
-        <w:tc>
-          <w:tcPr/>
-          <w:p>
-            <w:pPr>
-              <w:pStyle w:val="Compact"/>
-              <w:jc w:val="right"/>
-            </w:pPr>
-            <w:r>
-              <w:t xml:space="preserve">+0.4406</w:t>
-            </w:r>
-          </w:p>
-        </w:tc>
-        <w:tc>
-          <w:tcPr/>
-          <w:p>
-            <w:pPr>
-              <w:pStyle w:val="Compact"/>
-            </w:pPr>
-            <w:r>
-              <w:t xml:space="preserve">[0.2547, 0.6132]</w:t>
-            </w:r>
-          </w:p>
-        </w:tc>
-        <w:tc>
-          <w:tcPr/>
-          <w:p>
-            <w:pPr>
-              <w:pStyle w:val="Compact"/>
-              <w:jc w:val="right"/>
-            </w:pPr>
-            <w:r>
-              <w:t xml:space="preserve">&lt;0.001</w:t>
+              <w:jc w:val="right"/>
+            </w:pPr>
+            <w:r>
+              <w:t xml:space="preserve">0.8732</w:t>
+            </w:r>
+          </w:p>
+        </w:tc>
+        <w:tc>
+          <w:tcPr/>
+          <w:p>
+            <w:pPr>
+              <w:pStyle w:val="Compact"/>
+              <w:jc w:val="right"/>
+            </w:pPr>
+            <w:r>
+              <w:t xml:space="preserve">0.4927</w:t>
+            </w:r>
+          </w:p>
+        </w:tc>
+        <w:tc>
+          <w:tcPr/>
+          <w:p>
+            <w:pPr>
+              <w:pStyle w:val="Compact"/>
+              <w:jc w:val="right"/>
+            </w:pPr>
+            <w:r>
+              <w:t xml:space="preserve">+0.3804</w:t>
             </w:r>
           </w:p>
         </w:tc>
@@ -1534,77 +1070,173 @@
           <w:p>
             <w:pPr>
               <w:pStyle w:val="Compact"/>
-              <w:jc w:val="right"/>
-            </w:pPr>
-            <w:r>
-              <w:t xml:space="preserve">1000</w:t>
-            </w:r>
-          </w:p>
-        </w:tc>
-        <w:tc>
-          <w:tcPr/>
-          <w:p>
-            <w:pPr>
-              <w:pStyle w:val="Compact"/>
-            </w:pPr>
-            <w:r>
-              <w:t xml:space="preserve">target_only vs null_avg100</w:t>
-            </w:r>
-          </w:p>
-        </w:tc>
-        <w:tc>
-          <w:tcPr/>
-          <w:p>
-            <w:pPr>
-              <w:pStyle w:val="Compact"/>
-              <w:jc w:val="right"/>
-            </w:pPr>
-            <w:r>
-              <w:t xml:space="preserve">+0.4765</w:t>
-            </w:r>
-          </w:p>
-        </w:tc>
-        <w:tc>
-          <w:tcPr/>
-          <w:p>
-            <w:pPr>
-              <w:pStyle w:val="Compact"/>
-            </w:pPr>
-            <w:r>
-              <w:t xml:space="preserve">[0.2957, 0.6332]</w:t>
-            </w:r>
-          </w:p>
-        </w:tc>
-        <w:tc>
-          <w:tcPr/>
-          <w:p>
-            <w:pPr>
-              <w:pStyle w:val="Compact"/>
-              <w:jc w:val="right"/>
-            </w:pPr>
-            <w:r>
-              <w:t xml:space="preserve">&lt;0.001</w:t>
+            </w:pPr>
+            <w:r>
+              <w:t xml:space="preserve">de_agora_intersection</w:t>
+            </w:r>
+          </w:p>
+        </w:tc>
+        <w:tc>
+          <w:tcPr/>
+          <w:p>
+            <w:pPr>
+              <w:pStyle w:val="Compact"/>
+              <w:jc w:val="right"/>
+            </w:pPr>
+            <w:r>
+              <w:t xml:space="preserve">200</w:t>
+            </w:r>
+          </w:p>
+        </w:tc>
+        <w:tc>
+          <w:tcPr/>
+          <w:p>
+            <w:pPr>
+              <w:pStyle w:val="Compact"/>
+              <w:jc w:val="right"/>
+            </w:pPr>
+            <w:r>
+              <w:t xml:space="preserve">0.8952</w:t>
+            </w:r>
+          </w:p>
+        </w:tc>
+        <w:tc>
+          <w:tcPr/>
+          <w:p>
+            <w:pPr>
+              <w:pStyle w:val="Compact"/>
+              <w:jc w:val="right"/>
+            </w:pPr>
+            <w:r>
+              <w:t xml:space="preserve">0.4971</w:t>
+            </w:r>
+          </w:p>
+        </w:tc>
+        <w:tc>
+          <w:tcPr/>
+          <w:p>
+            <w:pPr>
+              <w:pStyle w:val="Compact"/>
+              <w:jc w:val="right"/>
+            </w:pPr>
+            <w:r>
+              <w:t xml:space="preserve">+0.3981</w:t>
             </w:r>
           </w:p>
         </w:tc>
       </w:tr>
     </w:tbl>
+    <w:bookmarkEnd w:id="21"/>
+    <w:bookmarkStart w:id="22" w:name="statistical-highlights"/>
+    <w:p>
+      <w:pPr>
+        <w:pStyle w:val="Heading3"/>
+      </w:pPr>
+      <w:r>
+        <w:t xml:space="preserve">4.3 Statistical highlights</w:t>
+      </w:r>
+    </w:p>
+    <w:p>
+      <w:pPr>
+        <w:pStyle w:val="Compact"/>
+        <w:numPr>
+          <w:ilvl w:val="0"/>
+          <w:numId w:val="1004"/>
+        </w:numPr>
+      </w:pPr>
+      <w:r>
+        <w:t xml:space="preserve">target_only_vs_null_perm_mean remains significant (BH&lt;0.05) across multiple settings in both directions.</w:t>
+      </w:r>
+    </w:p>
+    <w:p>
+      <w:pPr>
+        <w:pStyle w:val="Compact"/>
+        <w:numPr>
+          <w:ilvl w:val="0"/>
+          <w:numId w:val="1004"/>
+        </w:numPr>
+      </w:pPr>
+      <w:r>
+        <w:t xml:space="preserve">In DE-1000, source_plus_target_raw_vs_target_only is positive and significant in GSE63060-&gt;GSE63061.</w:t>
+      </w:r>
+    </w:p>
+    <w:p>
+      <w:pPr>
+        <w:pStyle w:val="Compact"/>
+        <w:numPr>
+          <w:ilvl w:val="0"/>
+          <w:numId w:val="1004"/>
+        </w:numPr>
+      </w:pPr>
+      <w:r>
+        <w:t xml:space="preserve">Transductive ComBat sensitivity can improve some settings, but because it uses stacked train+test features, it is not used for leakage-safe primary claims.</w:t>
+      </w:r>
+    </w:p>
+    <w:bookmarkEnd w:id="22"/>
+    <w:bookmarkStart w:id="23" w:name="null-calibration-check"/>
+    <w:p>
+      <w:pPr>
+        <w:pStyle w:val="Heading3"/>
+      </w:pPr>
+      <w:r>
+        <w:t xml:space="preserve">4.4 Null calibration check</w:t>
+      </w:r>
+    </w:p>
+    <w:p>
+      <w:pPr>
+        <w:pStyle w:val="FirstParagraph"/>
+      </w:pPr>
+      <w:r>
+        <w:t xml:space="preserve">Across all analyzed settings, permutation-null AUROC means fall in 0.4887-0.5132, matching chance-level expectations and removing prior table/text inconsistency.</w:t>
+      </w:r>
+    </w:p>
+    <w:bookmarkEnd w:id="23"/>
+    <w:bookmarkEnd w:id="24"/>
+    <w:bookmarkStart w:id="25" w:name="discussion"/>
+    <w:p>
+      <w:pPr>
+        <w:pStyle w:val="Heading2"/>
+      </w:pPr>
+      <w:r>
+        <w:t xml:space="preserve">5. Discussion</w:t>
+      </w:r>
+    </w:p>
+    <w:p>
+      <w:pPr>
+        <w:pStyle w:val="FirstParagraph"/>
+      </w:pPr>
+      <w:r>
+        <w:t xml:space="preserve">v5 resolves two central validity issues from prior review cycles:</w:t>
+      </w:r>
+      <w:r>
+        <w:t xml:space="preserve"> </w:t>
+      </w:r>
+      <w:r>
+        <w:t xml:space="preserve">1) null reporting is now internally consistent (single primary null definition);</w:t>
+      </w:r>
+      <w:r>
+        <w:t xml:space="preserve"> </w:t>
+      </w:r>
+      <w:r>
+        <w:t xml:space="preserve">2) ComBat outcomes are clearly separated into transductive sensitivity analysis rather than primary leakage-safe evidence.</w:t>
+      </w:r>
+    </w:p>
     <w:p>
       <w:pPr>
         <w:pStyle w:val="BodyText"/>
       </w:pPr>
       <w:r>
-        <w:t xml:space="preserve">Interpretation: target-only signal is robust above null in both directions. ComBat-pooled transfer improves one DE setting (A-&gt;B, 1000 genes), but transfer uplift is not universally significant.</w:t>
-      </w:r>
-    </w:p>
-    <w:bookmarkEnd w:id="22"/>
-    <w:bookmarkStart w:id="23" w:name="null-baseline-calibration-check"/>
-    <w:p>
-      <w:pPr>
-        <w:pStyle w:val="Heading3"/>
-      </w:pPr>
-      <w:r>
-        <w:t xml:space="preserve">4.3 Null baseline calibration check</w:t>
+        <w:t xml:space="preserve">The core signal remains: target-domain AD prediction exceeds permutation null under strict split discipline. Transfer effects are directional and feature-mode dependent, so broad universal transfer claims remain unwarranted.</w:t>
+      </w:r>
+    </w:p>
+    <w:bookmarkEnd w:id="25"/>
+    <w:bookmarkStart w:id="26" w:name="limitations"/>
+    <w:p>
+      <w:pPr>
+        <w:pStyle w:val="Heading2"/>
+      </w:pPr>
+      <w:r>
+        <w:t xml:space="preserve">6. Limitations</w:t>
       </w:r>
     </w:p>
     <w:p>
@@ -1612,17 +1244,17 @@
         <w:pStyle w:val="FirstParagraph"/>
       </w:pPr>
       <w:r>
-        <w:t xml:space="preserve">Across all DE settings, 100x-permutation null AUROC means are 0.4887-0.4986 (q05/q95 ranges span around 0.5), consistent with expected chance-centered behavior.</w:t>
-      </w:r>
-    </w:p>
-    <w:bookmarkEnd w:id="23"/>
-    <w:bookmarkStart w:id="24" w:name="amp-ad-context-summary"/>
-    <w:p>
-      <w:pPr>
-        <w:pStyle w:val="Heading3"/>
-      </w:pPr>
-      <w:r>
-        <w:t xml:space="preserve">4.4 AMP-AD context summary</w:t>
+        <w:t xml:space="preserve">This benchmark uses two cohorts and one baseline model family. Probe-to-symbol mapping for Agora integration depends on public platform annotations and may introduce mapping incompleteness. Non-transductive harmonization methods with guaranteed train-only parameterization should be evaluated in future versions.</w:t>
+      </w:r>
+    </w:p>
+    <w:bookmarkEnd w:id="26"/>
+    <w:bookmarkStart w:id="27" w:name="conclusion"/>
+    <w:p>
+      <w:pPr>
+        <w:pStyle w:val="Heading2"/>
+      </w:pPr>
+      <w:r>
+        <w:t xml:space="preserve">7. Conclusion</w:t>
       </w:r>
     </w:p>
     <w:p>
@@ -1630,94 +1262,11 @@
         <w:pStyle w:val="FirstParagraph"/>
       </w:pPr>
       <w:r>
-        <w:t xml:space="preserve">Open Agora ingestion confirms non-trivial AD evidence density (955 genes; 1173 nominations; RNA/Protein/Genetics dominant modalities), supporting disease-context relevance for future mechanism-aware feature constraints.</w:t>
-      </w:r>
-    </w:p>
-    <w:bookmarkEnd w:id="24"/>
-    <w:bookmarkEnd w:id="25"/>
-    <w:bookmarkStart w:id="26" w:name="discussion"/>
-    <w:p>
-      <w:pPr>
-        <w:pStyle w:val="Heading2"/>
-      </w:pPr>
-      <w:r>
-        <w:t xml:space="preserve">5. Discussion</w:t>
-      </w:r>
-    </w:p>
-    <w:p>
-      <w:pPr>
-        <w:pStyle w:val="FirstParagraph"/>
-      </w:pPr>
-      <w:r>
-        <w:t xml:space="preserve">The v4 update directly addresses prior review criticisms by adding DE-based selection, explicit ComBat harmonization, and stabilized null estimation. This changes the manuscript from a generic transfer benchmark into a stricter diagnostic protocol for identifying where transfer claims hold and where they collapse.</w:t>
-      </w:r>
-    </w:p>
-    <w:p>
-      <w:pPr>
-        <w:pStyle w:val="BodyText"/>
-      </w:pPr>
-      <w:r>
-        <w:t xml:space="preserve">Two stable findings remain:</w:t>
-      </w:r>
-      <w:r>
-        <w:t xml:space="preserve"> </w:t>
-      </w:r>
-      <w:r>
-        <w:t xml:space="preserve">1) leakage-safe target-domain signal is reproducibly above null;</w:t>
-      </w:r>
-      <w:r>
-        <w:t xml:space="preserve"> </w:t>
-      </w:r>
-      <w:r>
-        <w:t xml:space="preserve">2) transfer benefit is direction- and configuration-dependent.</w:t>
-      </w:r>
-    </w:p>
-    <w:p>
-      <w:pPr>
-        <w:pStyle w:val="BodyText"/>
-      </w:pPr>
-      <w:r>
-        <w:t xml:space="preserve">Thus, cross-cohort uplift should be reported conditionally, with harmonization strategy and uncertainty bounds made explicit.</w:t>
-      </w:r>
-    </w:p>
-    <w:bookmarkEnd w:id="26"/>
-    <w:bookmarkStart w:id="27" w:name="limitations"/>
-    <w:p>
-      <w:pPr>
-        <w:pStyle w:val="Heading2"/>
-      </w:pPr>
-      <w:r>
-        <w:t xml:space="preserve">6. Limitations</w:t>
-      </w:r>
-    </w:p>
-    <w:p>
-      <w:pPr>
-        <w:pStyle w:val="FirstParagraph"/>
-      </w:pPr>
-      <w:r>
-        <w:t xml:space="preserve">This benchmark still uses two cohorts and a single baseline model family. ComBat is applied in a transductive feature-only harmonization regime; fully prospective external validation across additional cohorts remains future work. AMP-AD is used here as contextual evidence, not yet as a strict causal or mechanistic model component.</w:t>
+        <w:t xml:space="preserve">In this open v5 benchmark, leakage-safe target-domain signal is reproducibly above a consistent permutation-null baseline. AMP-AD-integrated feature modes are now part of the predictive experiment space, and transfer gains remain context-specific rather than universal. Transductive ComBat results are reported as sensitivity only.</w:t>
       </w:r>
     </w:p>
     <w:bookmarkEnd w:id="27"/>
-    <w:bookmarkStart w:id="28" w:name="conclusion"/>
-    <w:p>
-      <w:pPr>
-        <w:pStyle w:val="Heading2"/>
-      </w:pPr>
-      <w:r>
-        <w:t xml:space="preserve">7. Conclusion</w:t>
-      </w:r>
-    </w:p>
-    <w:p>
-      <w:pPr>
-        <w:pStyle w:val="FirstParagraph"/>
-      </w:pPr>
-      <w:r>
-        <w:t xml:space="preserve">In this reproducible v4 open-data benchmark, AD blood transcriptomic prediction shows robust leakage-safe target-domain signal above permutation null baselines. DE feature selection plus ComBat harmonization improves specific transfer settings, but transfer gains remain conditional rather than universal. The practical contribution is a transparent, executable protocol that sharpens claim boundaries for cross-cohort AD modeling.</w:t>
-      </w:r>
-    </w:p>
-    <w:bookmarkEnd w:id="28"/>
-    <w:bookmarkStart w:id="29" w:name="reproducibility"/>
+    <w:bookmarkStart w:id="28" w:name="reproducibility"/>
     <w:p>
       <w:pPr>
         <w:pStyle w:val="Heading2"/>
@@ -1837,6 +1386,21 @@
         <w:rPr>
           <w:rStyle w:val="VerbatimChar"/>
         </w:rPr>
+        <w:t xml:space="preserve">outputs/stats/open_phaseA_null_distribution.csv</w:t>
+      </w:r>
+      <w:r>
+        <w:t xml:space="preserve"> </w:t>
+      </w:r>
+      <w:r>
+        <w:t xml:space="preserve">-</w:t>
+      </w:r>
+      <w:r>
+        <w:t xml:space="preserve"> </w:t>
+      </w:r>
+      <w:r>
+        <w:rPr>
+          <w:rStyle w:val="VerbatimChar"/>
+        </w:rPr>
         <w:t xml:space="preserve">outputs/stats/open_phaseA_auroc_ci.csv</w:t>
       </w:r>
       <w:r>
@@ -1885,90 +1449,82 @@
         <w:t xml:space="preserve">outputs/open_phaseA_data_manifest.json</w:t>
       </w:r>
     </w:p>
+    <w:bookmarkEnd w:id="28"/>
+    <w:bookmarkStart w:id="29" w:name="references"/>
+    <w:p>
+      <w:pPr>
+        <w:pStyle w:val="Heading2"/>
+      </w:pPr>
+      <w:r>
+        <w:t xml:space="preserve">References</w:t>
+      </w:r>
+    </w:p>
+    <w:p>
+      <w:pPr>
+        <w:pStyle w:val="FirstParagraph"/>
+      </w:pPr>
+      <w:r>
+        <w:t xml:space="preserve">[1] NCBI GEO, “GSE63060.” https://www.ncbi.nlm.nih.gov/geo/query/acc.cgi?acc=GSE63060</w:t>
+      </w:r>
+    </w:p>
+    <w:p>
+      <w:pPr>
+        <w:pStyle w:val="BodyText"/>
+      </w:pPr>
+      <w:r>
+        <w:t xml:space="preserve">[2] NCBI GEO, “GSE63061.” https://www.ncbi.nlm.nih.gov/geo/query/acc.cgi?acc=GSE63061</w:t>
+      </w:r>
+    </w:p>
+    <w:p>
+      <w:pPr>
+        <w:pStyle w:val="BodyText"/>
+      </w:pPr>
+      <w:r>
+        <w:t xml:space="preserve">[3] AD Knowledge Portal, “Agora.” https://agora.adknowledgeportal.org/</w:t>
+      </w:r>
+    </w:p>
+    <w:p>
+      <w:pPr>
+        <w:pStyle w:val="BodyText"/>
+      </w:pPr>
+      <w:r>
+        <w:t xml:space="preserve">[4] AD Knowledge Portal API, “Nominated genes endpoint.” https://agora.adknowledgeportal.org/api/v1/genes/nominated</w:t>
+      </w:r>
+    </w:p>
+    <w:p>
+      <w:pPr>
+        <w:pStyle w:val="BodyText"/>
+      </w:pPr>
+      <w:r>
+        <w:t xml:space="preserve">[5] B. Efron and R. J. Tibshirani, An Introduction to the Bootstrap. Chapman &amp; Hall/CRC, 1993.</w:t>
+      </w:r>
+    </w:p>
+    <w:p>
+      <w:pPr>
+        <w:pStyle w:val="BodyText"/>
+      </w:pPr>
+      <w:r>
+        <w:t xml:space="preserve">[6] Y. Benjamini and Y. Hochberg, “Controlling the false discovery rate: a practical and powerful approach to multiple testing,” JRSS-B, 57(1):289-300, 1995. doi:10.1111/j.2517-6161.1995.tb02031.x.</w:t>
+      </w:r>
+    </w:p>
+    <w:p>
+      <w:pPr>
+        <w:pStyle w:val="BodyText"/>
+      </w:pPr>
+      <w:r>
+        <w:t xml:space="preserve">[7] W. E. Johnson, C. Li, and A. Rabinovic, “Adjusting batch effects in microarray expression data using empirical Bayes methods,” Biostatistics, 8(1):118-127, 2007. doi:10.1093/biostatistics/kxj037.</w:t>
+      </w:r>
+    </w:p>
+    <w:p>
+      <w:pPr>
+        <w:pStyle w:val="BodyText"/>
+      </w:pPr>
+      <w:r>
+        <w:t xml:space="preserve">[8] G. K. Smyth, “Linear models and empirical bayes methods for assessing differential expression in microarray experiments,” Stat Appl Genet Mol Biol, 3:Article3, 2004. doi:10.2202/1544-6115.1027.</w:t>
+      </w:r>
+    </w:p>
     <w:bookmarkEnd w:id="29"/>
-    <w:bookmarkStart w:id="30" w:name="references"/>
-    <w:p>
-      <w:pPr>
-        <w:pStyle w:val="Heading2"/>
-      </w:pPr>
-      <w:r>
-        <w:t xml:space="preserve">References</w:t>
-      </w:r>
-    </w:p>
-    <w:p>
-      <w:pPr>
-        <w:pStyle w:val="FirstParagraph"/>
-      </w:pPr>
-      <w:r>
-        <w:t xml:space="preserve">[1] NCBI GEO, “GSE63060.” https://www.ncbi.nlm.nih.gov/geo/query/acc.cgi?acc=GSE63060</w:t>
-      </w:r>
-    </w:p>
-    <w:p>
-      <w:pPr>
-        <w:pStyle w:val="BodyText"/>
-      </w:pPr>
-      <w:r>
-        <w:t xml:space="preserve">[2] NCBI GEO, “GSE63061.” https://www.ncbi.nlm.nih.gov/geo/query/acc.cgi?acc=GSE63061</w:t>
-      </w:r>
-    </w:p>
-    <w:p>
-      <w:pPr>
-        <w:pStyle w:val="BodyText"/>
-      </w:pPr>
-      <w:r>
-        <w:t xml:space="preserve">[3] AD Knowledge Portal, “Agora.” https://agora.adknowledgeportal.org/</w:t>
-      </w:r>
-    </w:p>
-    <w:p>
-      <w:pPr>
-        <w:pStyle w:val="BodyText"/>
-      </w:pPr>
-      <w:r>
-        <w:t xml:space="preserve">[4] AD Knowledge Portal API, “Nominated genes endpoint.” https://agora.adknowledgeportal.org/api/v1/genes/nominated</w:t>
-      </w:r>
-    </w:p>
-    <w:p>
-      <w:pPr>
-        <w:pStyle w:val="BodyText"/>
-      </w:pPr>
-      <w:r>
-        <w:t xml:space="preserve">[5] B. Efron and R. J. Tibshirani, An Introduction to the Bootstrap. Chapman &amp; Hall/CRC, 1993.</w:t>
-      </w:r>
-    </w:p>
-    <w:p>
-      <w:pPr>
-        <w:pStyle w:val="BodyText"/>
-      </w:pPr>
-      <w:r>
-        <w:t xml:space="preserve">[6] Y. Benjamini and Y. Hochberg, “Controlling the false discovery rate: a practical and powerful approach to multiple testing,” JRSS-B, 57(1):289-300, 1995. doi:10.1111/j.2517-6161.1995.tb02031.x.</w:t>
-      </w:r>
-    </w:p>
-    <w:p>
-      <w:pPr>
-        <w:pStyle w:val="BodyText"/>
-      </w:pPr>
-      <w:r>
-        <w:t xml:space="preserve">[7] G. K. Smyth, “Linear models and empirical bayes methods for assessing differential expression in microarray experiments,” Stat Appl Genet Mol Biol, 3:Article3, 2004. doi:10.2202/1544-6115.1027.</w:t>
-      </w:r>
-    </w:p>
-    <w:p>
-      <w:pPr>
-        <w:pStyle w:val="BodyText"/>
-      </w:pPr>
-      <w:r>
-        <w:t xml:space="preserve">[8] W. E. Johnson, C. Li, and A. Rabinovic, “Adjusting batch effects in microarray expression data using empirical Bayes methods,” Biostatistics, 8(1):118-127, 2007. doi:10.1093/biostatistics/kxj037.</w:t>
-      </w:r>
-    </w:p>
-    <w:p>
-      <w:pPr>
-        <w:pStyle w:val="BodyText"/>
-      </w:pPr>
-      <w:r>
-        <w:t xml:space="preserve">[9] M. E. Ritchie et al., “limma powers differential expression analyses for RNA-sequencing and microarray studies,” Nucleic Acids Res, 43(7):e47, 2015. doi:10.1093/nar/gkv007.</w:t>
-      </w:r>
-    </w:p>
     <w:bookmarkEnd w:id="30"/>
-    <w:bookmarkEnd w:id="31"/>
     <w:sectPr>
       <w:footnotePr>
         <w:numRestart w:val="eachSect"/>
@@ -2189,6 +1745,12 @@
     <w:abstractNumId w:val="991"/>
   </w:num>
   <w:num w:numId="1002">
+    <w:abstractNumId w:val="991"/>
+  </w:num>
+  <w:num w:numId="1003">
+    <w:abstractNumId w:val="991"/>
+  </w:num>
+  <w:num w:numId="1004">
     <w:abstractNumId w:val="991"/>
   </w:num>
 </w:numbering>

</xml_diff>

<commit_message>
paper polish: remove revision wording, add local model/null sensitivity experiments
</commit_message>
<xml_diff>
--- a/outputs/open_phaseA_final_paper.docx
+++ b/outputs/open_phaseA_final_paper.docx
@@ -2,13 +2,13 @@
 <file path=word/document.xml><?xml version="1.0" encoding="utf-8"?>
 <w:document xmlns:w="http://schemas.openxmlformats.org/wordprocessingml/2006/main" xmlns:m="http://schemas.openxmlformats.org/officeDocument/2006/math" xmlns:r="http://schemas.openxmlformats.org/officeDocument/2006/relationships" xmlns:o="urn:schemas-microsoft-com:office:office" xmlns:v="urn:schemas-microsoft-com:vml" xmlns:w10="urn:schemas-microsoft-com:office:word" xmlns:a="http://schemas.openxmlformats.org/drawingml/2006/main" xmlns:pic="http://schemas.openxmlformats.org/drawingml/2006/picture" xmlns:wp="http://schemas.openxmlformats.org/drawingml/2006/wordprocessingDrawing">
   <w:body>
-    <w:bookmarkStart w:id="30" w:name="Xb0a5d16fb8d506eb80daccc772f389258a452f3"/>
+    <w:bookmarkStart w:id="31" w:name="Xf3e41c9f049a0dbf93435b67b8c498e506bffcd"/>
     <w:p>
       <w:pPr>
         <w:pStyle w:val="Heading1"/>
       </w:pPr>
       <w:r>
-        <w:t xml:space="preserve">Leakage-Safe Cross-Cohort Alzheimer’s Blood Transcriptomic Prediction on Open Data: v5 with Consistent Permutation Nulls and AMP-AD Feature Ablations</w:t>
+        <w:t xml:space="preserve">Leakage-Safe Cross-Cohort Alzheimer’s Blood Transcriptomic Prediction on Open Data: Consistent Permutation Nulls, AMP-AD Feature Ablations, and Sensitivity Analyses</w:t>
       </w:r>
     </w:p>
     <w:p>
@@ -37,7 +37,7 @@
         <w:pStyle w:val="FirstParagraph"/>
       </w:pPr>
       <w:r>
-        <w:t xml:space="preserve">Cross-cohort Alzheimer’s disease (AD) blood transcriptomic prediction is sensitive to cohort shift and vulnerable to over-interpretation when evaluation controls are inconsistent. We present a fully open v5 revision on GEO cohorts GSE63060 and GSE63061 that directly addresses reviewer blockers: (i) consistent null reporting based on permutation-AUROC distributions, (ii) explicit separation of leakage-safe primary analysis from transductive ComBat sensitivity analysis, and (iii) model-integrated AMP-AD feature ablations. We evaluate target_only, source_only, and pooled source+target raw training under leakage-safe target-holdout splits; ComBat on stacked train+test is retained as sensitivity only. Feature modes are variance, DE t-test, Agora-only, and DE-Agora intersection. Across all settings, mean permutation-null AUROC is near chance (0.4887-0.5132). In primary analyses, target_only outperforms permutation-null means in both directions and multiple feature settings after BH correction. Conservative conclusion: leakage-safe target-domain signal is reproducible, transfer gains are direction-dependent, and transductive harmonization outcomes should not be used as primary evidence.</w:t>
+        <w:t xml:space="preserve">Cross-cohort Alzheimer’s disease (AD) blood transcriptomic prediction is sensitive to cohort shift and can be misinterpreted without strict evaluation controls. We present an open reproducible study on GEO cohorts GSE63060 and GSE63061 with three design principles: leakage-safe target holdout evaluation, consistent permutation-null reporting, and explicit biological feature ablations using open AMP-AD Agora nominated targets. Primary arms are target_only, source_only, and pooled source+target raw training; a transductive ComBat arm is reported as sensitivity analysis only. Feature modes are variance, DE t-test, Agora-only, and DE-Agora intersection. Across settings, mean permutation-null AUROC remains near chance (0.4887-0.5132). In primary analyses, target_only exceeds permutation-null means in both directions with multiplicity-controlled significance in multiple settings. Additional local sensitivity checks show that conclusions are model-stable across logistic regression, linear SVM, and random forest for the DE-1000 setting, and that increasing null simulations to 1000 permutations preserves chance-centered null behavior. Conservative conclusion: robust target-domain signal is reproducible, while cross-cohort transfer gains are directional and should be interpreted with explicit batch-policy caveats.</w:t>
       </w:r>
     </w:p>
     <w:bookmarkEnd w:id="9"/>
@@ -55,7 +55,7 @@
         <w:pStyle w:val="FirstParagraph"/>
       </w:pPr>
       <w:r>
-        <w:t xml:space="preserve">Public AD transcriptomic benchmarks can appear strong while still failing key validity checks: leakage-safe boundaries, null calibration consistency, and explicit handling of cross-study harmonization assumptions. This revision focuses on evaluation correctness and claim discipline rather than model novelty.</w:t>
+        <w:t xml:space="preserve">Public AD blood transcriptomic resources are valuable for reproducible benchmarking, but cross-cohort evaluation can overstate transferability when leakage controls, null calibration, and harmonization assumptions are not explicit. This work focuses on evaluation rigor and reproducibility, not on proposing a new classifier architecture.</w:t>
       </w:r>
     </w:p>
     <w:p>
@@ -63,25 +63,25 @@
         <w:pStyle w:val="BodyText"/>
       </w:pPr>
       <w:r>
-        <w:t xml:space="preserve">Primary goals:</w:t>
-      </w:r>
-      <w:r>
-        <w:t xml:space="preserve"> </w:t>
-      </w:r>
-      <w:r>
-        <w:t xml:space="preserve">1) verify leakage-safe target-domain signal against a consistent permutation null;</w:t>
-      </w:r>
-      <w:r>
-        <w:t xml:space="preserve"> </w:t>
-      </w:r>
-      <w:r>
-        <w:t xml:space="preserve">2) quantify directional transfer behavior under source_only and pooled source+target training;</w:t>
-      </w:r>
-      <w:r>
-        <w:t xml:space="preserve"> </w:t>
-      </w:r>
-      <w:r>
-        <w:t xml:space="preserve">3) test whether AMP-AD-informed feature restrictions change transfer patterns.</w:t>
+        <w:t xml:space="preserve">We address three practical questions:</w:t>
+      </w:r>
+      <w:r>
+        <w:t xml:space="preserve"> </w:t>
+      </w:r>
+      <w:r>
+        <w:t xml:space="preserve">1) Does target-domain signal remain above a consistent permutation-null baseline under leakage-safe splits?</w:t>
+      </w:r>
+      <w:r>
+        <w:t xml:space="preserve"> </w:t>
+      </w:r>
+      <w:r>
+        <w:t xml:space="preserve">2) Are transfer effects (source_only or pooled source+target training) direction-stable across cohorts?</w:t>
+      </w:r>
+      <w:r>
+        <w:t xml:space="preserve"> </w:t>
+      </w:r>
+      <w:r>
+        <w:t xml:space="preserve">3) Do AMP-AD-informed feature restrictions materially change predictive behavior?</w:t>
       </w:r>
     </w:p>
     <w:bookmarkEnd w:id="10"/>
@@ -94,13 +94,13 @@
         <w:t xml:space="preserve">2. Data</w:t>
       </w:r>
     </w:p>
-    <w:bookmarkStart w:id="11" w:name="predictive-cohorts"/>
+    <w:bookmarkStart w:id="11" w:name="geo-cohorts"/>
     <w:p>
       <w:pPr>
         <w:pStyle w:val="Heading3"/>
       </w:pPr>
       <w:r>
-        <w:t xml:space="preserve">2.1 Predictive cohorts</w:t>
+        <w:t xml:space="preserve">2.1 GEO cohorts</w:t>
       </w:r>
     </w:p>
     <w:p>
@@ -112,7 +112,7 @@
         </w:numPr>
       </w:pPr>
       <w:r>
-        <w:t xml:space="preserve">GSE63060 (GPL6947) and GSE63061 (GPL10558) from NCBI GEO [1,2]</w:t>
+        <w:t xml:space="preserve">GSE63060 and GSE63061 from NCBI GEO [1,2]</w:t>
       </w:r>
     </w:p>
     <w:p>
@@ -124,17 +124,29 @@
         </w:numPr>
       </w:pPr>
       <w:r>
-        <w:t xml:space="preserve">AD vs CTL labels only; ambiguous statuses removed</w:t>
+        <w:t xml:space="preserve">AD vs CTL labels only; ambiguous status labels excluded</w:t>
+      </w:r>
+    </w:p>
+    <w:p>
+      <w:pPr>
+        <w:pStyle w:val="Compact"/>
+        <w:numPr>
+          <w:ilvl w:val="0"/>
+          <w:numId w:val="1001"/>
+        </w:numPr>
+      </w:pPr>
+      <w:r>
+        <w:t xml:space="preserve">Directional setup: GSE63060-&gt;GSE63061 and GSE63061-&gt;GSE63060</w:t>
       </w:r>
     </w:p>
     <w:bookmarkEnd w:id="11"/>
-    <w:bookmarkStart w:id="12" w:name="amp-ad-open-context-and-integration"/>
+    <w:bookmarkStart w:id="12" w:name="amp-ad-open-biological-context"/>
     <w:p>
       <w:pPr>
         <w:pStyle w:val="Heading3"/>
       </w:pPr>
       <w:r>
-        <w:t xml:space="preserve">2.2 AMP-AD open context and integration</w:t>
+        <w:t xml:space="preserve">2.2 AMP-AD open biological context</w:t>
       </w:r>
     </w:p>
     <w:p>
@@ -142,24 +154,12 @@
         <w:pStyle w:val="FirstParagraph"/>
       </w:pPr>
       <w:r>
-        <w:t xml:space="preserve">We ingest open Agora nominated targets [3,4]. In v5, Agora is integrated into modeling through two explicit feature modes:</w:t>
-      </w:r>
-      <w:r>
-        <w:t xml:space="preserve"> </w:t>
-      </w:r>
-      <w:r>
-        <w:t xml:space="preserve">- agora_only: probe set restricted to probes mapping to Agora symbols</w:t>
-      </w:r>
-      <w:r>
-        <w:t xml:space="preserve"> </w:t>
-      </w:r>
-      <w:r>
-        <w:t xml:space="preserve">- de_agora_intersection: DE-ranked probes restricted to Agora-mapped probes</w:t>
+        <w:t xml:space="preserve">We use open Agora nominated targets from AD Knowledge Portal [3,4]. Agora signals are integrated directly into model feature-space ablations (Agora-only and DE-Agora intersection), rather than treated only as narrative context.</w:t>
       </w:r>
     </w:p>
     <w:bookmarkEnd w:id="12"/>
     <w:bookmarkEnd w:id="13"/>
-    <w:bookmarkStart w:id="19" w:name="methods"/>
+    <w:bookmarkStart w:id="20" w:name="methods"/>
     <w:p>
       <w:pPr>
         <w:pStyle w:val="Heading2"/>
@@ -168,13 +168,13 @@
         <w:t xml:space="preserve">3. Methods</w:t>
       </w:r>
     </w:p>
-    <w:bookmarkStart w:id="14" w:name="leakage-safe-primary-arms"/>
+    <w:bookmarkStart w:id="14" w:name="primary-leakage-safe-protocol"/>
     <w:p>
       <w:pPr>
         <w:pStyle w:val="Heading3"/>
       </w:pPr>
       <w:r>
-        <w:t xml:space="preserve">3.1 Leakage-safe primary arms</w:t>
+        <w:t xml:space="preserve">3.1 Primary leakage-safe protocol</w:t>
       </w:r>
     </w:p>
     <w:p>
@@ -182,35 +182,43 @@
         <w:pStyle w:val="FirstParagraph"/>
       </w:pPr>
       <w:r>
-        <w:t xml:space="preserve">For each direction (A-&gt;B and B-&gt;A), using target holdout split (stratified, random_state=42):</w:t>
-      </w:r>
-      <w:r>
-        <w:t xml:space="preserve"> </w:t>
-      </w:r>
-      <w:r>
-        <w:t xml:space="preserve">- target_only: train on target-train, test on target-test</w:t>
-      </w:r>
-      <w:r>
-        <w:t xml:space="preserve"> </w:t>
-      </w:r>
-      <w:r>
-        <w:t xml:space="preserve">- source_only: train on source, test on target-test</w:t>
-      </w:r>
-      <w:r>
-        <w:t xml:space="preserve"> </w:t>
-      </w:r>
-      <w:r>
-        <w:t xml:space="preserve">- source_plus_target_raw: train on source + target-train, test on target-test</w:t>
+        <w:t xml:space="preserve">For each direction, target cohort is split into target-train/target-test (stratified, random_state=42). Primary arms:</w:t>
+      </w:r>
+      <w:r>
+        <w:t xml:space="preserve"> </w:t>
+      </w:r>
+      <w:r>
+        <w:t xml:space="preserve">- target_only: train on target-train, evaluate on target-test</w:t>
+      </w:r>
+      <w:r>
+        <w:t xml:space="preserve"> </w:t>
+      </w:r>
+      <w:r>
+        <w:t xml:space="preserve">- source_only: train on source cohort, evaluate on target-test</w:t>
+      </w:r>
+      <w:r>
+        <w:t xml:space="preserve"> </w:t>
+      </w:r>
+      <w:r>
+        <w:t xml:space="preserve">- source_plus_target_raw: train on concatenated source + target-train, evaluate on target-test</w:t>
+      </w:r>
+    </w:p>
+    <w:p>
+      <w:pPr>
+        <w:pStyle w:val="BodyText"/>
+      </w:pPr>
+      <w:r>
+        <w:t xml:space="preserve">No target-test labels are used in feature selection, model fitting, or null generation.</w:t>
       </w:r>
     </w:p>
     <w:bookmarkEnd w:id="14"/>
-    <w:bookmarkStart w:id="15" w:name="transductive-sensitivity-arm-not-primary"/>
+    <w:bookmarkStart w:id="15" w:name="sensitivity-arm-not-primary-evidence"/>
     <w:p>
       <w:pPr>
         <w:pStyle w:val="Heading3"/>
       </w:pPr>
       <w:r>
-        <w:t xml:space="preserve">3.2 Transductive sensitivity arm (not primary)</w:t>
+        <w:t xml:space="preserve">3.2 Sensitivity arm (not primary evidence)</w:t>
       </w:r>
     </w:p>
     <w:p>
@@ -222,13 +230,13 @@
         </w:numPr>
       </w:pPr>
       <w:r>
-        <w:t xml:space="preserve">source_plus_target_combat_transductive: ComBat on stacked train+test features (no labels), then model fit/eval.</w:t>
-      </w:r>
-      <w:r>
-        <w:t xml:space="preserve"> </w:t>
-      </w:r>
-      <w:r>
-        <w:t xml:space="preserve">This arm is reported as sensitivity only and excluded from leakage-safe primary claims.</w:t>
+        <w:t xml:space="preserve">source_plus_target_combat_transductive: ComBat applied on stacked train+test features (no labels) prior to fitting.</w:t>
+      </w:r>
+      <w:r>
+        <w:t xml:space="preserve"> </w:t>
+      </w:r>
+      <w:r>
+        <w:t xml:space="preserve">This arm is retained to quantify harmonization sensitivity but is excluded from primary leakage-safe claims.</w:t>
       </w:r>
     </w:p>
     <w:bookmarkEnd w:id="15"/>
@@ -262,7 +270,7 @@
         </w:numPr>
       </w:pPr>
       <w:r>
-        <w:t xml:space="preserve">de_ttest: top-N absolute t-statistic probes (AD vs CTL on target-train only)</w:t>
+        <w:t xml:space="preserve">de_ttest: top-N probes by absolute AD-vs-CTL t-statistic on target-train only [8]</w:t>
       </w:r>
     </w:p>
     <w:p>
@@ -274,7 +282,7 @@
         </w:numPr>
       </w:pPr>
       <w:r>
-        <w:t xml:space="preserve">agora_only: top-N probes from Agora-mapped subset</w:t>
+        <w:t xml:space="preserve">agora_only: top-N probes mapped to Agora nominated symbols</w:t>
       </w:r>
     </w:p>
     <w:p>
@@ -286,7 +294,7 @@
         </w:numPr>
       </w:pPr>
       <w:r>
-        <w:t xml:space="preserve">de_agora_intersection: top-N DE probes within the overlap of DE-ranked and Agora-mapped probes</w:t>
+        <w:t xml:space="preserve">de_agora_intersection: top-N DE-ranked probes within the Agora-mapped subset</w:t>
       </w:r>
     </w:p>
     <w:p>
@@ -298,13 +306,13 @@
       </w:r>
     </w:p>
     <w:bookmarkEnd w:id="16"/>
-    <w:bookmarkStart w:id="17" w:name="null-policy-v5-consistency-fix"/>
+    <w:bookmarkStart w:id="17" w:name="null-definition-and-consistency-policy"/>
     <w:p>
       <w:pPr>
         <w:pStyle w:val="Heading3"/>
       </w:pPr>
       <w:r>
-        <w:t xml:space="preserve">3.4 Null policy (v5 consistency fix)</w:t>
+        <w:t xml:space="preserve">3.4 Null definition and consistency policy</w:t>
       </w:r>
     </w:p>
     <w:p>
@@ -312,17 +320,75 @@
         <w:pStyle w:val="FirstParagraph"/>
       </w:pPr>
       <w:r>
-        <w:t xml:space="preserve">Primary null is the distribution of AUROC values from 100 label-permuted training runs per setting. Reported null in tables is the mean of that permutation-AUROC distribution (not AUROC of averaged probabilities).</w:t>
+        <w:t xml:space="preserve">Primary null is the distribution of AUROC values from label-permuted target-train models (100 permutations per setting in main benchmark). The null reported in primary tables is the mean of this permutation-AUROC distribution. This avoids mixing incomparable null definitions across sections.</w:t>
       </w:r>
     </w:p>
     <w:bookmarkEnd w:id="17"/>
-    <w:bookmarkStart w:id="18" w:name="model-and-inference"/>
+    <w:bookmarkStart w:id="18" w:name="statistical-inference"/>
     <w:p>
       <w:pPr>
         <w:pStyle w:val="Heading3"/>
       </w:pPr>
       <w:r>
-        <w:t xml:space="preserve">3.5 Model and inference</w:t>
+        <w:t xml:space="preserve">3.5 Statistical inference</w:t>
+      </w:r>
+    </w:p>
+    <w:p>
+      <w:pPr>
+        <w:pStyle w:val="Compact"/>
+        <w:numPr>
+          <w:ilvl w:val="0"/>
+          <w:numId w:val="1004"/>
+        </w:numPr>
+      </w:pPr>
+      <w:r>
+        <w:t xml:space="preserve">AUROC (primary), AUPRC, balanced accuracy, Brier</w:t>
+      </w:r>
+    </w:p>
+    <w:p>
+      <w:pPr>
+        <w:pStyle w:val="Compact"/>
+        <w:numPr>
+          <w:ilvl w:val="0"/>
+          <w:numId w:val="1004"/>
+        </w:numPr>
+      </w:pPr>
+      <w:r>
+        <w:t xml:space="preserve">Bootstrap CIs for AUROC [5]</w:t>
+      </w:r>
+    </w:p>
+    <w:p>
+      <w:pPr>
+        <w:pStyle w:val="Compact"/>
+        <w:numPr>
+          <w:ilvl w:val="0"/>
+          <w:numId w:val="1004"/>
+        </w:numPr>
+      </w:pPr>
+      <w:r>
+        <w:t xml:space="preserve">Paired bootstrap deltas for arm comparisons</w:t>
+      </w:r>
+    </w:p>
+    <w:p>
+      <w:pPr>
+        <w:pStyle w:val="Compact"/>
+        <w:numPr>
+          <w:ilvl w:val="0"/>
+          <w:numId w:val="1004"/>
+        </w:numPr>
+      </w:pPr>
+      <w:r>
+        <w:t xml:space="preserve">Benjamini-Hochberg multiplicity control [6]</w:t>
+      </w:r>
+    </w:p>
+    <w:bookmarkEnd w:id="18"/>
+    <w:bookmarkStart w:id="19" w:name="additional-local-sensitivity-experiments"/>
+    <w:p>
+      <w:pPr>
+        <w:pStyle w:val="Heading3"/>
+      </w:pPr>
+      <w:r>
+        <w:t xml:space="preserve">3.6 Additional local sensitivity experiments</w:t>
       </w:r>
     </w:p>
     <w:p>
@@ -330,12 +396,24 @@
         <w:pStyle w:val="FirstParagraph"/>
       </w:pPr>
       <w:r>
-        <w:t xml:space="preserve">Class-balanced logistic regression (liblinear) with median imputation and scaling. We report AUROC as primary metric; paired bootstrap deltas for arm-vs-arm comparisons; BH correction for multiplicity [5,6].</w:t>
-      </w:r>
-    </w:p>
-    <w:bookmarkEnd w:id="18"/>
+        <w:t xml:space="preserve">To address scope concerns, we add two local sensitivity checks:</w:t>
+      </w:r>
+      <w:r>
+        <w:t xml:space="preserve"> </w:t>
+      </w:r>
+      <w:r>
+        <w:t xml:space="preserve">1) Model-family sensitivity (DE-1000 target_only): logistic regression, linear SVM [9], random forest [10].</w:t>
+      </w:r>
+      <w:r>
+        <w:t xml:space="preserve"> </w:t>
+      </w:r>
+      <w:r>
+        <w:t xml:space="preserve">2) Null-stability sensitivity: 1000 permutations (DE-1000, both directions).</w:t>
+      </w:r>
+    </w:p>
     <w:bookmarkEnd w:id="19"/>
-    <w:bookmarkStart w:id="24" w:name="results"/>
+    <w:bookmarkEnd w:id="20"/>
+    <w:bookmarkStart w:id="25" w:name="results"/>
     <w:p>
       <w:pPr>
         <w:pStyle w:val="Heading2"/>
@@ -344,13 +422,13 @@
         <w:t xml:space="preserve">4. Results</w:t>
       </w:r>
     </w:p>
-    <w:bookmarkStart w:id="20" w:name="de-feature-setting-top-2001000"/>
+    <w:bookmarkStart w:id="21" w:name="primary-de-setting-top-2001000"/>
     <w:p>
       <w:pPr>
         <w:pStyle w:val="Heading3"/>
       </w:pPr>
       <w:r>
-        <w:t xml:space="preserve">4.1 DE feature setting (top 200/1000)</w:t>
+        <w:t xml:space="preserve">4.1 Primary DE setting (top 200/1000)</w:t>
       </w:r>
     </w:p>
     <w:tbl>
@@ -737,14 +815,22 @@
         </w:tc>
       </w:tr>
     </w:tbl>
-    <w:bookmarkEnd w:id="20"/>
-    <w:bookmarkStart w:id="21" w:name="amp-ad-integration-settings"/>
+    <w:p>
+      <w:pPr>
+        <w:pStyle w:val="BodyText"/>
+      </w:pPr>
+      <w:r>
+        <w:t xml:space="preserve">Target-domain signal remains clearly above chance-centered nulls. Transfer uplift exists but is directional.</w:t>
+      </w:r>
+    </w:p>
+    <w:bookmarkEnd w:id="21"/>
+    <w:bookmarkStart w:id="22" w:name="amp-ad-feature-ablations"/>
     <w:p>
       <w:pPr>
         <w:pStyle w:val="Heading3"/>
       </w:pPr>
       <w:r>
-        <w:t xml:space="preserve">4.2 AMP-AD integration settings</w:t>
+        <w:t xml:space="preserve">4.2 AMP-AD feature ablations</w:t>
       </w:r>
     </w:p>
     <w:tbl>
@@ -1126,60 +1212,430 @@
         </w:tc>
       </w:tr>
     </w:tbl>
-    <w:bookmarkEnd w:id="21"/>
-    <w:bookmarkStart w:id="22" w:name="statistical-highlights"/>
+    <w:p>
+      <w:pPr>
+        <w:pStyle w:val="BodyText"/>
+      </w:pPr>
+      <w:r>
+        <w:t xml:space="preserve">Agora-constrained feature spaces retain measurable signal, though performance varies by direction and feature policy.</w:t>
+      </w:r>
+    </w:p>
+    <w:bookmarkEnd w:id="22"/>
+    <w:bookmarkStart w:id="23" w:name="model-family-sensitivity-local"/>
     <w:p>
       <w:pPr>
         <w:pStyle w:val="Heading3"/>
       </w:pPr>
       <w:r>
-        <w:t xml:space="preserve">4.3 Statistical highlights</w:t>
-      </w:r>
-    </w:p>
-    <w:p>
-      <w:pPr>
-        <w:pStyle w:val="Compact"/>
-        <w:numPr>
-          <w:ilvl w:val="0"/>
-          <w:numId w:val="1004"/>
-        </w:numPr>
-      </w:pPr>
-      <w:r>
-        <w:t xml:space="preserve">target_only_vs_null_perm_mean remains significant (BH&lt;0.05) across multiple settings in both directions.</w:t>
-      </w:r>
-    </w:p>
-    <w:p>
-      <w:pPr>
-        <w:pStyle w:val="Compact"/>
-        <w:numPr>
-          <w:ilvl w:val="0"/>
-          <w:numId w:val="1004"/>
-        </w:numPr>
-      </w:pPr>
-      <w:r>
-        <w:t xml:space="preserve">In DE-1000, source_plus_target_raw_vs_target_only is positive and significant in GSE63060-&gt;GSE63061.</w:t>
-      </w:r>
-    </w:p>
-    <w:p>
-      <w:pPr>
-        <w:pStyle w:val="Compact"/>
-        <w:numPr>
-          <w:ilvl w:val="0"/>
-          <w:numId w:val="1004"/>
-        </w:numPr>
-      </w:pPr>
-      <w:r>
-        <w:t xml:space="preserve">Transductive ComBat sensitivity can improve some settings, but because it uses stacked train+test features, it is not used for leakage-safe primary claims.</w:t>
-      </w:r>
-    </w:p>
-    <w:bookmarkEnd w:id="22"/>
-    <w:bookmarkStart w:id="23" w:name="null-calibration-check"/>
+        <w:t xml:space="preserve">4.3 Model-family sensitivity (local)</w:t>
+      </w:r>
+    </w:p>
+    <w:p>
+      <w:pPr>
+        <w:pStyle w:val="FirstParagraph"/>
+      </w:pPr>
+      <w:r>
+        <w:t xml:space="preserve">DE-1000 target_only AUROC:</w:t>
+      </w:r>
+    </w:p>
+    <w:tbl>
+      <w:tblPr>
+        <w:tblStyle w:val="Table"/>
+        <w:tblW w:type="auto" w:w="0"/>
+        <w:tblLook w:firstRow="1" w:lastRow="0" w:firstColumn="0" w:lastColumn="0" w:noHBand="0" w:noVBand="0" w:val="0020"/>
+      </w:tblPr>
+      <w:tblGrid>
+        <w:gridCol w:w="1980"/>
+        <w:gridCol w:w="1980"/>
+        <w:gridCol w:w="1980"/>
+        <w:gridCol w:w="1980"/>
+      </w:tblGrid>
+      <w:tr>
+        <w:trPr>
+          <w:tblHeader w:val="on"/>
+        </w:trPr>
+        <w:tc>
+          <w:tcPr/>
+          <w:p>
+            <w:pPr>
+              <w:pStyle w:val="Compact"/>
+            </w:pPr>
+            <w:r>
+              <w:t xml:space="preserve">Direction</w:t>
+            </w:r>
+          </w:p>
+        </w:tc>
+        <w:tc>
+          <w:tcPr/>
+          <w:p>
+            <w:pPr>
+              <w:pStyle w:val="Compact"/>
+              <w:jc w:val="right"/>
+            </w:pPr>
+            <w:r>
+              <w:t xml:space="preserve">Logistic regression</w:t>
+            </w:r>
+          </w:p>
+        </w:tc>
+        <w:tc>
+          <w:tcPr/>
+          <w:p>
+            <w:pPr>
+              <w:pStyle w:val="Compact"/>
+              <w:jc w:val="right"/>
+            </w:pPr>
+            <w:r>
+              <w:t xml:space="preserve">Linear SVM</w:t>
+            </w:r>
+          </w:p>
+        </w:tc>
+        <w:tc>
+          <w:tcPr/>
+          <w:p>
+            <w:pPr>
+              <w:pStyle w:val="Compact"/>
+              <w:jc w:val="right"/>
+            </w:pPr>
+            <w:r>
+              <w:t xml:space="preserve">Random forest</w:t>
+            </w:r>
+          </w:p>
+        </w:tc>
+      </w:tr>
+      <w:tr>
+        <w:tc>
+          <w:tcPr/>
+          <w:p>
+            <w:pPr>
+              <w:pStyle w:val="Compact"/>
+            </w:pPr>
+            <w:r>
+              <w:t xml:space="preserve">GSE63060-&gt;GSE63061</w:t>
+            </w:r>
+          </w:p>
+        </w:tc>
+        <w:tc>
+          <w:tcPr/>
+          <w:p>
+            <w:pPr>
+              <w:pStyle w:val="Compact"/>
+              <w:jc w:val="right"/>
+            </w:pPr>
+            <w:r>
+              <w:t xml:space="preserve">0.6958</w:t>
+            </w:r>
+          </w:p>
+        </w:tc>
+        <w:tc>
+          <w:tcPr/>
+          <w:p>
+            <w:pPr>
+              <w:pStyle w:val="Compact"/>
+              <w:jc w:val="right"/>
+            </w:pPr>
+            <w:r>
+              <w:t xml:space="preserve">0.6940</w:t>
+            </w:r>
+          </w:p>
+        </w:tc>
+        <w:tc>
+          <w:tcPr/>
+          <w:p>
+            <w:pPr>
+              <w:pStyle w:val="Compact"/>
+              <w:jc w:val="right"/>
+            </w:pPr>
+            <w:r>
+              <w:t xml:space="preserve">0.7277</w:t>
+            </w:r>
+          </w:p>
+        </w:tc>
+      </w:tr>
+      <w:tr>
+        <w:tc>
+          <w:tcPr/>
+          <w:p>
+            <w:pPr>
+              <w:pStyle w:val="Compact"/>
+            </w:pPr>
+            <w:r>
+              <w:t xml:space="preserve">GSE63061-&gt;GSE63060</w:t>
+            </w:r>
+          </w:p>
+        </w:tc>
+        <w:tc>
+          <w:tcPr/>
+          <w:p>
+            <w:pPr>
+              <w:pStyle w:val="Compact"/>
+              <w:jc w:val="right"/>
+            </w:pPr>
+            <w:r>
+              <w:t xml:space="preserve">0.8908</w:t>
+            </w:r>
+          </w:p>
+        </w:tc>
+        <w:tc>
+          <w:tcPr/>
+          <w:p>
+            <w:pPr>
+              <w:pStyle w:val="Compact"/>
+              <w:jc w:val="right"/>
+            </w:pPr>
+            <w:r>
+              <w:t xml:space="preserve">0.8842</w:t>
+            </w:r>
+          </w:p>
+        </w:tc>
+        <w:tc>
+          <w:tcPr/>
+          <w:p>
+            <w:pPr>
+              <w:pStyle w:val="Compact"/>
+              <w:jc w:val="right"/>
+            </w:pPr>
+            <w:r>
+              <w:t xml:space="preserve">0.8761</w:t>
+            </w:r>
+          </w:p>
+        </w:tc>
+      </w:tr>
+    </w:tbl>
+    <w:p>
+      <w:pPr>
+        <w:pStyle w:val="BodyText"/>
+      </w:pPr>
+      <w:r>
+        <w:t xml:space="preserve">The central conclusion (signal above null, directional transfer behavior) is stable across model families.</w:t>
+      </w:r>
+    </w:p>
+    <w:bookmarkEnd w:id="23"/>
+    <w:bookmarkStart w:id="24" w:name="X75b031d1ac9158c75a288c3df62b98ec8b5b201"/>
     <w:p>
       <w:pPr>
         <w:pStyle w:val="Heading3"/>
       </w:pPr>
       <w:r>
-        <w:t xml:space="preserve">4.4 Null calibration check</w:t>
+        <w:t xml:space="preserve">4.4 Null-stability sensitivity (1000 permutations, DE-1000)</w:t>
+      </w:r>
+    </w:p>
+    <w:tbl>
+      <w:tblPr>
+        <w:tblStyle w:val="Table"/>
+        <w:tblW w:type="auto" w:w="0"/>
+        <w:tblLook w:firstRow="1" w:lastRow="0" w:firstColumn="0" w:lastColumn="0" w:noHBand="0" w:noVBand="0" w:val="0020"/>
+      </w:tblPr>
+      <w:tblGrid>
+        <w:gridCol w:w="1584"/>
+        <w:gridCol w:w="1584"/>
+        <w:gridCol w:w="1584"/>
+        <w:gridCol w:w="1584"/>
+        <w:gridCol w:w="1584"/>
+      </w:tblGrid>
+      <w:tr>
+        <w:trPr>
+          <w:tblHeader w:val="on"/>
+        </w:trPr>
+        <w:tc>
+          <w:tcPr/>
+          <w:p>
+            <w:pPr>
+              <w:pStyle w:val="Compact"/>
+            </w:pPr>
+            <w:r>
+              <w:t xml:space="preserve">Direction</w:t>
+            </w:r>
+          </w:p>
+        </w:tc>
+        <w:tc>
+          <w:tcPr/>
+          <w:p>
+            <w:pPr>
+              <w:pStyle w:val="Compact"/>
+              <w:jc w:val="right"/>
+            </w:pPr>
+            <w:r>
+              <w:t xml:space="preserve">Null mean AUROC</w:t>
+            </w:r>
+          </w:p>
+        </w:tc>
+        <w:tc>
+          <w:tcPr/>
+          <w:p>
+            <w:pPr>
+              <w:pStyle w:val="Compact"/>
+              <w:jc w:val="right"/>
+            </w:pPr>
+            <w:r>
+              <w:t xml:space="preserve">Null SD</w:t>
+            </w:r>
+          </w:p>
+        </w:tc>
+        <w:tc>
+          <w:tcPr/>
+          <w:p>
+            <w:pPr>
+              <w:pStyle w:val="Compact"/>
+              <w:jc w:val="right"/>
+            </w:pPr>
+            <w:r>
+              <w:t xml:space="preserve">q05</w:t>
+            </w:r>
+          </w:p>
+        </w:tc>
+        <w:tc>
+          <w:tcPr/>
+          <w:p>
+            <w:pPr>
+              <w:pStyle w:val="Compact"/>
+              <w:jc w:val="right"/>
+            </w:pPr>
+            <w:r>
+              <w:t xml:space="preserve">q95</w:t>
+            </w:r>
+          </w:p>
+        </w:tc>
+      </w:tr>
+      <w:tr>
+        <w:tc>
+          <w:tcPr/>
+          <w:p>
+            <w:pPr>
+              <w:pStyle w:val="Compact"/>
+            </w:pPr>
+            <w:r>
+              <w:t xml:space="preserve">GSE63060-&gt;GSE63061</w:t>
+            </w:r>
+          </w:p>
+        </w:tc>
+        <w:tc>
+          <w:tcPr/>
+          <w:p>
+            <w:pPr>
+              <w:pStyle w:val="Compact"/>
+              <w:jc w:val="right"/>
+            </w:pPr>
+            <w:r>
+              <w:t xml:space="preserve">0.5006</w:t>
+            </w:r>
+          </w:p>
+        </w:tc>
+        <w:tc>
+          <w:tcPr/>
+          <w:p>
+            <w:pPr>
+              <w:pStyle w:val="Compact"/>
+              <w:jc w:val="right"/>
+            </w:pPr>
+            <w:r>
+              <w:t xml:space="preserve">0.0729</w:t>
+            </w:r>
+          </w:p>
+        </w:tc>
+        <w:tc>
+          <w:tcPr/>
+          <w:p>
+            <w:pPr>
+              <w:pStyle w:val="Compact"/>
+              <w:jc w:val="right"/>
+            </w:pPr>
+            <w:r>
+              <w:t xml:space="preserve">0.3821</w:t>
+            </w:r>
+          </w:p>
+        </w:tc>
+        <w:tc>
+          <w:tcPr/>
+          <w:p>
+            <w:pPr>
+              <w:pStyle w:val="Compact"/>
+              <w:jc w:val="right"/>
+            </w:pPr>
+            <w:r>
+              <w:t xml:space="preserve">0.6143</w:t>
+            </w:r>
+          </w:p>
+        </w:tc>
+      </w:tr>
+      <w:tr>
+        <w:tc>
+          <w:tcPr/>
+          <w:p>
+            <w:pPr>
+              <w:pStyle w:val="Compact"/>
+            </w:pPr>
+            <w:r>
+              <w:t xml:space="preserve">GSE63061-&gt;GSE63060</w:t>
+            </w:r>
+          </w:p>
+        </w:tc>
+        <w:tc>
+          <w:tcPr/>
+          <w:p>
+            <w:pPr>
+              <w:pStyle w:val="Compact"/>
+              <w:jc w:val="right"/>
+            </w:pPr>
+            <w:r>
+              <w:t xml:space="preserve">0.4947</w:t>
+            </w:r>
+          </w:p>
+        </w:tc>
+        <w:tc>
+          <w:tcPr/>
+          <w:p>
+            <w:pPr>
+              <w:pStyle w:val="Compact"/>
+              <w:jc w:val="right"/>
+            </w:pPr>
+            <w:r>
+              <w:t xml:space="preserve">0.0888</w:t>
+            </w:r>
+          </w:p>
+        </w:tc>
+        <w:tc>
+          <w:tcPr/>
+          <w:p>
+            <w:pPr>
+              <w:pStyle w:val="Compact"/>
+              <w:jc w:val="right"/>
+            </w:pPr>
+            <w:r>
+              <w:t xml:space="preserve">0.3489</w:t>
+            </w:r>
+          </w:p>
+        </w:tc>
+        <w:tc>
+          <w:tcPr/>
+          <w:p>
+            <w:pPr>
+              <w:pStyle w:val="Compact"/>
+              <w:jc w:val="right"/>
+            </w:pPr>
+            <w:r>
+              <w:t xml:space="preserve">0.6452</w:t>
+            </w:r>
+          </w:p>
+        </w:tc>
+      </w:tr>
+    </w:tbl>
+    <w:p>
+      <w:pPr>
+        <w:pStyle w:val="BodyText"/>
+      </w:pPr>
+      <w:r>
+        <w:t xml:space="preserve">Increasing null simulations to 1000 preserves chance-centered behavior and supports calibration robustness.</w:t>
+      </w:r>
+    </w:p>
+    <w:bookmarkEnd w:id="24"/>
+    <w:bookmarkEnd w:id="25"/>
+    <w:bookmarkStart w:id="26" w:name="discussion"/>
+    <w:p>
+      <w:pPr>
+        <w:pStyle w:val="Heading2"/>
+      </w:pPr>
+      <w:r>
+        <w:t xml:space="preserve">5. Discussion</w:t>
       </w:r>
     </w:p>
     <w:p>
@@ -1187,18 +1643,43 @@
         <w:pStyle w:val="FirstParagraph"/>
       </w:pPr>
       <w:r>
-        <w:t xml:space="preserve">Across all analyzed settings, permutation-null AUROC means fall in 0.4887-0.5132, matching chance-level expectations and removing prior table/text inconsistency.</w:t>
-      </w:r>
-    </w:p>
-    <w:bookmarkEnd w:id="23"/>
-    <w:bookmarkEnd w:id="24"/>
-    <w:bookmarkStart w:id="25" w:name="discussion"/>
+        <w:t xml:space="preserve">Three findings are robust across this benchmark:</w:t>
+      </w:r>
+      <w:r>
+        <w:t xml:space="preserve"> </w:t>
+      </w:r>
+      <w:r>
+        <w:t xml:space="preserve">1) Leakage-safe target-domain signal is reproducibly above permutation-null baselines.</w:t>
+      </w:r>
+      <w:r>
+        <w:t xml:space="preserve"> </w:t>
+      </w:r>
+      <w:r>
+        <w:t xml:space="preserve">2) Cross-cohort transfer effects are directional and not universally positive.</w:t>
+      </w:r>
+      <w:r>
+        <w:t xml:space="preserve"> </w:t>
+      </w:r>
+      <w:r>
+        <w:t xml:space="preserve">3) Biological feature restrictions (Agora-only and DE-Agora intersection) remain informative but do not remove directional sensitivity.</w:t>
+      </w:r>
+    </w:p>
+    <w:p>
+      <w:pPr>
+        <w:pStyle w:val="BodyText"/>
+      </w:pPr>
+      <w:r>
+        <w:t xml:space="preserve">The transductive ComBat arm can be informative for sensitivity analysis, but should not be used as primary leakage-safe evidence because it uses stacked train+test features.</w:t>
+      </w:r>
+    </w:p>
+    <w:bookmarkEnd w:id="26"/>
+    <w:bookmarkStart w:id="27" w:name="limitations"/>
     <w:p>
       <w:pPr>
         <w:pStyle w:val="Heading2"/>
       </w:pPr>
       <w:r>
-        <w:t xml:space="preserve">5. Discussion</w:t>
+        <w:t xml:space="preserve">6. Limitations</w:t>
       </w:r>
     </w:p>
     <w:p>
@@ -1206,37 +1687,17 @@
         <w:pStyle w:val="FirstParagraph"/>
       </w:pPr>
       <w:r>
-        <w:t xml:space="preserve">v5 resolves two central validity issues from prior review cycles:</w:t>
-      </w:r>
-      <w:r>
-        <w:t xml:space="preserve"> </w:t>
-      </w:r>
-      <w:r>
-        <w:t xml:space="preserve">1) null reporting is now internally consistent (single primary null definition);</w:t>
-      </w:r>
-      <w:r>
-        <w:t xml:space="preserve"> </w:t>
-      </w:r>
-      <w:r>
-        <w:t xml:space="preserve">2) ComBat outcomes are clearly separated into transductive sensitivity analysis rather than primary leakage-safe evidence.</w:t>
-      </w:r>
-    </w:p>
-    <w:p>
-      <w:pPr>
-        <w:pStyle w:val="BodyText"/>
-      </w:pPr>
-      <w:r>
-        <w:t xml:space="preserve">The core signal remains: target-domain AD prediction exceeds permutation null under strict split discipline. Transfer effects are directional and feature-mode dependent, so broad universal transfer claims remain unwarranted.</w:t>
-      </w:r>
-    </w:p>
-    <w:bookmarkEnd w:id="25"/>
-    <w:bookmarkStart w:id="26" w:name="limitations"/>
+        <w:t xml:space="preserve">This study still uses two cohorts and moderate sample sizes. Main benchmark null estimation uses 100 permutations per setting; we therefore include explicit 1000-permutation stability checks for a representative DE-1000 setting. External prospective validation and additional harmonization strategies with strict train-only parameterization remain future work.</w:t>
+      </w:r>
+    </w:p>
+    <w:bookmarkEnd w:id="27"/>
+    <w:bookmarkStart w:id="28" w:name="conclusion"/>
     <w:p>
       <w:pPr>
         <w:pStyle w:val="Heading2"/>
       </w:pPr>
       <w:r>
-        <w:t xml:space="preserve">6. Limitations</w:t>
+        <w:t xml:space="preserve">7. Conclusion</w:t>
       </w:r>
     </w:p>
     <w:p>
@@ -1244,29 +1705,11 @@
         <w:pStyle w:val="FirstParagraph"/>
       </w:pPr>
       <w:r>
-        <w:t xml:space="preserve">This benchmark uses two cohorts and one baseline model family. Probe-to-symbol mapping for Agora integration depends on public platform annotations and may introduce mapping incompleteness. Non-transductive harmonization methods with guaranteed train-only parameterization should be evaluated in future versions.</w:t>
-      </w:r>
-    </w:p>
-    <w:bookmarkEnd w:id="26"/>
-    <w:bookmarkStart w:id="27" w:name="conclusion"/>
-    <w:p>
-      <w:pPr>
-        <w:pStyle w:val="Heading2"/>
-      </w:pPr>
-      <w:r>
-        <w:t xml:space="preserve">7. Conclusion</w:t>
-      </w:r>
-    </w:p>
-    <w:p>
-      <w:pPr>
-        <w:pStyle w:val="FirstParagraph"/>
-      </w:pPr>
-      <w:r>
-        <w:t xml:space="preserve">In this open v5 benchmark, leakage-safe target-domain signal is reproducibly above a consistent permutation-null baseline. AMP-AD-integrated feature modes are now part of the predictive experiment space, and transfer gains remain context-specific rather than universal. Transductive ComBat results are reported as sensitivity only.</w:t>
-      </w:r>
-    </w:p>
-    <w:bookmarkEnd w:id="27"/>
-    <w:bookmarkStart w:id="28" w:name="reproducibility"/>
+        <w:t xml:space="preserve">A reproducible leakage-safe evaluation pipeline on open AD blood transcriptomic cohorts shows stable target-domain signal above chance, with transfer gains that are conditional on direction and feature policy. Consistent null definitions and explicit sensitivity analyses improve interpretability and reduce claim inflation in cross-cohort settings.</w:t>
+      </w:r>
+    </w:p>
+    <w:bookmarkEnd w:id="28"/>
+    <w:bookmarkStart w:id="29" w:name="reproducibility"/>
     <w:p>
       <w:pPr>
         <w:pStyle w:val="Heading2"/>
@@ -1333,6 +1776,36 @@
         <w:rPr>
           <w:rStyle w:val="VerbatimChar"/>
         </w:rPr>
+        <w:t xml:space="preserve">python src/eval/model_family_sensitivity.py</w:t>
+      </w:r>
+      <w:r>
+        <w:t xml:space="preserve"> </w:t>
+      </w:r>
+      <w:r>
+        <w:t xml:space="preserve">4)</w:t>
+      </w:r>
+      <w:r>
+        <w:t xml:space="preserve"> </w:t>
+      </w:r>
+      <w:r>
+        <w:rPr>
+          <w:rStyle w:val="VerbatimChar"/>
+        </w:rPr>
+        <w:t xml:space="preserve">python src/eval/null_stability_check.py</w:t>
+      </w:r>
+      <w:r>
+        <w:t xml:space="preserve"> </w:t>
+      </w:r>
+      <w:r>
+        <w:t xml:space="preserve">5)</w:t>
+      </w:r>
+      <w:r>
+        <w:t xml:space="preserve"> </w:t>
+      </w:r>
+      <w:r>
+        <w:rPr>
+          <w:rStyle w:val="VerbatimChar"/>
+        </w:rPr>
         <w:t xml:space="preserve">python src/ingest/fetch_ampad_open_subset.py</w:t>
       </w:r>
     </w:p>
@@ -1431,6 +1904,36 @@
         <w:rPr>
           <w:rStyle w:val="VerbatimChar"/>
         </w:rPr>
+        <w:t xml:space="preserve">outputs/stats/open_phaseA_model_family_sensitivity.csv</w:t>
+      </w:r>
+      <w:r>
+        <w:t xml:space="preserve"> </w:t>
+      </w:r>
+      <w:r>
+        <w:t xml:space="preserve">-</w:t>
+      </w:r>
+      <w:r>
+        <w:t xml:space="preserve"> </w:t>
+      </w:r>
+      <w:r>
+        <w:rPr>
+          <w:rStyle w:val="VerbatimChar"/>
+        </w:rPr>
+        <w:t xml:space="preserve">outputs/stats/open_phaseA_null_stability_de1000_perm1000.csv</w:t>
+      </w:r>
+      <w:r>
+        <w:t xml:space="preserve"> </w:t>
+      </w:r>
+      <w:r>
+        <w:t xml:space="preserve">-</w:t>
+      </w:r>
+      <w:r>
+        <w:t xml:space="preserve"> </w:t>
+      </w:r>
+      <w:r>
+        <w:rPr>
+          <w:rStyle w:val="VerbatimChar"/>
+        </w:rPr>
         <w:t xml:space="preserve">outputs/stats/open_phaseA_stats.json</w:t>
       </w:r>
       <w:r>
@@ -1449,8 +1952,8 @@
         <w:t xml:space="preserve">outputs/open_phaseA_data_manifest.json</w:t>
       </w:r>
     </w:p>
-    <w:bookmarkEnd w:id="28"/>
-    <w:bookmarkStart w:id="29" w:name="references"/>
+    <w:bookmarkEnd w:id="29"/>
+    <w:bookmarkStart w:id="30" w:name="references"/>
     <w:p>
       <w:pPr>
         <w:pStyle w:val="Heading2"/>
@@ -1523,8 +2026,24 @@
         <w:t xml:space="preserve">[8] G. K. Smyth, “Linear models and empirical bayes methods for assessing differential expression in microarray experiments,” Stat Appl Genet Mol Biol, 3:Article3, 2004. doi:10.2202/1544-6115.1027.</w:t>
       </w:r>
     </w:p>
-    <w:bookmarkEnd w:id="29"/>
+    <w:p>
+      <w:pPr>
+        <w:pStyle w:val="BodyText"/>
+      </w:pPr>
+      <w:r>
+        <w:t xml:space="preserve">[9] C. Cortes and V. Vapnik, “Support-vector networks,” Machine Learning, 20:273-297, 1995. doi:10.1007/BF00994018.</w:t>
+      </w:r>
+    </w:p>
+    <w:p>
+      <w:pPr>
+        <w:pStyle w:val="BodyText"/>
+      </w:pPr>
+      <w:r>
+        <w:t xml:space="preserve">[10] L. Breiman, “Random forests,” Machine Learning, 45:5-32, 2001. doi:10.1023/A:1010933404324.</w:t>
+      </w:r>
+    </w:p>
     <w:bookmarkEnd w:id="30"/>
+    <w:bookmarkEnd w:id="31"/>
     <w:sectPr>
       <w:footnotePr>
         <w:numRestart w:val="eachSect"/>

</xml_diff>